<commit_message>
añadi el seguiminto del sprint 2
</commit_message>
<xml_diff>
--- a/docs/General/Proyecto Final Daniel.O y Arnau.S.docx
+++ b/docs/General/Proyecto Final Daniel.O y Arnau.S.docx
@@ -1,6 +1,6 @@
 
 <file path=word/document.xml><?xml version="1.0" encoding="utf-8"?>
-<w:document xmlns:wpc="http://schemas.microsoft.com/office/word/2010/wordprocessingCanvas" xmlns:cx="http://schemas.microsoft.com/office/drawing/2014/chartex" xmlns:cx1="http://schemas.microsoft.com/office/drawing/2015/9/8/chartex" xmlns:cx2="http://schemas.microsoft.com/office/drawing/2015/10/21/chartex" xmlns:cx3="http://schemas.microsoft.com/office/drawing/2016/5/9/chartex" xmlns:cx4="http://schemas.microsoft.com/office/drawing/2016/5/10/chartex" xmlns:cx5="http://schemas.microsoft.com/office/drawing/2016/5/11/chartex" xmlns:cx6="http://schemas.microsoft.com/office/drawing/2016/5/12/chartex" xmlns:cx7="http://schemas.microsoft.com/office/drawing/2016/5/13/chartex" xmlns:cx8="http://schemas.microsoft.com/office/drawing/2016/5/14/chartex" xmlns:mc="http://schemas.openxmlformats.org/markup-compatibility/2006" xmlns:aink="http://schemas.microsoft.com/office/drawing/2016/ink" xmlns:am3d="http://schemas.microsoft.com/office/drawing/2017/model3d" xmlns:o="urn:schemas-microsoft-com:office:office" xmlns:oel="http://schemas.microsoft.com/office/2019/extlst" xmlns:r="http://schemas.openxmlformats.org/officeDocument/2006/relationships" xmlns:m="http://schemas.openxmlformats.org/officeDocument/2006/math" xmlns:v="urn:schemas-microsoft-com:vml" xmlns:wp14="http://schemas.microsoft.com/office/word/2010/wordprocessingDrawing" xmlns:wp="http://schemas.openxmlformats.org/drawingml/2006/wordprocessingDrawing" xmlns:w10="urn:schemas-microsoft-com:office:word" xmlns:w="http://schemas.openxmlformats.org/wordprocessingml/2006/main" xmlns:w14="http://schemas.microsoft.com/office/word/2010/wordml" xmlns:w15="http://schemas.microsoft.com/office/word/2012/wordml" xmlns:w16cex="http://schemas.microsoft.com/office/word/2018/wordml/cex" xmlns:w16cid="http://schemas.microsoft.com/office/word/2016/wordml/cid" xmlns:w16="http://schemas.microsoft.com/office/word/2018/wordml" xmlns:w16sdtdh="http://schemas.microsoft.com/office/word/2020/wordml/sdtdatahash" xmlns:w16se="http://schemas.microsoft.com/office/word/2015/wordml/symex" xmlns:wpg="http://schemas.microsoft.com/office/word/2010/wordprocessingGroup" xmlns:wpi="http://schemas.microsoft.com/office/word/2010/wordprocessingInk" xmlns:wne="http://schemas.microsoft.com/office/word/2006/wordml" xmlns:wps="http://schemas.microsoft.com/office/word/2010/wordprocessingShape" mc:Ignorable="w14 w15 w16se w16cid w16 w16cex w16sdtdh wp14">
+<w:document xmlns:wpc="http://schemas.microsoft.com/office/word/2010/wordprocessingCanvas" xmlns:cx="http://schemas.microsoft.com/office/drawing/2014/chartex" xmlns:cx1="http://schemas.microsoft.com/office/drawing/2015/9/8/chartex" xmlns:cx2="http://schemas.microsoft.com/office/drawing/2015/10/21/chartex" xmlns:cx3="http://schemas.microsoft.com/office/drawing/2016/5/9/chartex" xmlns:cx4="http://schemas.microsoft.com/office/drawing/2016/5/10/chartex" xmlns:cx5="http://schemas.microsoft.com/office/drawing/2016/5/11/chartex" xmlns:cx6="http://schemas.microsoft.com/office/drawing/2016/5/12/chartex" xmlns:cx7="http://schemas.microsoft.com/office/drawing/2016/5/13/chartex" xmlns:cx8="http://schemas.microsoft.com/office/drawing/2016/5/14/chartex" xmlns:mc="http://schemas.openxmlformats.org/markup-compatibility/2006" xmlns:aink="http://schemas.microsoft.com/office/drawing/2016/ink" xmlns:am3d="http://schemas.microsoft.com/office/drawing/2017/model3d" xmlns:o="urn:schemas-microsoft-com:office:office" xmlns:oel="http://schemas.microsoft.com/office/2019/extlst" xmlns:r="http://schemas.openxmlformats.org/officeDocument/2006/relationships" xmlns:m="http://schemas.openxmlformats.org/officeDocument/2006/math" xmlns:v="urn:schemas-microsoft-com:vml" xmlns:wp14="http://schemas.microsoft.com/office/word/2010/wordprocessingDrawing" xmlns:wp="http://schemas.openxmlformats.org/drawingml/2006/wordprocessingDrawing" xmlns:w10="urn:schemas-microsoft-com:office:word" xmlns:w="http://schemas.openxmlformats.org/wordprocessingml/2006/main" xmlns:w14="http://schemas.microsoft.com/office/word/2010/wordml" xmlns:w15="http://schemas.microsoft.com/office/word/2012/wordml" xmlns:w16cex="http://schemas.microsoft.com/office/word/2018/wordml/cex" xmlns:w16cid="http://schemas.microsoft.com/office/word/2016/wordml/cid" xmlns:w16="http://schemas.microsoft.com/office/word/2018/wordml" xmlns:w16du="http://schemas.microsoft.com/office/word/2023/wordml/word16du" xmlns:w16sdtdh="http://schemas.microsoft.com/office/word/2020/wordml/sdtdatahash" xmlns:w16sdtfl="http://schemas.microsoft.com/office/word/2024/wordml/sdtformatlock" xmlns:w16se="http://schemas.microsoft.com/office/word/2015/wordml/symex" xmlns:wpg="http://schemas.microsoft.com/office/word/2010/wordprocessingGroup" xmlns:wpi="http://schemas.microsoft.com/office/word/2010/wordprocessingInk" xmlns:wne="http://schemas.microsoft.com/office/word/2006/wordml" xmlns:wps="http://schemas.microsoft.com/office/word/2010/wordprocessingShape" mc:Ignorable="w14 w15 w16se w16cid w16 w16cex w16sdtdh w16sdtfl w16du wp14">
   <w:body>
     <w:p/>
     <w:p>
@@ -15,7 +15,7 @@
           <w:noProof/>
         </w:rPr>
         <mc:AlternateContent>
-          <mc:Choice Requires="wpg">
+          <mc:Choice Requires="wps">
             <w:drawing>
               <wp:anchor distT="0" distB="0" distL="114300" distR="114300" simplePos="0" relativeHeight="251658240" behindDoc="0" locked="0" layoutInCell="1" hidden="0" allowOverlap="1" wp14:anchorId="57CC0E55" wp14:editId="4A4EBAA7">
                 <wp:simplePos x="0" y="0"/>
@@ -76,47 +76,32 @@
               </wp:anchor>
             </w:drawing>
           </mc:Choice>
-          <mc:Fallback xmlns:cr="http://schemas.microsoft.com/office/comments/2020/reactions" xmlns="http://schemas.microsoft.com/office/tasks/2019/documenttasks" xmlns:dgm="http://schemas.openxmlformats.org/drawingml/2006/diagram" xmlns:lc="http://schemas.openxmlformats.org/drawingml/2006/lockedCanvas" xmlns:c="http://schemas.openxmlformats.org/drawingml/2006/chart" xmlns:pic="http://schemas.openxmlformats.org/drawingml/2006/picture" xmlns:a="http://schemas.openxmlformats.org/drawingml/2006/main" xmlns:sl="http://schemas.openxmlformats.org/schemaLibrary/2006/main">
-            <w:drawing>
-              <wp:anchor allowOverlap="1" behindDoc="0" distB="0" distT="0" distL="114300" distR="114300" hidden="0" layoutInCell="1" locked="0" relativeHeight="0" simplePos="0">
-                <wp:simplePos x="0" y="0"/>
-                <wp:positionH relativeFrom="page">
-                  <wp:posOffset>1128713</wp:posOffset>
-                </wp:positionH>
-                <wp:positionV relativeFrom="page">
-                  <wp:posOffset>968057</wp:posOffset>
-                </wp:positionV>
-                <wp:extent cx="3670300" cy="3660775"/>
-                <wp:effectExtent b="0" l="0" r="0" t="0"/>
-                <wp:wrapSquare wrapText="bothSides" distB="0" distT="0" distL="114300" distR="114300"/>
-                <wp:docPr id="1595991580" name="image5.png"/>
-                <a:graphic>
-                  <a:graphicData uri="http://schemas.openxmlformats.org/drawingml/2006/picture">
-                    <pic:pic>
-                      <pic:nvPicPr>
-                        <pic:cNvPr id="0" name="image5.png"/>
-                        <pic:cNvPicPr preferRelativeResize="0"/>
-                      </pic:nvPicPr>
-                      <pic:blipFill>
-                        <a:blip r:embed="rId7"/>
-                        <a:srcRect/>
-                        <a:stretch>
-                          <a:fillRect/>
-                        </a:stretch>
-                      </pic:blipFill>
-                      <pic:spPr>
-                        <a:xfrm>
-                          <a:off x="0" y="0"/>
-                          <a:ext cx="3670300" cy="3660775"/>
-                        </a:xfrm>
-                        <a:prstGeom prst="rect"/>
-                        <a:ln/>
-                      </pic:spPr>
-                    </pic:pic>
-                  </a:graphicData>
-                </a:graphic>
-              </wp:anchor>
-            </w:drawing>
+          <mc:Fallback>
+            <w:pict>
+              <v:rect w14:anchorId="57CC0E55" id="Rectángulo 1595991580" o:spid="_x0000_s1026" style="position:absolute;margin-left:88.9pt;margin-top:76.2pt;width:289pt;height:288.25pt;z-index:251658240;visibility:visible;mso-wrap-style:square;mso-wrap-distance-left:9pt;mso-wrap-distance-top:0;mso-wrap-distance-right:9pt;mso-wrap-distance-bottom:0;mso-position-horizontal:absolute;mso-position-horizontal-relative:page;mso-position-vertical:absolute;mso-position-vertical-relative:page;v-text-anchor:bottom" o:gfxdata="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" filled="f" stroked="f">
+                <v:textbox inset="0,0,0,0">
+                  <w:txbxContent>
+                    <w:p>
+                      <w:pPr>
+                        <w:spacing w:after="0" w:line="240" w:lineRule="auto"/>
+                        <w:jc w:val="right"/>
+                        <w:textDirection w:val="btLr"/>
+                      </w:pPr>
+                      <w:r>
+                        <w:rPr>
+                          <w:rFonts w:ascii="Arial" w:eastAsia="Arial" w:hAnsi="Arial" w:cs="Arial"/>
+                          <w:smallCaps/>
+                          <w:color w:val="0A1D30"/>
+                          <w:sz w:val="40"/>
+                        </w:rPr>
+                        <w:t>[FECHA]</w:t>
+                      </w:r>
+                    </w:p>
+                  </w:txbxContent>
+                </v:textbox>
+                <w10:wrap type="square" anchorx="page" anchory="page"/>
+              </v:rect>
+            </w:pict>
           </mc:Fallback>
         </mc:AlternateContent>
       </w:r>
@@ -125,7 +110,7 @@
           <w:noProof/>
         </w:rPr>
         <mc:AlternateContent>
-          <mc:Choice Requires="wpg">
+          <mc:Choice Requires="wps">
             <w:drawing>
               <wp:anchor distT="0" distB="0" distL="114300" distR="114300" simplePos="0" relativeHeight="251659264" behindDoc="0" locked="0" layoutInCell="1" hidden="0" allowOverlap="1" wp14:anchorId="495B8876" wp14:editId="578EF101">
                 <wp:simplePos x="0" y="0"/>
@@ -217,47 +202,63 @@
               </wp:anchor>
             </w:drawing>
           </mc:Choice>
-          <mc:Fallback xmlns:cr="http://schemas.microsoft.com/office/comments/2020/reactions" xmlns="http://schemas.microsoft.com/office/tasks/2019/documenttasks" xmlns:dgm="http://schemas.openxmlformats.org/drawingml/2006/diagram" xmlns:lc="http://schemas.openxmlformats.org/drawingml/2006/lockedCanvas" xmlns:c="http://schemas.openxmlformats.org/drawingml/2006/chart" xmlns:pic="http://schemas.openxmlformats.org/drawingml/2006/picture" xmlns:a="http://schemas.openxmlformats.org/drawingml/2006/main" xmlns:sl="http://schemas.openxmlformats.org/schemaLibrary/2006/main">
-            <w:drawing>
-              <wp:anchor allowOverlap="1" behindDoc="0" distB="0" distT="0" distL="114300" distR="114300" hidden="0" layoutInCell="1" locked="0" relativeHeight="0" simplePos="0">
-                <wp:simplePos x="0" y="0"/>
-                <wp:positionH relativeFrom="page">
-                  <wp:posOffset>1128713</wp:posOffset>
-                </wp:positionH>
-                <wp:positionV relativeFrom="page">
-                  <wp:posOffset>8944293</wp:posOffset>
-                </wp:positionV>
-                <wp:extent cx="5762625" cy="662305"/>
-                <wp:effectExtent b="0" l="0" r="0" t="0"/>
-                <wp:wrapSquare wrapText="bothSides" distB="0" distT="0" distL="114300" distR="114300"/>
-                <wp:docPr id="1595991579" name="image4.png"/>
-                <a:graphic>
-                  <a:graphicData uri="http://schemas.openxmlformats.org/drawingml/2006/picture">
-                    <pic:pic>
-                      <pic:nvPicPr>
-                        <pic:cNvPr id="0" name="image4.png"/>
-                        <pic:cNvPicPr preferRelativeResize="0"/>
-                      </pic:nvPicPr>
-                      <pic:blipFill>
-                        <a:blip r:embed="rId7"/>
-                        <a:srcRect/>
-                        <a:stretch>
-                          <a:fillRect/>
-                        </a:stretch>
-                      </pic:blipFill>
-                      <pic:spPr>
-                        <a:xfrm>
-                          <a:off x="0" y="0"/>
-                          <a:ext cx="5762625" cy="662305"/>
-                        </a:xfrm>
-                        <a:prstGeom prst="rect"/>
-                        <a:ln/>
-                      </pic:spPr>
-                    </pic:pic>
-                  </a:graphicData>
-                </a:graphic>
-              </wp:anchor>
-            </w:drawing>
+          <mc:Fallback>
+            <w:pict>
+              <v:rect w14:anchorId="495B8876" id="Rectángulo 1595991579" o:spid="_x0000_s1027" style="position:absolute;margin-left:88.9pt;margin-top:704.3pt;width:453.75pt;height:52.15pt;z-index:251659264;visibility:visible;mso-wrap-style:square;mso-wrap-distance-left:9pt;mso-wrap-distance-top:0;mso-wrap-distance-right:9pt;mso-wrap-distance-bottom:0;mso-position-horizontal:absolute;mso-position-horizontal-relative:page;mso-position-vertical:absolute;mso-position-vertical-relative:page;v-text-anchor:bottom" o:gfxdata="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" filled="f" stroked="f">
+                <v:textbox inset="0,0,0,0">
+                  <w:txbxContent>
+                    <w:p>
+                      <w:pPr>
+                        <w:spacing w:after="0" w:line="240" w:lineRule="auto"/>
+                        <w:jc w:val="right"/>
+                        <w:textDirection w:val="btLr"/>
+                      </w:pPr>
+                      <w:r>
+                        <w:rPr>
+                          <w:rFonts w:ascii="Arial" w:eastAsia="Arial" w:hAnsi="Arial" w:cs="Arial"/>
+                          <w:smallCaps/>
+                          <w:color w:val="262626"/>
+                          <w:sz w:val="28"/>
+                        </w:rPr>
+                        <w:t>DANIEL ORTIZ MEJÍA Y ARNAU SANCHEZ GOMEZ</w:t>
+                      </w:r>
+                    </w:p>
+                    <w:p>
+                      <w:pPr>
+                        <w:spacing w:after="0" w:line="240" w:lineRule="auto"/>
+                        <w:jc w:val="right"/>
+                        <w:textDirection w:val="btLr"/>
+                      </w:pPr>
+                      <w:r>
+                        <w:rPr>
+                          <w:rFonts w:ascii="Arial" w:eastAsia="Arial" w:hAnsi="Arial" w:cs="Arial"/>
+                          <w:smallCaps/>
+                          <w:color w:val="262626"/>
+                          <w:sz w:val="20"/>
+                        </w:rPr>
+                        <w:t xml:space="preserve">     </w:t>
+                      </w:r>
+                    </w:p>
+                    <w:p>
+                      <w:pPr>
+                        <w:spacing w:after="0" w:line="240" w:lineRule="auto"/>
+                        <w:jc w:val="right"/>
+                        <w:textDirection w:val="btLr"/>
+                      </w:pPr>
+                      <w:r>
+                        <w:rPr>
+                          <w:rFonts w:ascii="Arial" w:eastAsia="Arial" w:hAnsi="Arial" w:cs="Arial"/>
+                          <w:color w:val="262626"/>
+                          <w:sz w:val="20"/>
+                        </w:rPr>
+                        <w:t xml:space="preserve">      </w:t>
+                      </w:r>
+                    </w:p>
+                  </w:txbxContent>
+                </v:textbox>
+                <w10:wrap type="square" anchorx="page" anchory="page"/>
+              </v:rect>
+            </w:pict>
           </mc:Fallback>
         </mc:AlternateContent>
       </w:r>
@@ -266,7 +267,7 @@
           <w:noProof/>
         </w:rPr>
         <mc:AlternateContent>
-          <mc:Choice Requires="wpg">
+          <mc:Choice Requires="wps">
             <w:drawing>
               <wp:anchor distT="0" distB="0" distL="114300" distR="114300" simplePos="0" relativeHeight="251660288" behindDoc="0" locked="0" layoutInCell="1" hidden="0" allowOverlap="1" wp14:anchorId="21C0A0E9" wp14:editId="75E9D38C">
                 <wp:simplePos x="0" y="0"/>
@@ -343,47 +344,48 @@
               </wp:anchor>
             </w:drawing>
           </mc:Choice>
-          <mc:Fallback xmlns:cr="http://schemas.microsoft.com/office/comments/2020/reactions" xmlns="http://schemas.microsoft.com/office/tasks/2019/documenttasks" xmlns:dgm="http://schemas.openxmlformats.org/drawingml/2006/diagram" xmlns:lc="http://schemas.openxmlformats.org/drawingml/2006/lockedCanvas" xmlns:c="http://schemas.openxmlformats.org/drawingml/2006/chart" xmlns:pic="http://schemas.openxmlformats.org/drawingml/2006/picture" xmlns:a="http://schemas.openxmlformats.org/drawingml/2006/main" xmlns:sl="http://schemas.openxmlformats.org/schemaLibrary/2006/main">
-            <w:drawing>
-              <wp:anchor allowOverlap="1" behindDoc="0" distB="0" distT="0" distL="114300" distR="114300" hidden="0" layoutInCell="1" locked="0" relativeHeight="0" simplePos="0">
-                <wp:simplePos x="0" y="0"/>
-                <wp:positionH relativeFrom="page">
-                  <wp:posOffset>1128713</wp:posOffset>
-                </wp:positionH>
-                <wp:positionV relativeFrom="page">
-                  <wp:posOffset>4859973</wp:posOffset>
-                </wp:positionV>
-                <wp:extent cx="5762625" cy="535305"/>
-                <wp:effectExtent b="0" l="0" r="0" t="0"/>
-                <wp:wrapSquare wrapText="bothSides" distB="0" distT="0" distL="114300" distR="114300"/>
-                <wp:docPr id="1595991578" name="image3.png"/>
-                <a:graphic>
-                  <a:graphicData uri="http://schemas.openxmlformats.org/drawingml/2006/picture">
-                    <pic:pic>
-                      <pic:nvPicPr>
-                        <pic:cNvPr id="0" name="image3.png"/>
-                        <pic:cNvPicPr preferRelativeResize="0"/>
-                      </pic:nvPicPr>
-                      <pic:blipFill>
-                        <a:blip r:embed="rId7"/>
-                        <a:srcRect/>
-                        <a:stretch>
-                          <a:fillRect/>
-                        </a:stretch>
-                      </pic:blipFill>
-                      <pic:spPr>
-                        <a:xfrm>
-                          <a:off x="0" y="0"/>
-                          <a:ext cx="5762625" cy="535305"/>
-                        </a:xfrm>
-                        <a:prstGeom prst="rect"/>
-                        <a:ln/>
-                      </pic:spPr>
-                    </pic:pic>
-                  </a:graphicData>
-                </a:graphic>
-              </wp:anchor>
-            </w:drawing>
+          <mc:Fallback>
+            <w:pict>
+              <v:rect w14:anchorId="21C0A0E9" id="Rectángulo 1595991578" o:spid="_x0000_s1028" style="position:absolute;margin-left:88.9pt;margin-top:382.7pt;width:453.75pt;height:42.15pt;z-index:251660288;visibility:visible;mso-wrap-style:square;mso-wrap-distance-left:9pt;mso-wrap-distance-top:0;mso-wrap-distance-right:9pt;mso-wrap-distance-bottom:0;mso-position-horizontal:absolute;mso-position-horizontal-relative:page;mso-position-vertical:absolute;mso-position-vertical-relative:page;v-text-anchor:bottom" o:gfxdata="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" filled="f" stroked="f">
+                <v:textbox inset="0,0,0,0">
+                  <w:txbxContent>
+                    <w:p>
+                      <w:pPr>
+                        <w:spacing w:after="0" w:line="240" w:lineRule="auto"/>
+                        <w:jc w:val="right"/>
+                        <w:textDirection w:val="btLr"/>
+                      </w:pPr>
+                      <w:r>
+                        <w:rPr>
+                          <w:rFonts w:ascii="Arial" w:eastAsia="Arial" w:hAnsi="Arial" w:cs="Arial"/>
+                          <w:smallCaps/>
+                          <w:color w:val="0A1D30"/>
+                          <w:sz w:val="52"/>
+                        </w:rPr>
+                        <w:t>MESCLOUD</w:t>
+                      </w:r>
+                    </w:p>
+                    <w:p>
+                      <w:pPr>
+                        <w:spacing w:after="0" w:line="240" w:lineRule="auto"/>
+                        <w:jc w:val="right"/>
+                        <w:textDirection w:val="btLr"/>
+                      </w:pPr>
+                      <w:r>
+                        <w:rPr>
+                          <w:rFonts w:ascii="Arial" w:eastAsia="Arial" w:hAnsi="Arial" w:cs="Arial"/>
+                          <w:smallCaps/>
+                          <w:color w:val="0E2841"/>
+                          <w:sz w:val="36"/>
+                        </w:rPr>
+                        <w:t>ALMACENAMIENTO LOCAL</w:t>
+                      </w:r>
+                    </w:p>
+                  </w:txbxContent>
+                </v:textbox>
+                <w10:wrap type="square" anchorx="page" anchory="page"/>
+              </v:rect>
+            </w:pict>
           </mc:Fallback>
         </mc:AlternateContent>
       </w:r>
@@ -531,47 +533,50 @@
               </wp:anchor>
             </w:drawing>
           </mc:Choice>
-          <mc:Fallback xmlns:cr="http://schemas.microsoft.com/office/comments/2020/reactions" xmlns="http://schemas.microsoft.com/office/tasks/2019/documenttasks" xmlns:dgm="http://schemas.openxmlformats.org/drawingml/2006/diagram" xmlns:lc="http://schemas.openxmlformats.org/drawingml/2006/lockedCanvas" xmlns:c="http://schemas.openxmlformats.org/drawingml/2006/chart" xmlns:pic="http://schemas.openxmlformats.org/drawingml/2006/picture" xmlns:a="http://schemas.openxmlformats.org/drawingml/2006/main" xmlns:sl="http://schemas.openxmlformats.org/schemaLibrary/2006/main">
-            <w:drawing>
-              <wp:anchor allowOverlap="1" behindDoc="0" distB="0" distT="0" distL="114300" distR="114300" hidden="0" layoutInCell="1" locked="0" relativeHeight="0" simplePos="0">
-                <wp:simplePos x="0" y="0"/>
-                <wp:positionH relativeFrom="page">
-                  <wp:posOffset>339725</wp:posOffset>
-                </wp:positionH>
-                <wp:positionV relativeFrom="page">
-                  <wp:align>center</wp:align>
-                </wp:positionV>
-                <wp:extent cx="228600" cy="9144000"/>
-                <wp:effectExtent b="0" l="0" r="0" t="0"/>
-                <wp:wrapNone/>
-                <wp:docPr id="1595991577" name="image2.png"/>
-                <a:graphic>
-                  <a:graphicData uri="http://schemas.openxmlformats.org/drawingml/2006/picture">
-                    <pic:pic>
-                      <pic:nvPicPr>
-                        <pic:cNvPr id="0" name="image2.png"/>
-                        <pic:cNvPicPr preferRelativeResize="0"/>
-                      </pic:nvPicPr>
-                      <pic:blipFill>
-                        <a:blip r:embed="rId7"/>
-                        <a:srcRect/>
-                        <a:stretch>
-                          <a:fillRect/>
-                        </a:stretch>
-                      </pic:blipFill>
-                      <pic:spPr>
-                        <a:xfrm>
-                          <a:off x="0" y="0"/>
-                          <a:ext cx="228600" cy="9144000"/>
-                        </a:xfrm>
-                        <a:prstGeom prst="rect"/>
-                        <a:ln/>
-                      </pic:spPr>
-                    </pic:pic>
-                  </a:graphicData>
-                </a:graphic>
-              </wp:anchor>
-            </w:drawing>
+          <mc:Fallback>
+            <w:pict>
+              <v:group w14:anchorId="266597F3" id="Grupo 1595991577" o:spid="_x0000_s1029" style="position:absolute;margin-left:26.75pt;margin-top:0;width:18pt;height:10in;z-index:251661312;mso-position-horizontal-relative:page;mso-position-vertical:center;mso-position-vertical-relative:page" coordorigin="52317" coordsize="2286,75600" o:gfxdata="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">
+                <v:group id="Grupo 1" o:spid="_x0000_s1030" style="position:absolute;left:52317;width:2286;height:75600" coordsize="2286,91440" o:gfxdata="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">
+                  <v:rect id="Rectángulo 2" o:spid="_x0000_s1031" style="position:absolute;width:2286;height:91440;visibility:visible;mso-wrap-style:square;v-text-anchor:middle" o:gfxdata="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" filled="f" stroked="f">
+                    <v:textbox inset="2.53958mm,2.53958mm,2.53958mm,2.53958mm">
+                      <w:txbxContent>
+                        <w:p>
+                          <w:pPr>
+                            <w:spacing w:after="0" w:line="240" w:lineRule="auto"/>
+                            <w:textDirection w:val="btLr"/>
+                          </w:pPr>
+                        </w:p>
+                      </w:txbxContent>
+                    </v:textbox>
+                  </v:rect>
+                  <v:rect id="Rectángulo 3" o:spid="_x0000_s1032" style="position:absolute;width:2286;height:87820;visibility:visible;mso-wrap-style:square;v-text-anchor:middle" o:gfxdata="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" fillcolor="#e97132 [3205]" stroked="f">
+                    <v:textbox inset="2.53958mm,2.53958mm,2.53958mm,2.53958mm">
+                      <w:txbxContent>
+                        <w:p>
+                          <w:pPr>
+                            <w:spacing w:after="0" w:line="240" w:lineRule="auto"/>
+                            <w:textDirection w:val="btLr"/>
+                          </w:pPr>
+                        </w:p>
+                      </w:txbxContent>
+                    </v:textbox>
+                  </v:rect>
+                  <v:rect id="Rectángulo 4" o:spid="_x0000_s1033" style="position:absolute;top:89154;width:2286;height:2286;visibility:visible;mso-wrap-style:square;v-text-anchor:middle" o:gfxdata="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" fillcolor="#156082 [3204]" stroked="f">
+                    <v:textbox inset="2.53958mm,2.53958mm,2.53958mm,2.53958mm">
+                      <w:txbxContent>
+                        <w:p>
+                          <w:pPr>
+                            <w:spacing w:after="0" w:line="240" w:lineRule="auto"/>
+                            <w:textDirection w:val="btLr"/>
+                          </w:pPr>
+                        </w:p>
+                      </w:txbxContent>
+                    </v:textbox>
+                  </v:rect>
+                </v:group>
+                <w10:wrap anchorx="page" anchory="page"/>
+              </v:group>
+            </w:pict>
           </mc:Fallback>
         </mc:AlternateContent>
       </w:r>
@@ -642,157 +647,145 @@
     </w:p>
     <w:p>
       <w:r>
-        <w:t xml:space="preserve">El proyecto desarrolla la implementación de un sistema de </w:t>
+        <w:t xml:space="preserve">El proyecto desarrolla la implementación de un sistema de cloud privado mediante la instalación y configuración de la plataforma </w:t>
       </w:r>
       <w:proofErr w:type="spellStart"/>
       <w:r>
-        <w:t>cloud</w:t>
+        <w:t>Nextcloud</w:t>
       </w:r>
       <w:proofErr w:type="spellEnd"/>
       <w:r>
-        <w:t xml:space="preserve"> privado mediante la instalación y configuración de la plataforma </w:t>
+        <w:t xml:space="preserve"> en un servidor </w:t>
       </w:r>
       <w:proofErr w:type="spellStart"/>
       <w:r>
+        <w:t>openmediavaul</w:t>
+      </w:r>
+      <w:proofErr w:type="spellEnd"/>
+      <w:r>
+        <w:t>. Este servicio permitirá a los empleados de una empresa ficticia almacenar, sincronizar y compartir archivos de forma segura, garantizando el acceso desde diferentes dispositivos y mejorando la colaboración interna.</w:t>
+      </w:r>
+    </w:p>
+    <w:p>
+      <w:r>
+        <w:t xml:space="preserve">Para conseguirlo, se instalarán todos los componentes necesarios, necesitamos un servidor con </w:t>
+      </w:r>
+      <w:proofErr w:type="spellStart"/>
+      <w:r>
+        <w:t>openmediavault</w:t>
+      </w:r>
+      <w:proofErr w:type="spellEnd"/>
+      <w:r>
+        <w:t xml:space="preserve"> e instalar </w:t>
+      </w:r>
+      <w:proofErr w:type="spellStart"/>
+      <w:r>
+        <w:t>nextcloud</w:t>
+      </w:r>
+      <w:proofErr w:type="spellEnd"/>
+      <w:r>
+        <w:t xml:space="preserve"> con </w:t>
+      </w:r>
+      <w:proofErr w:type="spellStart"/>
+      <w:r>
+        <w:t>docker</w:t>
+      </w:r>
+      <w:proofErr w:type="spellEnd"/>
+      <w:r>
+        <w:t xml:space="preserve">, incluyendo también instalar todo lo necesario para que funcione todo con permisos, </w:t>
+      </w:r>
+      <w:proofErr w:type="spellStart"/>
+      <w:r>
+        <w:t>backups</w:t>
+      </w:r>
+      <w:proofErr w:type="spellEnd"/>
+      <w:r>
+        <w:t xml:space="preserve"> y sistema de usuarios con carpetas personales… </w:t>
+      </w:r>
+      <w:proofErr w:type="spellStart"/>
+      <w:r>
+        <w:t>andemas</w:t>
+      </w:r>
+      <w:proofErr w:type="spellEnd"/>
+      <w:r>
+        <w:t xml:space="preserve"> instalar todo para proteger las comunicaciones. También se crearán usuarios, grupos y permisos, asegurando que cada empleado tenga acceso únicamente a los recursos autorizados.</w:t>
+      </w:r>
+    </w:p>
+    <w:p>
+      <w:r>
+        <w:t xml:space="preserve">El proyecto incluirá medidas de seguridad como firewall con UFW, cifrado SSL mediante </w:t>
+      </w:r>
+      <w:proofErr w:type="spellStart"/>
+      <w:r>
+        <w:t>Let’s</w:t>
+      </w:r>
+      <w:proofErr w:type="spellEnd"/>
+      <w:r>
+        <w:t xml:space="preserve"> </w:t>
+      </w:r>
+      <w:proofErr w:type="spellStart"/>
+      <w:r>
+        <w:t>Encrypt</w:t>
+      </w:r>
+      <w:proofErr w:type="spellEnd"/>
+      <w:r>
+        <w:t xml:space="preserve">, protección contra intrusiones con Fail2ban y un sistema de copias de seguridad automáticas tanto del directorio de datos como de la base de datos. Se configurarán clientes de </w:t>
+      </w:r>
+      <w:proofErr w:type="spellStart"/>
+      <w:r>
         <w:t>Nextcloud</w:t>
       </w:r>
       <w:proofErr w:type="spellEnd"/>
       <w:r>
-        <w:t xml:space="preserve"> en un servidor </w:t>
+        <w:t xml:space="preserve"> en equipos Windows y dispositivos móviles para garantizar el uso real del sistema por parte de los usuarios.</w:t>
+      </w:r>
+    </w:p>
+    <w:p>
+      <w:r>
+        <w:t>El resultado final será un servicio de nube privada totalmente funcional, accesible desde dentro y fuera de la red, con usuarios definidos, permisos correctamente configurados, aplicaciones adicionales según las necesidades y documentación completa del proceso de instalación, administración y uso.</w:t>
+      </w:r>
+    </w:p>
+    <w:p>
+      <w:pPr>
+        <w:rPr>
+          <w:b/>
+          <w:bCs/>
+        </w:rPr>
+      </w:pPr>
+    </w:p>
+    <w:p>
+      <w:pPr>
+        <w:rPr>
+          <w:b/>
+          <w:bCs/>
+        </w:rPr>
+      </w:pPr>
+    </w:p>
+    <w:p>
+      <w:pPr>
+        <w:rPr>
+          <w:b/>
+          <w:bCs/>
+        </w:rPr>
+      </w:pPr>
+      <w:r>
+        <w:rPr>
+          <w:b/>
+          <w:bCs/>
+        </w:rPr>
+        <w:t>Estudio de mercado</w:t>
+      </w:r>
+    </w:p>
+    <w:p>
+      <w:r>
+        <w:t xml:space="preserve">Actualmente, las empresas utilizan servicios como Google Drive, Dropbox o OneDrive para el almacenamiento y la colaboración en la nube. Sin embargo, estos servicios dependen de servidores externos y no ofrecen control total sobre los datos. </w:t>
       </w:r>
       <w:proofErr w:type="spellStart"/>
       <w:r>
-        <w:t>openmediavaul</w:t>
+        <w:t>Nextcloud</w:t>
       </w:r>
       <w:proofErr w:type="spellEnd"/>
       <w:r>
-        <w:t>. Este servicio permitirá a los empleados de una empresa ficticia almacenar, sincronizar y compartir archivos de forma segura, garantizando el acceso desde diferentes dispositivos y mejorando la colaboración interna.</w:t>
-      </w:r>
-    </w:p>
-    <w:p>
-      <w:r>
-        <w:t xml:space="preserve">Para conseguirlo, se instalarán todos los componentes necesarios, necesitamos un servidor con </w:t>
-      </w:r>
-      <w:proofErr w:type="spellStart"/>
-      <w:r>
-        <w:t>openmediavault</w:t>
-      </w:r>
-      <w:proofErr w:type="spellEnd"/>
-      <w:r>
-        <w:t xml:space="preserve"> e instalar </w:t>
-      </w:r>
-      <w:proofErr w:type="spellStart"/>
-      <w:r>
-        <w:t>nextcloud</w:t>
-      </w:r>
-      <w:proofErr w:type="spellEnd"/>
-      <w:r>
-        <w:t xml:space="preserve"> con </w:t>
-      </w:r>
-      <w:proofErr w:type="spellStart"/>
-      <w:r>
-        <w:t>docker</w:t>
-      </w:r>
-      <w:proofErr w:type="spellEnd"/>
-      <w:r>
-        <w:t xml:space="preserve">, incluyendo también instalar todo lo necesario para que funcione todo con permisos, </w:t>
-      </w:r>
-      <w:proofErr w:type="spellStart"/>
-      <w:r>
-        <w:t>backups</w:t>
-      </w:r>
-      <w:proofErr w:type="spellEnd"/>
-      <w:r>
-        <w:t xml:space="preserve"> y sistema de usuarios con carpetas personales… </w:t>
-      </w:r>
-      <w:proofErr w:type="spellStart"/>
-      <w:r>
-        <w:t>andemas</w:t>
-      </w:r>
-      <w:proofErr w:type="spellEnd"/>
-      <w:r>
-        <w:t xml:space="preserve"> instalar todo para proteger las comunicaciones. También se crearán usuarios, grupos y permisos, asegurando que cada empleado tenga acceso únicamente a los recursos autorizados.</w:t>
-      </w:r>
-    </w:p>
-    <w:p>
-      <w:r>
-        <w:t xml:space="preserve">El proyecto incluirá medidas de seguridad como firewall con UFW, cifrado SSL mediante </w:t>
-      </w:r>
-      <w:proofErr w:type="spellStart"/>
-      <w:r>
-        <w:t>Let’s</w:t>
-      </w:r>
-      <w:proofErr w:type="spellEnd"/>
-      <w:r>
-        <w:t xml:space="preserve"> </w:t>
-      </w:r>
-      <w:proofErr w:type="spellStart"/>
-      <w:r>
-        <w:t>Encrypt</w:t>
-      </w:r>
-      <w:proofErr w:type="spellEnd"/>
-      <w:r>
-        <w:t xml:space="preserve">, protección contra intrusiones con Fail2ban y un sistema de copias de seguridad automáticas tanto del directorio de datos como de la base de datos. Se configurarán clientes de </w:t>
-      </w:r>
-      <w:proofErr w:type="spellStart"/>
-      <w:r>
-        <w:t>Nextcloud</w:t>
-      </w:r>
-      <w:proofErr w:type="spellEnd"/>
-      <w:r>
-        <w:t xml:space="preserve"> en equipos Windows y dispositivos móviles para garantizar el uso real del sistema por parte de los usuarios.</w:t>
-      </w:r>
-    </w:p>
-    <w:p>
-      <w:r>
-        <w:t>El resultado final será un servicio de nube privada totalmente funcional, accesible desde dentro y fuera de la red, con usuarios definidos, permisos correctamente configurados, aplicaciones adicionales según las necesidades y documentación completa del proceso de instalación, administración y uso.</w:t>
-      </w:r>
-    </w:p>
-    <w:p>
-      <w:pPr>
-        <w:rPr>
-          <w:b/>
-          <w:bCs/>
-        </w:rPr>
-      </w:pPr>
-    </w:p>
-    <w:p>
-      <w:pPr>
-        <w:rPr>
-          <w:b/>
-          <w:bCs/>
-        </w:rPr>
-      </w:pPr>
-    </w:p>
-    <w:p>
-      <w:pPr>
-        <w:rPr>
-          <w:b/>
-          <w:bCs/>
-        </w:rPr>
-      </w:pPr>
-      <w:r>
-        <w:rPr>
-          <w:b/>
-          <w:bCs/>
-        </w:rPr>
-        <w:t>Estudio de mercado</w:t>
-      </w:r>
-    </w:p>
-    <w:p>
-      <w:r>
-        <w:t xml:space="preserve">Actualmente, las empresas utilizan servicios como Google Drive, Dropbox o OneDrive para el almacenamiento y la colaboración en la nube. Sin embargo, </w:t>
-      </w:r>
-      <w:r>
-        <w:lastRenderedPageBreak/>
-        <w:t xml:space="preserve">estos servicios dependen de servidores externos y no ofrecen control total sobre los datos. </w:t>
-      </w:r>
-      <w:proofErr w:type="spellStart"/>
-      <w:r>
-        <w:t>Nextcloud</w:t>
-      </w:r>
-      <w:proofErr w:type="spellEnd"/>
-      <w:r>
         <w:t xml:space="preserve"> surge como una alternativa de software libre que permite implementar una nube privada, ofreciendo:</w:t>
       </w:r>
     </w:p>
@@ -870,15 +863,7 @@
     </w:p>
     <w:p>
       <w:r>
-        <w:t xml:space="preserve">Este proyecto demuestra cómo una empresa puede disponer de un servicio de </w:t>
-      </w:r>
-      <w:proofErr w:type="spellStart"/>
-      <w:r>
-        <w:t>cloud</w:t>
-      </w:r>
-      <w:proofErr w:type="spellEnd"/>
-      <w:r>
-        <w:t xml:space="preserve"> propio, seguro y funcional sin depender de terceros.</w:t>
+        <w:t>Este proyecto demuestra cómo una empresa puede disponer de un servicio de cloud propio, seguro y funcional sin depender de terceros.</w:t>
       </w:r>
     </w:p>
     <w:p>
@@ -1447,7 +1432,6 @@
           <w:bCs/>
           <w:color w:val="000000"/>
         </w:rPr>
-        <w:lastRenderedPageBreak/>
         <w:t>Herramientas de seguridad:</w:t>
       </w:r>
       <w:r>
@@ -1501,19 +1485,11 @@
         </w:pBdr>
         <w:spacing w:after="0"/>
       </w:pPr>
-      <w:proofErr w:type="spellStart"/>
-      <w:r>
-        <w:rPr>
-          <w:color w:val="000000"/>
-        </w:rPr>
-        <w:t>Backup</w:t>
-      </w:r>
-      <w:proofErr w:type="spellEnd"/>
-      <w:r>
-        <w:rPr>
-          <w:color w:val="000000"/>
-        </w:rPr>
-        <w:t xml:space="preserve"> automático del directorio de datos de </w:t>
+      <w:r>
+        <w:rPr>
+          <w:color w:val="000000"/>
+        </w:rPr>
+        <w:t xml:space="preserve">Backup automático del directorio de datos de </w:t>
       </w:r>
       <w:proofErr w:type="spellStart"/>
       <w:r>
@@ -1545,19 +1521,11 @@
         </w:pBdr>
         <w:spacing w:after="0"/>
       </w:pPr>
-      <w:proofErr w:type="spellStart"/>
-      <w:r>
-        <w:rPr>
-          <w:color w:val="000000"/>
-        </w:rPr>
-        <w:t>Backup</w:t>
-      </w:r>
-      <w:proofErr w:type="spellEnd"/>
-      <w:r>
-        <w:rPr>
-          <w:color w:val="000000"/>
-        </w:rPr>
-        <w:t xml:space="preserve"> automático de la base de datos.</w:t>
+      <w:r>
+        <w:rPr>
+          <w:color w:val="000000"/>
+        </w:rPr>
+        <w:t>Backup automático de la base de datos.</w:t>
       </w:r>
     </w:p>
     <w:p>
@@ -2232,7 +2200,6 @@
         <w:br/>
       </w:r>
       <w:r>
-        <w:lastRenderedPageBreak/>
         <w:br/>
       </w:r>
     </w:p>
@@ -2270,7 +2237,7 @@
                     <pic:cNvPicPr preferRelativeResize="0"/>
                   </pic:nvPicPr>
                   <pic:blipFill>
-                    <a:blip r:embed="rId8"/>
+                    <a:blip r:embed="rId6"/>
                     <a:srcRect/>
                     <a:stretch>
                       <a:fillRect/>
@@ -4403,7 +4370,6 @@
           </w:tcPr>
           <w:p>
             <w:r>
-              <w:lastRenderedPageBreak/>
               <w:t xml:space="preserve">Instalación y acceso a </w:t>
             </w:r>
             <w:proofErr w:type="spellStart"/>
@@ -5012,7 +4978,6 @@
         <w:spacing w:after="0"/>
       </w:pPr>
       <w:r>
-        <w:lastRenderedPageBreak/>
         <w:t>Instalación del complemento.</w:t>
       </w:r>
     </w:p>
@@ -5289,7 +5254,7 @@
         <w:spacing w:after="0"/>
       </w:pPr>
       <w:r>
-        <w:t>El sistema dispone de configuración básica de red y almacenamiento funcional.</w:t>
+        <w:t>El sistema dispone de configuración básica de red funcional.</w:t>
       </w:r>
     </w:p>
     <w:p>
@@ -5330,7 +5295,23 @@
         <w:spacing w:after="0"/>
       </w:pPr>
       <w:r>
-        <w:t>Los volúmenes necesarios para contenedores están preparados.</w:t>
+        <w:t xml:space="preserve">Se ha realizado una comparación técnica entre Docker </w:t>
+      </w:r>
+      <w:proofErr w:type="spellStart"/>
+      <w:r>
+        <w:t>Compose</w:t>
+      </w:r>
+      <w:proofErr w:type="spellEnd"/>
+      <w:r>
+        <w:t xml:space="preserve"> y </w:t>
+      </w:r>
+      <w:proofErr w:type="spellStart"/>
+      <w:r>
+        <w:t>Portainer</w:t>
+      </w:r>
+      <w:proofErr w:type="spellEnd"/>
+      <w:r>
+        <w:t>.</w:t>
       </w:r>
     </w:p>
     <w:p>
@@ -5342,22 +5323,695 @@
         <w:spacing w:after="0"/>
       </w:pPr>
       <w:r>
-        <w:t xml:space="preserve">Se ha realizado una comparación técnica entre Docker </w:t>
+        <w:t xml:space="preserve">Se ha justificado y documentado la elección final de </w:t>
       </w:r>
       <w:proofErr w:type="spellStart"/>
       <w:r>
-        <w:t>Compose</w:t>
+        <w:t>Portainer</w:t>
       </w:r>
       <w:proofErr w:type="spellEnd"/>
       <w:r>
-        <w:t xml:space="preserve"> y </w:t>
+        <w:t>.</w:t>
+      </w:r>
+    </w:p>
+    <w:p>
+      <w:pPr>
+        <w:numPr>
+          <w:ilvl w:val="0"/>
+          <w:numId w:val="3"/>
+        </w:numPr>
+        <w:spacing w:after="0"/>
+      </w:pPr>
+      <w:r>
+        <w:t>El repositorio GitHub está creado y estructurado correctamente.</w:t>
+      </w:r>
+    </w:p>
+    <w:p>
+      <w:pPr>
+        <w:numPr>
+          <w:ilvl w:val="0"/>
+          <w:numId w:val="3"/>
+        </w:numPr>
+        <w:spacing w:after="0"/>
+      </w:pPr>
+      <w:r>
+        <w:t>Toda la documentación del sprint está subida a GitHub.</w:t>
+      </w:r>
+    </w:p>
+    <w:p>
+      <w:pPr>
+        <w:numPr>
+          <w:ilvl w:val="0"/>
+          <w:numId w:val="3"/>
+        </w:numPr>
+        <w:spacing w:after="240"/>
+      </w:pPr>
+      <w:r>
+        <w:t>Las tareas del sprint están reflejadas y cerradas en Trello.</w:t>
+      </w:r>
+    </w:p>
+    <w:p>
+      <w:pPr>
+        <w:spacing w:before="240" w:after="240"/>
+      </w:pPr>
+      <w:r>
+        <w:t xml:space="preserve">Si cualquiera de estos puntos no se cumple, el sprint se considera </w:t>
+      </w:r>
+      <w:r>
+        <w:rPr>
+          <w:b/>
+          <w:bCs/>
+        </w:rPr>
+        <w:t>incompleto</w:t>
+      </w:r>
+      <w:r>
+        <w:t>.</w:t>
+      </w:r>
+    </w:p>
+    <w:p>
+      <w:pPr>
+        <w:rPr>
+          <w:lang w:val="es-ES"/>
+        </w:rPr>
+      </w:pPr>
+    </w:p>
+    <w:p>
+      <w:pPr>
+        <w:rPr>
+          <w:b/>
+          <w:bCs/>
+          <w:lang w:val="es-ES"/>
+        </w:rPr>
+      </w:pPr>
+      <w:r>
+        <w:rPr>
+          <w:b/>
+          <w:bCs/>
+          <w:lang w:val="es-ES"/>
+        </w:rPr>
+        <w:t>Seguimiento del Sprint 2</w:t>
+      </w:r>
+    </w:p>
+    <w:p>
+      <w:pPr>
+        <w:rPr>
+          <w:b/>
+          <w:bCs/>
+          <w:lang w:val="es-ES"/>
+        </w:rPr>
+      </w:pPr>
+      <w:r>
+        <w:rPr>
+          <w:b/>
+          <w:bCs/>
+          <w:lang w:val="es-ES"/>
+        </w:rPr>
+        <w:t>Registro de problemas encontrados y cómo se han resuelto</w:t>
+      </w:r>
+    </w:p>
+    <w:p>
+      <w:pPr>
+        <w:rPr>
+          <w:lang w:val="es-ES"/>
+        </w:rPr>
+      </w:pPr>
+      <w:r>
+        <w:rPr>
+          <w:lang w:val="es-ES"/>
+        </w:rPr>
+        <w:t>En general, el segundo sprint ha tenido un desarrollo positivo. Aunque no se han obtenido resultados perfectos, se ha logrado avanzar de forma significativa en el proyecto. A lo largo del sprint han surgido algunos problemas técnicos que han retrasado ciertas tareas, pero todos ellos han sido gestionados y resueltos correctamente.</w:t>
+      </w:r>
+    </w:p>
+    <w:p>
+      <w:pPr>
+        <w:rPr>
+          <w:lang w:val="es-ES"/>
+        </w:rPr>
+      </w:pPr>
+      <w:r>
+        <w:rPr>
+          <w:lang w:val="es-ES"/>
+        </w:rPr>
+        <w:t xml:space="preserve">Uno de los principales problemas encontrados fue la </w:t>
+      </w:r>
+      <w:r>
+        <w:rPr>
+          <w:b/>
+          <w:bCs/>
+          <w:lang w:val="es-ES"/>
+        </w:rPr>
+        <w:t>pérdida de la contraseña del usuario administrador del servidor</w:t>
+      </w:r>
+      <w:r>
+        <w:rPr>
+          <w:lang w:val="es-ES"/>
+        </w:rPr>
+        <w:t>, lo que impidió el acceso al sistema durante un periodo de tiempo. Para solucionarlo, se realizaron los procedimientos necesarios de recuperación de credenciales, lo que permitió volver a acceder al servidor y continuar con el trabajo.</w:t>
+      </w:r>
+    </w:p>
+    <w:p>
+      <w:pPr>
+        <w:rPr>
+          <w:lang w:val="es-ES"/>
+        </w:rPr>
+      </w:pPr>
+      <w:r>
+        <w:rPr>
+          <w:lang w:val="es-ES"/>
+        </w:rPr>
+        <w:t xml:space="preserve">Otro problema relevante fue que la </w:t>
+      </w:r>
+      <w:r>
+        <w:rPr>
+          <w:b/>
+          <w:bCs/>
+          <w:lang w:val="es-ES"/>
+        </w:rPr>
+        <w:t>imagen ISO del sistema operativo</w:t>
+      </w:r>
+      <w:r>
+        <w:rPr>
+          <w:lang w:val="es-ES"/>
+        </w:rPr>
+        <w:t xml:space="preserve"> que se estaba utilizando para la instalación se encontraba </w:t>
+      </w:r>
+      <w:r>
+        <w:rPr>
+          <w:b/>
+          <w:bCs/>
+          <w:lang w:val="es-ES"/>
+        </w:rPr>
+        <w:t>corrompida</w:t>
+      </w:r>
+      <w:r>
+        <w:rPr>
+          <w:lang w:val="es-ES"/>
+        </w:rPr>
+        <w:t>, provocando errores durante el proceso de instalación. Este inconveniente se resolvió descargando nuevamente la ISO desde una fuente fiable y verificando su integridad antes de volver a iniciar la instalación.</w:t>
+      </w:r>
+    </w:p>
+    <w:p>
+      <w:pPr>
+        <w:rPr>
+          <w:b/>
+          <w:bCs/>
+          <w:lang w:val="es-ES"/>
+        </w:rPr>
+      </w:pPr>
+      <w:r>
+        <w:rPr>
+          <w:b/>
+          <w:bCs/>
+          <w:lang w:val="es-ES"/>
+        </w:rPr>
+        <w:t>Avance real vs avance planificado</w:t>
+      </w:r>
+    </w:p>
+    <w:p>
+      <w:pPr>
+        <w:rPr>
+          <w:lang w:val="es-ES"/>
+        </w:rPr>
+      </w:pPr>
+      <w:r>
+        <w:rPr>
+          <w:lang w:val="es-ES"/>
+        </w:rPr>
+        <w:t xml:space="preserve">Durante este sprint se ha conseguido completar la </w:t>
+      </w:r>
+      <w:r>
+        <w:rPr>
+          <w:b/>
+          <w:bCs/>
+          <w:lang w:val="es-ES"/>
+        </w:rPr>
+        <w:t>gran mayoría de las tareas planificadas</w:t>
+      </w:r>
+      <w:r>
+        <w:rPr>
+          <w:lang w:val="es-ES"/>
+        </w:rPr>
+        <w:t>. Las tareas que no se han podido finalizar no han sido debido a una mala gestión del tiempo, sino principalmente a los problemas técnicos surgidos durante el proceso de instalación y configuración del sistema, que han requerido más tiempo del previsto para su resolución.</w:t>
+      </w:r>
+    </w:p>
+    <w:p>
+      <w:pPr>
+        <w:rPr>
+          <w:lang w:val="es-ES"/>
+        </w:rPr>
+      </w:pPr>
+    </w:p>
+    <w:p>
+      <w:pPr>
+        <w:rPr>
+          <w:b/>
+          <w:bCs/>
+          <w:lang w:val="es-ES"/>
+        </w:rPr>
+      </w:pPr>
+      <w:r>
+        <w:rPr>
+          <w:b/>
+          <w:bCs/>
+          <w:lang w:val="es-ES"/>
+        </w:rPr>
+        <w:t>Revisión y retrospectiva</w:t>
+      </w:r>
+    </w:p>
+    <w:p>
+      <w:pPr>
+        <w:rPr>
+          <w:b/>
+          <w:bCs/>
+          <w:lang w:val="es-ES"/>
+        </w:rPr>
+      </w:pPr>
+      <w:r>
+        <w:rPr>
+          <w:b/>
+          <w:bCs/>
+          <w:lang w:val="es-ES"/>
+        </w:rPr>
+        <w:t>Qué se ha conseguido</w:t>
+      </w:r>
+    </w:p>
+    <w:p>
+      <w:pPr>
+        <w:rPr>
+          <w:lang w:val="es-ES"/>
+        </w:rPr>
+      </w:pPr>
+      <w:r>
+        <w:rPr>
+          <w:lang w:val="es-ES"/>
+        </w:rPr>
+        <w:t>A pesar de las dificultades encontradas, durante este sprint se han alcanzado logros importantes para el proyecto:</w:t>
+      </w:r>
+    </w:p>
+    <w:p>
+      <w:pPr>
+        <w:numPr>
+          <w:ilvl w:val="0"/>
+          <w:numId w:val="20"/>
+        </w:numPr>
+        <w:rPr>
+          <w:lang w:val="es-ES"/>
+        </w:rPr>
+      </w:pPr>
+      <w:r>
+        <w:rPr>
+          <w:lang w:val="es-ES"/>
+        </w:rPr>
+        <w:t xml:space="preserve">Se ha conseguido </w:t>
+      </w:r>
+      <w:r>
+        <w:rPr>
+          <w:b/>
+          <w:bCs/>
+          <w:lang w:val="es-ES"/>
+        </w:rPr>
+        <w:t>instalar definitivamente el sistema operativo</w:t>
+      </w:r>
+      <w:r>
+        <w:rPr>
+          <w:lang w:val="es-ES"/>
+        </w:rPr>
+        <w:t xml:space="preserve"> en el servidor tras varios intentos, estableciendo este sistema como la versión final que se utilizará en el proyecto, sin necesidad de futuras reinstalaciones.</w:t>
+      </w:r>
+    </w:p>
+    <w:p>
+      <w:pPr>
+        <w:numPr>
+          <w:ilvl w:val="0"/>
+          <w:numId w:val="20"/>
+        </w:numPr>
+        <w:rPr>
+          <w:lang w:val="es-ES"/>
+        </w:rPr>
+      </w:pPr>
+      <w:r>
+        <w:rPr>
+          <w:lang w:val="es-ES"/>
+        </w:rPr>
+        <w:t xml:space="preserve">Se han realizado todas las </w:t>
+      </w:r>
+      <w:r>
+        <w:rPr>
+          <w:b/>
+          <w:bCs/>
+          <w:lang w:val="es-ES"/>
+        </w:rPr>
+        <w:t>configuraciones iniciales del sistema</w:t>
+      </w:r>
+      <w:r>
+        <w:rPr>
+          <w:lang w:val="es-ES"/>
+        </w:rPr>
+        <w:t>, incluyendo la configuración de red y otros parámetros básicos necesarios para su correcto funcionamiento.</w:t>
+      </w:r>
+    </w:p>
+    <w:p>
+      <w:pPr>
+        <w:numPr>
+          <w:ilvl w:val="0"/>
+          <w:numId w:val="20"/>
+        </w:numPr>
+        <w:rPr>
+          <w:lang w:val="es-ES"/>
+        </w:rPr>
+      </w:pPr>
+      <w:r>
+        <w:rPr>
+          <w:lang w:val="es-ES"/>
+        </w:rPr>
+        <w:t xml:space="preserve">Se ha creado el </w:t>
+      </w:r>
+      <w:r>
+        <w:rPr>
+          <w:b/>
+          <w:bCs/>
+          <w:lang w:val="es-ES"/>
+        </w:rPr>
+        <w:t>repositorio de GitHub</w:t>
+      </w:r>
+      <w:r>
+        <w:rPr>
+          <w:lang w:val="es-ES"/>
+        </w:rPr>
+        <w:t xml:space="preserve"> del proyecto, estableciendo un sistema de control de versiones para el código y la documentación.</w:t>
+      </w:r>
+    </w:p>
+    <w:p>
+      <w:pPr>
+        <w:numPr>
+          <w:ilvl w:val="0"/>
+          <w:numId w:val="20"/>
+        </w:numPr>
+        <w:rPr>
+          <w:lang w:val="es-ES"/>
+        </w:rPr>
+      </w:pPr>
+      <w:r>
+        <w:rPr>
+          <w:lang w:val="es-ES"/>
+        </w:rPr>
+        <w:t xml:space="preserve">Se ha continuado con la </w:t>
+      </w:r>
+      <w:r>
+        <w:rPr>
+          <w:b/>
+          <w:bCs/>
+          <w:lang w:val="es-ES"/>
+        </w:rPr>
+        <w:t>gestión y seguimiento de tareas mediante Trello</w:t>
+      </w:r>
+      <w:r>
+        <w:rPr>
+          <w:lang w:val="es-ES"/>
+        </w:rPr>
+        <w:t>, manteniendo el proyecto organizado.</w:t>
+      </w:r>
+    </w:p>
+    <w:p>
+      <w:pPr>
+        <w:numPr>
+          <w:ilvl w:val="0"/>
+          <w:numId w:val="20"/>
+        </w:numPr>
+        <w:rPr>
+          <w:lang w:val="es-ES"/>
+        </w:rPr>
+      </w:pPr>
+      <w:r>
+        <w:rPr>
+          <w:lang w:val="es-ES"/>
+        </w:rPr>
+        <w:t xml:space="preserve">Se ha logrado </w:t>
+      </w:r>
+      <w:r>
+        <w:rPr>
+          <w:b/>
+          <w:bCs/>
+          <w:lang w:val="es-ES"/>
+        </w:rPr>
+        <w:t>instalar Docker en el servidor</w:t>
+      </w:r>
+      <w:r>
+        <w:rPr>
+          <w:lang w:val="es-ES"/>
+        </w:rPr>
+        <w:t xml:space="preserve">, así como </w:t>
       </w:r>
       <w:proofErr w:type="spellStart"/>
       <w:r>
+        <w:rPr>
+          <w:b/>
+          <w:bCs/>
+          <w:lang w:val="es-ES"/>
+        </w:rPr>
+        <w:t>OpenMediaVault</w:t>
+      </w:r>
+      <w:proofErr w:type="spellEnd"/>
+      <w:r>
+        <w:rPr>
+          <w:b/>
+          <w:bCs/>
+          <w:lang w:val="es-ES"/>
+        </w:rPr>
+        <w:t xml:space="preserve"> Extras</w:t>
+      </w:r>
+      <w:r>
+        <w:rPr>
+          <w:lang w:val="es-ES"/>
+        </w:rPr>
+        <w:t>, un complemento necesario para ampliar las funcionalidades del sistema y permitir el correcto funcionamiento de los servicios.</w:t>
+      </w:r>
+    </w:p>
+    <w:p>
+      <w:pPr>
+        <w:numPr>
+          <w:ilvl w:val="0"/>
+          <w:numId w:val="20"/>
+        </w:numPr>
+        <w:rPr>
+          <w:lang w:val="es-ES"/>
+        </w:rPr>
+      </w:pPr>
+      <w:r>
+        <w:rPr>
+          <w:lang w:val="es-ES"/>
+        </w:rPr>
+        <w:t xml:space="preserve">Aunque no se ha podido instalar </w:t>
+      </w:r>
+      <w:proofErr w:type="spellStart"/>
+      <w:r>
+        <w:rPr>
+          <w:lang w:val="es-ES"/>
+        </w:rPr>
         <w:t>Portainer</w:t>
       </w:r>
       <w:proofErr w:type="spellEnd"/>
       <w:r>
+        <w:rPr>
+          <w:lang w:val="es-ES"/>
+        </w:rPr>
+        <w:t xml:space="preserve">, se ha elaborado una </w:t>
+      </w:r>
+      <w:r>
+        <w:rPr>
+          <w:b/>
+          <w:bCs/>
+          <w:lang w:val="es-ES"/>
+        </w:rPr>
+        <w:t>documentación completa</w:t>
+      </w:r>
+      <w:r>
+        <w:rPr>
+          <w:lang w:val="es-ES"/>
+        </w:rPr>
+        <w:t xml:space="preserve"> sobre qué es </w:t>
+      </w:r>
+      <w:proofErr w:type="spellStart"/>
+      <w:r>
+        <w:rPr>
+          <w:lang w:val="es-ES"/>
+        </w:rPr>
+        <w:t>Portainer</w:t>
+      </w:r>
+      <w:proofErr w:type="spellEnd"/>
+      <w:r>
+        <w:rPr>
+          <w:lang w:val="es-ES"/>
+        </w:rPr>
+        <w:t xml:space="preserve">, su funcionamiento y una </w:t>
+      </w:r>
+      <w:r>
+        <w:rPr>
+          <w:b/>
+          <w:bCs/>
+          <w:lang w:val="es-ES"/>
+        </w:rPr>
+        <w:t>comparativa entre Docker y otras soluciones</w:t>
+      </w:r>
+      <w:r>
+        <w:rPr>
+          <w:lang w:val="es-ES"/>
+        </w:rPr>
+        <w:t>, lo que facilitará su futura implementación.</w:t>
+      </w:r>
+    </w:p>
+    <w:p>
+      <w:pPr>
+        <w:numPr>
+          <w:ilvl w:val="0"/>
+          <w:numId w:val="20"/>
+        </w:numPr>
+        <w:rPr>
+          <w:lang w:val="es-ES"/>
+        </w:rPr>
+      </w:pPr>
+      <w:r>
+        <w:rPr>
+          <w:lang w:val="es-ES"/>
+        </w:rPr>
+        <w:t xml:space="preserve">Este sprint ha tenido un fuerte enfoque en la </w:t>
+      </w:r>
+      <w:r>
+        <w:rPr>
+          <w:b/>
+          <w:bCs/>
+          <w:lang w:val="es-ES"/>
+        </w:rPr>
+        <w:t>investigación y elaboración de documentación</w:t>
+      </w:r>
+      <w:r>
+        <w:rPr>
+          <w:lang w:val="es-ES"/>
+        </w:rPr>
+        <w:t>, analizando paso a paso cómo realizar cada una de las tareas técnicas.</w:t>
+      </w:r>
+    </w:p>
+    <w:p>
+      <w:pPr>
+        <w:numPr>
+          <w:ilvl w:val="0"/>
+          <w:numId w:val="20"/>
+        </w:numPr>
+        <w:rPr>
+          <w:lang w:val="es-ES"/>
+        </w:rPr>
+      </w:pPr>
+      <w:r>
+        <w:rPr>
+          <w:lang w:val="es-ES"/>
+        </w:rPr>
+        <w:t xml:space="preserve">Se ha desarrollado la </w:t>
+      </w:r>
+      <w:r>
+        <w:rPr>
+          <w:b/>
+          <w:bCs/>
+          <w:lang w:val="es-ES"/>
+        </w:rPr>
+        <w:t>documentación sobre la planificación de la división de los discos duros</w:t>
+      </w:r>
+      <w:r>
+        <w:rPr>
+          <w:lang w:val="es-ES"/>
+        </w:rPr>
+        <w:t>, definiendo cómo se gestionará el almacenamiento y el sistema de copias de seguridad (</w:t>
+      </w:r>
+      <w:proofErr w:type="spellStart"/>
+      <w:r>
+        <w:rPr>
+          <w:lang w:val="es-ES"/>
+        </w:rPr>
+        <w:t>backups</w:t>
+      </w:r>
+      <w:proofErr w:type="spellEnd"/>
+      <w:r>
+        <w:rPr>
+          <w:lang w:val="es-ES"/>
+        </w:rPr>
+        <w:t>).</w:t>
+      </w:r>
+    </w:p>
+    <w:p>
+      <w:pPr>
+        <w:rPr>
+          <w:b/>
+          <w:bCs/>
+          <w:lang w:val="es-ES"/>
+        </w:rPr>
+      </w:pPr>
+      <w:r>
+        <w:rPr>
+          <w:b/>
+          <w:bCs/>
+          <w:lang w:val="es-ES"/>
+        </w:rPr>
+        <w:t>Qué no se ha podido hacer y por qué</w:t>
+      </w:r>
+    </w:p>
+    <w:p>
+      <w:pPr>
+        <w:rPr>
+          <w:lang w:val="es-ES"/>
+        </w:rPr>
+      </w:pPr>
+      <w:r>
+        <w:rPr>
+          <w:lang w:val="es-ES"/>
+        </w:rPr>
+        <w:t>Las tareas que no se han podido completar durante este sprint son:</w:t>
+      </w:r>
+    </w:p>
+    <w:p>
+      <w:pPr>
+        <w:numPr>
+          <w:ilvl w:val="0"/>
+          <w:numId w:val="21"/>
+        </w:numPr>
+        <w:rPr>
+          <w:lang w:val="es-ES"/>
+        </w:rPr>
+      </w:pPr>
+      <w:r>
+        <w:rPr>
+          <w:lang w:val="es-ES"/>
+        </w:rPr>
+        <w:t xml:space="preserve">La </w:t>
+      </w:r>
+      <w:r>
+        <w:rPr>
+          <w:b/>
+          <w:bCs/>
+          <w:lang w:val="es-ES"/>
+        </w:rPr>
+        <w:t xml:space="preserve">instalación de </w:t>
+      </w:r>
+      <w:proofErr w:type="spellStart"/>
+      <w:r>
+        <w:rPr>
+          <w:b/>
+          <w:bCs/>
+          <w:lang w:val="es-ES"/>
+        </w:rPr>
+        <w:t>Portainer</w:t>
+      </w:r>
+      <w:proofErr w:type="spellEnd"/>
+      <w:r>
+        <w:rPr>
+          <w:b/>
+          <w:bCs/>
+          <w:lang w:val="es-ES"/>
+        </w:rPr>
+        <w:t xml:space="preserve"> en el servidor</w:t>
+      </w:r>
+      <w:r>
+        <w:rPr>
+          <w:lang w:val="es-ES"/>
+        </w:rPr>
         <w:t>.</w:t>
       </w:r>
     </w:p>
@@ -5365,163 +6019,59 @@
       <w:pPr>
         <w:numPr>
           <w:ilvl w:val="0"/>
-          <w:numId w:val="3"/>
-        </w:numPr>
-        <w:spacing w:after="0"/>
-      </w:pPr>
-      <w:r>
-        <w:t xml:space="preserve">Se ha justificado y documentado la elección final de </w:t>
+          <w:numId w:val="21"/>
+        </w:numPr>
+        <w:rPr>
+          <w:lang w:val="es-ES"/>
+        </w:rPr>
+      </w:pPr>
+      <w:r>
+        <w:rPr>
+          <w:lang w:val="es-ES"/>
+        </w:rPr>
+        <w:t xml:space="preserve">La </w:t>
+      </w:r>
+      <w:r>
+        <w:rPr>
+          <w:b/>
+          <w:bCs/>
+          <w:lang w:val="es-ES"/>
+        </w:rPr>
+        <w:t>configuración definitiva de los discos duros</w:t>
+      </w:r>
+      <w:r>
+        <w:rPr>
+          <w:lang w:val="es-ES"/>
+        </w:rPr>
+        <w:t xml:space="preserve"> para almacenamiento y </w:t>
       </w:r>
       <w:proofErr w:type="spellStart"/>
       <w:r>
-        <w:t>Portainer</w:t>
+        <w:rPr>
+          <w:lang w:val="es-ES"/>
+        </w:rPr>
+        <w:t>backups</w:t>
       </w:r>
       <w:proofErr w:type="spellEnd"/>
       <w:r>
+        <w:rPr>
+          <w:lang w:val="es-ES"/>
+        </w:rPr>
         <w:t>.</w:t>
       </w:r>
     </w:p>
     <w:p>
       <w:pPr>
-        <w:numPr>
-          <w:ilvl w:val="0"/>
-          <w:numId w:val="3"/>
-        </w:numPr>
-        <w:spacing w:after="0"/>
-      </w:pPr>
-      <w:r>
-        <w:t>El repositorio GitHub está creado y estructurado correctamente.</w:t>
-      </w:r>
-    </w:p>
-    <w:p>
-      <w:pPr>
-        <w:numPr>
-          <w:ilvl w:val="0"/>
-          <w:numId w:val="3"/>
-        </w:numPr>
-        <w:spacing w:after="0"/>
-      </w:pPr>
-      <w:r>
-        <w:t>Toda la documentación del sprint está subida a GitHub.</w:t>
-      </w:r>
-    </w:p>
-    <w:p>
-      <w:pPr>
-        <w:numPr>
-          <w:ilvl w:val="0"/>
-          <w:numId w:val="3"/>
-        </w:numPr>
-        <w:spacing w:after="240"/>
-      </w:pPr>
-      <w:r>
-        <w:t>Las tareas del sprint están reflejadas y cerradas en Trello.</w:t>
-      </w:r>
-    </w:p>
-    <w:p>
-      <w:pPr>
-        <w:spacing w:before="240" w:after="240"/>
-      </w:pPr>
-      <w:r>
-        <w:t xml:space="preserve">Si cualquiera de estos puntos no se cumple, el sprint se considera </w:t>
-      </w:r>
-      <w:r>
-        <w:rPr>
-          <w:b/>
-          <w:bCs/>
-        </w:rPr>
-        <w:t>incompleto</w:t>
-      </w:r>
-      <w:r>
-        <w:t>.</w:t>
-      </w:r>
-    </w:p>
-    <w:p>
-      <w:pPr>
-        <w:spacing w:before="240" w:after="240"/>
-      </w:pPr>
-    </w:p>
-    <w:p>
-      <w:pPr>
-        <w:pBdr>
-          <w:top w:val="nil"/>
-          <w:left w:val="nil"/>
-          <w:bottom w:val="nil"/>
-          <w:right w:val="nil"/>
-          <w:between w:val="nil"/>
-        </w:pBdr>
-      </w:pPr>
-    </w:p>
-    <w:p>
-      <w:r>
-        <w:t>Seguimiento</w:t>
-      </w:r>
-    </w:p>
-    <w:p>
-      <w:pPr>
-        <w:ind w:firstLine="720"/>
-      </w:pPr>
-      <w:r>
-        <w:lastRenderedPageBreak/>
-        <w:t>o Breve registro de problemas encontrados y cómo se han</w:t>
-      </w:r>
-    </w:p>
-    <w:p>
-      <w:r>
-        <w:t>resuelto.</w:t>
-      </w:r>
-    </w:p>
-    <w:p>
-      <w:pPr>
-        <w:ind w:firstLine="720"/>
-      </w:pPr>
-      <w:r>
-        <w:t>o Avance real vs planificado.</w:t>
-      </w:r>
-    </w:p>
-    <w:p>
-      <w:proofErr w:type="spellStart"/>
-      <w:r>
-        <w:t>Revisió</w:t>
-      </w:r>
-      <w:proofErr w:type="spellEnd"/>
-      <w:r>
-        <w:t xml:space="preserve"> i retrospectiva</w:t>
-      </w:r>
-    </w:p>
-    <w:p>
-      <w:pPr>
-        <w:ind w:firstLine="720"/>
-      </w:pPr>
-      <w:r>
-        <w:t>o Qué se ha conseguido.</w:t>
-      </w:r>
-    </w:p>
-    <w:p>
-      <w:pPr>
-        <w:ind w:firstLine="720"/>
-      </w:pPr>
-      <w:r>
-        <w:t>o Qué no se ha podido hacer y por qué.</w:t>
-      </w:r>
-    </w:p>
-    <w:p>
-      <w:pPr>
-        <w:ind w:firstLine="720"/>
-      </w:pPr>
-      <w:r>
-        <w:t>o Qué se puede mejorar en el siguiente sprint.</w:t>
-      </w:r>
-    </w:p>
-    <w:p>
-      <w:pPr>
-        <w:pBdr>
-          <w:top w:val="nil"/>
-          <w:left w:val="nil"/>
-          <w:bottom w:val="nil"/>
-          <w:right w:val="nil"/>
-          <w:between w:val="nil"/>
-        </w:pBdr>
-      </w:pPr>
+        <w:rPr>
+          <w:lang w:val="es-ES"/>
+        </w:rPr>
+      </w:pPr>
+      <w:r>
+        <w:rPr>
+          <w:lang w:val="es-ES"/>
+        </w:rPr>
+        <w:t>Estas tareas no se han podido realizar debido al tiempo adicional invertido en la resolución de problemas técnicos durante la instalación y configuración del sistema operativo, por lo que se han pospuesto para el siguiente sprint.</w:t>
+      </w:r>
     </w:p>
     <w:p>
       <w:pPr>
@@ -5703,6 +6253,23 @@
     </w:p>
     <w:p>
       <w:pPr>
+        <w:numPr>
+          <w:ilvl w:val="0"/>
+          <w:numId w:val="3"/>
+        </w:numPr>
+        <w:spacing w:after="0"/>
+      </w:pPr>
+      <w:r>
+        <w:t>Los volúmenes necesarios para contenedores están preparados.</w:t>
+      </w:r>
+    </w:p>
+    <w:p>
+      <w:pPr>
+        <w:ind w:left="720"/>
+      </w:pPr>
+    </w:p>
+    <w:p>
+      <w:pPr>
         <w:ind w:firstLine="708"/>
         <w:rPr>
           <w:b/>
@@ -5880,7 +6447,6 @@
         </w:numPr>
       </w:pPr>
       <w:r>
-        <w:lastRenderedPageBreak/>
         <w:t>Ajustes y resolución de incidencias.</w:t>
       </w:r>
     </w:p>
@@ -6394,7 +6960,6 @@
         <w:rPr>
           <w:color w:val="000000"/>
         </w:rPr>
-        <w:lastRenderedPageBreak/>
         <w:t>Estado inicial (pendiente, en curso, hecho).</w:t>
       </w:r>
     </w:p>
@@ -6705,7 +7270,7 @@
 </file>
 
 <file path=word/numbering.xml><?xml version="1.0" encoding="utf-8"?>
-<w:numbering xmlns:wpc="http://schemas.microsoft.com/office/word/2010/wordprocessingCanvas" xmlns:cx="http://schemas.microsoft.com/office/drawing/2014/chartex" xmlns:cx1="http://schemas.microsoft.com/office/drawing/2015/9/8/chartex" xmlns:cx2="http://schemas.microsoft.com/office/drawing/2015/10/21/chartex" xmlns:cx3="http://schemas.microsoft.com/office/drawing/2016/5/9/chartex" xmlns:cx4="http://schemas.microsoft.com/office/drawing/2016/5/10/chartex" xmlns:cx5="http://schemas.microsoft.com/office/drawing/2016/5/11/chartex" xmlns:cx6="http://schemas.microsoft.com/office/drawing/2016/5/12/chartex" xmlns:cx7="http://schemas.microsoft.com/office/drawing/2016/5/13/chartex" xmlns:cx8="http://schemas.microsoft.com/office/drawing/2016/5/14/chartex" xmlns:mc="http://schemas.openxmlformats.org/markup-compatibility/2006" xmlns:aink="http://schemas.microsoft.com/office/drawing/2016/ink" xmlns:am3d="http://schemas.microsoft.com/office/drawing/2017/model3d" xmlns:o="urn:schemas-microsoft-com:office:office" xmlns:oel="http://schemas.microsoft.com/office/2019/extlst" xmlns:r="http://schemas.openxmlformats.org/officeDocument/2006/relationships" xmlns:m="http://schemas.openxmlformats.org/officeDocument/2006/math" xmlns:v="urn:schemas-microsoft-com:vml" xmlns:wp14="http://schemas.microsoft.com/office/word/2010/wordprocessingDrawing" xmlns:wp="http://schemas.openxmlformats.org/drawingml/2006/wordprocessingDrawing" xmlns:w10="urn:schemas-microsoft-com:office:word" xmlns:w="http://schemas.openxmlformats.org/wordprocessingml/2006/main" xmlns:w14="http://schemas.microsoft.com/office/word/2010/wordml" xmlns:w15="http://schemas.microsoft.com/office/word/2012/wordml" xmlns:w16cex="http://schemas.microsoft.com/office/word/2018/wordml/cex" xmlns:w16cid="http://schemas.microsoft.com/office/word/2016/wordml/cid" xmlns:w16="http://schemas.microsoft.com/office/word/2018/wordml" xmlns:w16sdtdh="http://schemas.microsoft.com/office/word/2020/wordml/sdtdatahash" xmlns:w16se="http://schemas.microsoft.com/office/word/2015/wordml/symex" xmlns:wpg="http://schemas.microsoft.com/office/word/2010/wordprocessingGroup" xmlns:wpi="http://schemas.microsoft.com/office/word/2010/wordprocessingInk" xmlns:wne="http://schemas.microsoft.com/office/word/2006/wordml" xmlns:wps="http://schemas.microsoft.com/office/word/2010/wordprocessingShape" mc:Ignorable="w14 w15 w16se w16cid w16 w16cex w16sdtdh wp14">
+<w:numbering xmlns:wpc="http://schemas.microsoft.com/office/word/2010/wordprocessingCanvas" xmlns:cx="http://schemas.microsoft.com/office/drawing/2014/chartex" xmlns:cx1="http://schemas.microsoft.com/office/drawing/2015/9/8/chartex" xmlns:cx2="http://schemas.microsoft.com/office/drawing/2015/10/21/chartex" xmlns:cx3="http://schemas.microsoft.com/office/drawing/2016/5/9/chartex" xmlns:cx4="http://schemas.microsoft.com/office/drawing/2016/5/10/chartex" xmlns:cx5="http://schemas.microsoft.com/office/drawing/2016/5/11/chartex" xmlns:cx6="http://schemas.microsoft.com/office/drawing/2016/5/12/chartex" xmlns:cx7="http://schemas.microsoft.com/office/drawing/2016/5/13/chartex" xmlns:cx8="http://schemas.microsoft.com/office/drawing/2016/5/14/chartex" xmlns:mc="http://schemas.openxmlformats.org/markup-compatibility/2006" xmlns:aink="http://schemas.microsoft.com/office/drawing/2016/ink" xmlns:am3d="http://schemas.microsoft.com/office/drawing/2017/model3d" xmlns:o="urn:schemas-microsoft-com:office:office" xmlns:oel="http://schemas.microsoft.com/office/2019/extlst" xmlns:r="http://schemas.openxmlformats.org/officeDocument/2006/relationships" xmlns:m="http://schemas.openxmlformats.org/officeDocument/2006/math" xmlns:v="urn:schemas-microsoft-com:vml" xmlns:wp14="http://schemas.microsoft.com/office/word/2010/wordprocessingDrawing" xmlns:wp="http://schemas.openxmlformats.org/drawingml/2006/wordprocessingDrawing" xmlns:w10="urn:schemas-microsoft-com:office:word" xmlns:w="http://schemas.openxmlformats.org/wordprocessingml/2006/main" xmlns:w14="http://schemas.microsoft.com/office/word/2010/wordml" xmlns:w15="http://schemas.microsoft.com/office/word/2012/wordml" xmlns:w16cex="http://schemas.microsoft.com/office/word/2018/wordml/cex" xmlns:w16cid="http://schemas.microsoft.com/office/word/2016/wordml/cid" xmlns:w16="http://schemas.microsoft.com/office/word/2018/wordml" xmlns:w16du="http://schemas.microsoft.com/office/word/2023/wordml/word16du" xmlns:w16sdtdh="http://schemas.microsoft.com/office/word/2020/wordml/sdtdatahash" xmlns:w16sdtfl="http://schemas.microsoft.com/office/word/2024/wordml/sdtformatlock" xmlns:w16se="http://schemas.microsoft.com/office/word/2015/wordml/symex" xmlns:wpg="http://schemas.microsoft.com/office/word/2010/wordprocessingGroup" xmlns:wpi="http://schemas.microsoft.com/office/word/2010/wordprocessingInk" xmlns:wne="http://schemas.microsoft.com/office/word/2006/wordml" xmlns:wps="http://schemas.microsoft.com/office/word/2010/wordprocessingShape" mc:Ignorable="w14 w15 w16se w16cid w16 w16cex w16sdtdh w16sdtfl w16du wp14">
   <w:abstractNum w:abstractNumId="0" w15:restartNumberingAfterBreak="0">
     <w:nsid w:val="083100F3"/>
     <w:multiLevelType w:val="multilevel"/>
@@ -6820,6 +7385,155 @@
     </w:lvl>
   </w:abstractNum>
   <w:abstractNum w:abstractNumId="1" w15:restartNumberingAfterBreak="0">
+    <w:nsid w:val="09912A25"/>
+    <w:multiLevelType w:val="multilevel"/>
+    <w:tmpl w:val="31864C88"/>
+    <w:lvl w:ilvl="0">
+      <w:start w:val="1"/>
+      <w:numFmt w:val="bullet"/>
+      <w:lvlText w:val=""/>
+      <w:lvlJc w:val="left"/>
+      <w:pPr>
+        <w:tabs>
+          <w:tab w:val="num" w:pos="720"/>
+        </w:tabs>
+        <w:ind w:left="720" w:hanging="360"/>
+      </w:pPr>
+      <w:rPr>
+        <w:rFonts w:ascii="Symbol" w:hAnsi="Symbol" w:hint="default"/>
+        <w:sz w:val="20"/>
+      </w:rPr>
+    </w:lvl>
+    <w:lvl w:ilvl="1" w:tentative="1">
+      <w:start w:val="1"/>
+      <w:numFmt w:val="bullet"/>
+      <w:lvlText w:val="o"/>
+      <w:lvlJc w:val="left"/>
+      <w:pPr>
+        <w:tabs>
+          <w:tab w:val="num" w:pos="1440"/>
+        </w:tabs>
+        <w:ind w:left="1440" w:hanging="360"/>
+      </w:pPr>
+      <w:rPr>
+        <w:rFonts w:ascii="Courier New" w:hAnsi="Courier New" w:hint="default"/>
+        <w:sz w:val="20"/>
+      </w:rPr>
+    </w:lvl>
+    <w:lvl w:ilvl="2" w:tentative="1">
+      <w:start w:val="1"/>
+      <w:numFmt w:val="bullet"/>
+      <w:lvlText w:val=""/>
+      <w:lvlJc w:val="left"/>
+      <w:pPr>
+        <w:tabs>
+          <w:tab w:val="num" w:pos="2160"/>
+        </w:tabs>
+        <w:ind w:left="2160" w:hanging="360"/>
+      </w:pPr>
+      <w:rPr>
+        <w:rFonts w:ascii="Wingdings" w:hAnsi="Wingdings" w:hint="default"/>
+        <w:sz w:val="20"/>
+      </w:rPr>
+    </w:lvl>
+    <w:lvl w:ilvl="3" w:tentative="1">
+      <w:start w:val="1"/>
+      <w:numFmt w:val="bullet"/>
+      <w:lvlText w:val=""/>
+      <w:lvlJc w:val="left"/>
+      <w:pPr>
+        <w:tabs>
+          <w:tab w:val="num" w:pos="2880"/>
+        </w:tabs>
+        <w:ind w:left="2880" w:hanging="360"/>
+      </w:pPr>
+      <w:rPr>
+        <w:rFonts w:ascii="Wingdings" w:hAnsi="Wingdings" w:hint="default"/>
+        <w:sz w:val="20"/>
+      </w:rPr>
+    </w:lvl>
+    <w:lvl w:ilvl="4" w:tentative="1">
+      <w:start w:val="1"/>
+      <w:numFmt w:val="bullet"/>
+      <w:lvlText w:val=""/>
+      <w:lvlJc w:val="left"/>
+      <w:pPr>
+        <w:tabs>
+          <w:tab w:val="num" w:pos="3600"/>
+        </w:tabs>
+        <w:ind w:left="3600" w:hanging="360"/>
+      </w:pPr>
+      <w:rPr>
+        <w:rFonts w:ascii="Wingdings" w:hAnsi="Wingdings" w:hint="default"/>
+        <w:sz w:val="20"/>
+      </w:rPr>
+    </w:lvl>
+    <w:lvl w:ilvl="5" w:tentative="1">
+      <w:start w:val="1"/>
+      <w:numFmt w:val="bullet"/>
+      <w:lvlText w:val=""/>
+      <w:lvlJc w:val="left"/>
+      <w:pPr>
+        <w:tabs>
+          <w:tab w:val="num" w:pos="4320"/>
+        </w:tabs>
+        <w:ind w:left="4320" w:hanging="360"/>
+      </w:pPr>
+      <w:rPr>
+        <w:rFonts w:ascii="Wingdings" w:hAnsi="Wingdings" w:hint="default"/>
+        <w:sz w:val="20"/>
+      </w:rPr>
+    </w:lvl>
+    <w:lvl w:ilvl="6" w:tentative="1">
+      <w:start w:val="1"/>
+      <w:numFmt w:val="bullet"/>
+      <w:lvlText w:val=""/>
+      <w:lvlJc w:val="left"/>
+      <w:pPr>
+        <w:tabs>
+          <w:tab w:val="num" w:pos="5040"/>
+        </w:tabs>
+        <w:ind w:left="5040" w:hanging="360"/>
+      </w:pPr>
+      <w:rPr>
+        <w:rFonts w:ascii="Wingdings" w:hAnsi="Wingdings" w:hint="default"/>
+        <w:sz w:val="20"/>
+      </w:rPr>
+    </w:lvl>
+    <w:lvl w:ilvl="7" w:tentative="1">
+      <w:start w:val="1"/>
+      <w:numFmt w:val="bullet"/>
+      <w:lvlText w:val=""/>
+      <w:lvlJc w:val="left"/>
+      <w:pPr>
+        <w:tabs>
+          <w:tab w:val="num" w:pos="5760"/>
+        </w:tabs>
+        <w:ind w:left="5760" w:hanging="360"/>
+      </w:pPr>
+      <w:rPr>
+        <w:rFonts w:ascii="Wingdings" w:hAnsi="Wingdings" w:hint="default"/>
+        <w:sz w:val="20"/>
+      </w:rPr>
+    </w:lvl>
+    <w:lvl w:ilvl="8" w:tentative="1">
+      <w:start w:val="1"/>
+      <w:numFmt w:val="bullet"/>
+      <w:lvlText w:val=""/>
+      <w:lvlJc w:val="left"/>
+      <w:pPr>
+        <w:tabs>
+          <w:tab w:val="num" w:pos="6480"/>
+        </w:tabs>
+        <w:ind w:left="6480" w:hanging="360"/>
+      </w:pPr>
+      <w:rPr>
+        <w:rFonts w:ascii="Wingdings" w:hAnsi="Wingdings" w:hint="default"/>
+        <w:sz w:val="20"/>
+      </w:rPr>
+    </w:lvl>
+  </w:abstractNum>
+  <w:abstractNum w:abstractNumId="2" w15:restartNumberingAfterBreak="0">
     <w:nsid w:val="0D616419"/>
     <w:multiLevelType w:val="multilevel"/>
     <w:tmpl w:val="9AA658EE"/>
@@ -6932,7 +7646,7 @@
       </w:rPr>
     </w:lvl>
   </w:abstractNum>
-  <w:abstractNum w:abstractNumId="2" w15:restartNumberingAfterBreak="0">
+  <w:abstractNum w:abstractNumId="3" w15:restartNumberingAfterBreak="0">
     <w:nsid w:val="148E33FA"/>
     <w:multiLevelType w:val="multilevel"/>
     <w:tmpl w:val="6594487A"/>
@@ -7063,7 +7777,7 @@
       </w:rPr>
     </w:lvl>
   </w:abstractNum>
-  <w:abstractNum w:abstractNumId="3" w15:restartNumberingAfterBreak="0">
+  <w:abstractNum w:abstractNumId="4" w15:restartNumberingAfterBreak="0">
     <w:nsid w:val="14900BDC"/>
     <w:multiLevelType w:val="multilevel"/>
     <w:tmpl w:val="4D2AD7DE"/>
@@ -7194,7 +7908,7 @@
       </w:rPr>
     </w:lvl>
   </w:abstractNum>
-  <w:abstractNum w:abstractNumId="4" w15:restartNumberingAfterBreak="0">
+  <w:abstractNum w:abstractNumId="5" w15:restartNumberingAfterBreak="0">
     <w:nsid w:val="15DF46DF"/>
     <w:multiLevelType w:val="multilevel"/>
     <w:tmpl w:val="3E7EBBCC"/>
@@ -7307,7 +8021,156 @@
       </w:rPr>
     </w:lvl>
   </w:abstractNum>
-  <w:abstractNum w:abstractNumId="5" w15:restartNumberingAfterBreak="0">
+  <w:abstractNum w:abstractNumId="6" w15:restartNumberingAfterBreak="0">
+    <w:nsid w:val="186C0DBB"/>
+    <w:multiLevelType w:val="multilevel"/>
+    <w:tmpl w:val="EC74B558"/>
+    <w:lvl w:ilvl="0">
+      <w:start w:val="1"/>
+      <w:numFmt w:val="bullet"/>
+      <w:lvlText w:val=""/>
+      <w:lvlJc w:val="left"/>
+      <w:pPr>
+        <w:tabs>
+          <w:tab w:val="num" w:pos="720"/>
+        </w:tabs>
+        <w:ind w:left="720" w:hanging="360"/>
+      </w:pPr>
+      <w:rPr>
+        <w:rFonts w:ascii="Symbol" w:hAnsi="Symbol" w:hint="default"/>
+        <w:sz w:val="20"/>
+      </w:rPr>
+    </w:lvl>
+    <w:lvl w:ilvl="1" w:tentative="1">
+      <w:start w:val="1"/>
+      <w:numFmt w:val="bullet"/>
+      <w:lvlText w:val="o"/>
+      <w:lvlJc w:val="left"/>
+      <w:pPr>
+        <w:tabs>
+          <w:tab w:val="num" w:pos="1440"/>
+        </w:tabs>
+        <w:ind w:left="1440" w:hanging="360"/>
+      </w:pPr>
+      <w:rPr>
+        <w:rFonts w:ascii="Courier New" w:hAnsi="Courier New" w:hint="default"/>
+        <w:sz w:val="20"/>
+      </w:rPr>
+    </w:lvl>
+    <w:lvl w:ilvl="2" w:tentative="1">
+      <w:start w:val="1"/>
+      <w:numFmt w:val="bullet"/>
+      <w:lvlText w:val=""/>
+      <w:lvlJc w:val="left"/>
+      <w:pPr>
+        <w:tabs>
+          <w:tab w:val="num" w:pos="2160"/>
+        </w:tabs>
+        <w:ind w:left="2160" w:hanging="360"/>
+      </w:pPr>
+      <w:rPr>
+        <w:rFonts w:ascii="Wingdings" w:hAnsi="Wingdings" w:hint="default"/>
+        <w:sz w:val="20"/>
+      </w:rPr>
+    </w:lvl>
+    <w:lvl w:ilvl="3" w:tentative="1">
+      <w:start w:val="1"/>
+      <w:numFmt w:val="bullet"/>
+      <w:lvlText w:val=""/>
+      <w:lvlJc w:val="left"/>
+      <w:pPr>
+        <w:tabs>
+          <w:tab w:val="num" w:pos="2880"/>
+        </w:tabs>
+        <w:ind w:left="2880" w:hanging="360"/>
+      </w:pPr>
+      <w:rPr>
+        <w:rFonts w:ascii="Wingdings" w:hAnsi="Wingdings" w:hint="default"/>
+        <w:sz w:val="20"/>
+      </w:rPr>
+    </w:lvl>
+    <w:lvl w:ilvl="4" w:tentative="1">
+      <w:start w:val="1"/>
+      <w:numFmt w:val="bullet"/>
+      <w:lvlText w:val=""/>
+      <w:lvlJc w:val="left"/>
+      <w:pPr>
+        <w:tabs>
+          <w:tab w:val="num" w:pos="3600"/>
+        </w:tabs>
+        <w:ind w:left="3600" w:hanging="360"/>
+      </w:pPr>
+      <w:rPr>
+        <w:rFonts w:ascii="Wingdings" w:hAnsi="Wingdings" w:hint="default"/>
+        <w:sz w:val="20"/>
+      </w:rPr>
+    </w:lvl>
+    <w:lvl w:ilvl="5" w:tentative="1">
+      <w:start w:val="1"/>
+      <w:numFmt w:val="bullet"/>
+      <w:lvlText w:val=""/>
+      <w:lvlJc w:val="left"/>
+      <w:pPr>
+        <w:tabs>
+          <w:tab w:val="num" w:pos="4320"/>
+        </w:tabs>
+        <w:ind w:left="4320" w:hanging="360"/>
+      </w:pPr>
+      <w:rPr>
+        <w:rFonts w:ascii="Wingdings" w:hAnsi="Wingdings" w:hint="default"/>
+        <w:sz w:val="20"/>
+      </w:rPr>
+    </w:lvl>
+    <w:lvl w:ilvl="6" w:tentative="1">
+      <w:start w:val="1"/>
+      <w:numFmt w:val="bullet"/>
+      <w:lvlText w:val=""/>
+      <w:lvlJc w:val="left"/>
+      <w:pPr>
+        <w:tabs>
+          <w:tab w:val="num" w:pos="5040"/>
+        </w:tabs>
+        <w:ind w:left="5040" w:hanging="360"/>
+      </w:pPr>
+      <w:rPr>
+        <w:rFonts w:ascii="Wingdings" w:hAnsi="Wingdings" w:hint="default"/>
+        <w:sz w:val="20"/>
+      </w:rPr>
+    </w:lvl>
+    <w:lvl w:ilvl="7" w:tentative="1">
+      <w:start w:val="1"/>
+      <w:numFmt w:val="bullet"/>
+      <w:lvlText w:val=""/>
+      <w:lvlJc w:val="left"/>
+      <w:pPr>
+        <w:tabs>
+          <w:tab w:val="num" w:pos="5760"/>
+        </w:tabs>
+        <w:ind w:left="5760" w:hanging="360"/>
+      </w:pPr>
+      <w:rPr>
+        <w:rFonts w:ascii="Wingdings" w:hAnsi="Wingdings" w:hint="default"/>
+        <w:sz w:val="20"/>
+      </w:rPr>
+    </w:lvl>
+    <w:lvl w:ilvl="8" w:tentative="1">
+      <w:start w:val="1"/>
+      <w:numFmt w:val="bullet"/>
+      <w:lvlText w:val=""/>
+      <w:lvlJc w:val="left"/>
+      <w:pPr>
+        <w:tabs>
+          <w:tab w:val="num" w:pos="6480"/>
+        </w:tabs>
+        <w:ind w:left="6480" w:hanging="360"/>
+      </w:pPr>
+      <w:rPr>
+        <w:rFonts w:ascii="Wingdings" w:hAnsi="Wingdings" w:hint="default"/>
+        <w:sz w:val="20"/>
+      </w:rPr>
+    </w:lvl>
+  </w:abstractNum>
+  <w:abstractNum w:abstractNumId="7" w15:restartNumberingAfterBreak="0">
     <w:nsid w:val="22566F3B"/>
     <w:multiLevelType w:val="multilevel"/>
     <w:tmpl w:val="F9EEA7D0"/>
@@ -7420,7 +8283,7 @@
       </w:rPr>
     </w:lvl>
   </w:abstractNum>
-  <w:abstractNum w:abstractNumId="6" w15:restartNumberingAfterBreak="0">
+  <w:abstractNum w:abstractNumId="8" w15:restartNumberingAfterBreak="0">
     <w:nsid w:val="28770B1C"/>
     <w:multiLevelType w:val="multilevel"/>
     <w:tmpl w:val="9FFCF7C6"/>
@@ -7533,7 +8396,7 @@
       </w:rPr>
     </w:lvl>
   </w:abstractNum>
-  <w:abstractNum w:abstractNumId="7" w15:restartNumberingAfterBreak="0">
+  <w:abstractNum w:abstractNumId="9" w15:restartNumberingAfterBreak="0">
     <w:nsid w:val="31DB6C07"/>
     <w:multiLevelType w:val="multilevel"/>
     <w:tmpl w:val="4022D8E8"/>
@@ -7646,7 +8509,7 @@
       </w:rPr>
     </w:lvl>
   </w:abstractNum>
-  <w:abstractNum w:abstractNumId="8" w15:restartNumberingAfterBreak="0">
+  <w:abstractNum w:abstractNumId="10" w15:restartNumberingAfterBreak="0">
     <w:nsid w:val="35B804E3"/>
     <w:multiLevelType w:val="multilevel"/>
     <w:tmpl w:val="2ABA785A"/>
@@ -7777,7 +8640,7 @@
       </w:rPr>
     </w:lvl>
   </w:abstractNum>
-  <w:abstractNum w:abstractNumId="9" w15:restartNumberingAfterBreak="0">
+  <w:abstractNum w:abstractNumId="11" w15:restartNumberingAfterBreak="0">
     <w:nsid w:val="379347EF"/>
     <w:multiLevelType w:val="multilevel"/>
     <w:tmpl w:val="9B6AD1F8"/>
@@ -7890,7 +8753,7 @@
       </w:rPr>
     </w:lvl>
   </w:abstractNum>
-  <w:abstractNum w:abstractNumId="10" w15:restartNumberingAfterBreak="0">
+  <w:abstractNum w:abstractNumId="12" w15:restartNumberingAfterBreak="0">
     <w:nsid w:val="3B9F77CD"/>
     <w:multiLevelType w:val="multilevel"/>
     <w:tmpl w:val="8FC2AD88"/>
@@ -8003,7 +8866,7 @@
       </w:rPr>
     </w:lvl>
   </w:abstractNum>
-  <w:abstractNum w:abstractNumId="11" w15:restartNumberingAfterBreak="0">
+  <w:abstractNum w:abstractNumId="13" w15:restartNumberingAfterBreak="0">
     <w:nsid w:val="3BD0604D"/>
     <w:multiLevelType w:val="multilevel"/>
     <w:tmpl w:val="733A136E"/>
@@ -8116,7 +8979,156 @@
       </w:rPr>
     </w:lvl>
   </w:abstractNum>
-  <w:abstractNum w:abstractNumId="12" w15:restartNumberingAfterBreak="0">
+  <w:abstractNum w:abstractNumId="14" w15:restartNumberingAfterBreak="0">
+    <w:nsid w:val="3F1B2745"/>
+    <w:multiLevelType w:val="multilevel"/>
+    <w:tmpl w:val="835615F6"/>
+    <w:lvl w:ilvl="0">
+      <w:start w:val="1"/>
+      <w:numFmt w:val="bullet"/>
+      <w:lvlText w:val=""/>
+      <w:lvlJc w:val="left"/>
+      <w:pPr>
+        <w:tabs>
+          <w:tab w:val="num" w:pos="720"/>
+        </w:tabs>
+        <w:ind w:left="720" w:hanging="360"/>
+      </w:pPr>
+      <w:rPr>
+        <w:rFonts w:ascii="Symbol" w:hAnsi="Symbol" w:hint="default"/>
+        <w:sz w:val="20"/>
+      </w:rPr>
+    </w:lvl>
+    <w:lvl w:ilvl="1" w:tentative="1">
+      <w:start w:val="1"/>
+      <w:numFmt w:val="bullet"/>
+      <w:lvlText w:val="o"/>
+      <w:lvlJc w:val="left"/>
+      <w:pPr>
+        <w:tabs>
+          <w:tab w:val="num" w:pos="1440"/>
+        </w:tabs>
+        <w:ind w:left="1440" w:hanging="360"/>
+      </w:pPr>
+      <w:rPr>
+        <w:rFonts w:ascii="Courier New" w:hAnsi="Courier New" w:hint="default"/>
+        <w:sz w:val="20"/>
+      </w:rPr>
+    </w:lvl>
+    <w:lvl w:ilvl="2" w:tentative="1">
+      <w:start w:val="1"/>
+      <w:numFmt w:val="bullet"/>
+      <w:lvlText w:val=""/>
+      <w:lvlJc w:val="left"/>
+      <w:pPr>
+        <w:tabs>
+          <w:tab w:val="num" w:pos="2160"/>
+        </w:tabs>
+        <w:ind w:left="2160" w:hanging="360"/>
+      </w:pPr>
+      <w:rPr>
+        <w:rFonts w:ascii="Wingdings" w:hAnsi="Wingdings" w:hint="default"/>
+        <w:sz w:val="20"/>
+      </w:rPr>
+    </w:lvl>
+    <w:lvl w:ilvl="3" w:tentative="1">
+      <w:start w:val="1"/>
+      <w:numFmt w:val="bullet"/>
+      <w:lvlText w:val=""/>
+      <w:lvlJc w:val="left"/>
+      <w:pPr>
+        <w:tabs>
+          <w:tab w:val="num" w:pos="2880"/>
+        </w:tabs>
+        <w:ind w:left="2880" w:hanging="360"/>
+      </w:pPr>
+      <w:rPr>
+        <w:rFonts w:ascii="Wingdings" w:hAnsi="Wingdings" w:hint="default"/>
+        <w:sz w:val="20"/>
+      </w:rPr>
+    </w:lvl>
+    <w:lvl w:ilvl="4" w:tentative="1">
+      <w:start w:val="1"/>
+      <w:numFmt w:val="bullet"/>
+      <w:lvlText w:val=""/>
+      <w:lvlJc w:val="left"/>
+      <w:pPr>
+        <w:tabs>
+          <w:tab w:val="num" w:pos="3600"/>
+        </w:tabs>
+        <w:ind w:left="3600" w:hanging="360"/>
+      </w:pPr>
+      <w:rPr>
+        <w:rFonts w:ascii="Wingdings" w:hAnsi="Wingdings" w:hint="default"/>
+        <w:sz w:val="20"/>
+      </w:rPr>
+    </w:lvl>
+    <w:lvl w:ilvl="5" w:tentative="1">
+      <w:start w:val="1"/>
+      <w:numFmt w:val="bullet"/>
+      <w:lvlText w:val=""/>
+      <w:lvlJc w:val="left"/>
+      <w:pPr>
+        <w:tabs>
+          <w:tab w:val="num" w:pos="4320"/>
+        </w:tabs>
+        <w:ind w:left="4320" w:hanging="360"/>
+      </w:pPr>
+      <w:rPr>
+        <w:rFonts w:ascii="Wingdings" w:hAnsi="Wingdings" w:hint="default"/>
+        <w:sz w:val="20"/>
+      </w:rPr>
+    </w:lvl>
+    <w:lvl w:ilvl="6" w:tentative="1">
+      <w:start w:val="1"/>
+      <w:numFmt w:val="bullet"/>
+      <w:lvlText w:val=""/>
+      <w:lvlJc w:val="left"/>
+      <w:pPr>
+        <w:tabs>
+          <w:tab w:val="num" w:pos="5040"/>
+        </w:tabs>
+        <w:ind w:left="5040" w:hanging="360"/>
+      </w:pPr>
+      <w:rPr>
+        <w:rFonts w:ascii="Wingdings" w:hAnsi="Wingdings" w:hint="default"/>
+        <w:sz w:val="20"/>
+      </w:rPr>
+    </w:lvl>
+    <w:lvl w:ilvl="7" w:tentative="1">
+      <w:start w:val="1"/>
+      <w:numFmt w:val="bullet"/>
+      <w:lvlText w:val=""/>
+      <w:lvlJc w:val="left"/>
+      <w:pPr>
+        <w:tabs>
+          <w:tab w:val="num" w:pos="5760"/>
+        </w:tabs>
+        <w:ind w:left="5760" w:hanging="360"/>
+      </w:pPr>
+      <w:rPr>
+        <w:rFonts w:ascii="Wingdings" w:hAnsi="Wingdings" w:hint="default"/>
+        <w:sz w:val="20"/>
+      </w:rPr>
+    </w:lvl>
+    <w:lvl w:ilvl="8" w:tentative="1">
+      <w:start w:val="1"/>
+      <w:numFmt w:val="bullet"/>
+      <w:lvlText w:val=""/>
+      <w:lvlJc w:val="left"/>
+      <w:pPr>
+        <w:tabs>
+          <w:tab w:val="num" w:pos="6480"/>
+        </w:tabs>
+        <w:ind w:left="6480" w:hanging="360"/>
+      </w:pPr>
+      <w:rPr>
+        <w:rFonts w:ascii="Wingdings" w:hAnsi="Wingdings" w:hint="default"/>
+        <w:sz w:val="20"/>
+      </w:rPr>
+    </w:lvl>
+  </w:abstractNum>
+  <w:abstractNum w:abstractNumId="15" w15:restartNumberingAfterBreak="0">
     <w:nsid w:val="48D679A7"/>
     <w:multiLevelType w:val="multilevel"/>
     <w:tmpl w:val="A7AE4A52"/>
@@ -8229,7 +9241,7 @@
       </w:rPr>
     </w:lvl>
   </w:abstractNum>
-  <w:abstractNum w:abstractNumId="13" w15:restartNumberingAfterBreak="0">
+  <w:abstractNum w:abstractNumId="16" w15:restartNumberingAfterBreak="0">
     <w:nsid w:val="51184C7D"/>
     <w:multiLevelType w:val="multilevel"/>
     <w:tmpl w:val="2EBADDEC"/>
@@ -8342,7 +9354,7 @@
       </w:rPr>
     </w:lvl>
   </w:abstractNum>
-  <w:abstractNum w:abstractNumId="14" w15:restartNumberingAfterBreak="0">
+  <w:abstractNum w:abstractNumId="17" w15:restartNumberingAfterBreak="0">
     <w:nsid w:val="5EC44E02"/>
     <w:multiLevelType w:val="multilevel"/>
     <w:tmpl w:val="ACE6A026"/>
@@ -8455,7 +9467,7 @@
       </w:rPr>
     </w:lvl>
   </w:abstractNum>
-  <w:abstractNum w:abstractNumId="15" w15:restartNumberingAfterBreak="0">
+  <w:abstractNum w:abstractNumId="18" w15:restartNumberingAfterBreak="0">
     <w:nsid w:val="686F2BDE"/>
     <w:multiLevelType w:val="multilevel"/>
     <w:tmpl w:val="62B099A0"/>
@@ -8586,7 +9598,7 @@
       </w:rPr>
     </w:lvl>
   </w:abstractNum>
-  <w:abstractNum w:abstractNumId="16" w15:restartNumberingAfterBreak="0">
+  <w:abstractNum w:abstractNumId="19" w15:restartNumberingAfterBreak="0">
     <w:nsid w:val="76C8261E"/>
     <w:multiLevelType w:val="multilevel"/>
     <w:tmpl w:val="F0B264EA"/>
@@ -8699,7 +9711,7 @@
       </w:rPr>
     </w:lvl>
   </w:abstractNum>
-  <w:abstractNum w:abstractNumId="17" w15:restartNumberingAfterBreak="0">
+  <w:abstractNum w:abstractNumId="20" w15:restartNumberingAfterBreak="0">
     <w:nsid w:val="781056F9"/>
     <w:multiLevelType w:val="multilevel"/>
     <w:tmpl w:val="9CB69BA2"/>
@@ -8812,7 +9824,7 @@
       </w:rPr>
     </w:lvl>
   </w:abstractNum>
-  <w:abstractNum w:abstractNumId="18" w15:restartNumberingAfterBreak="0">
+  <w:abstractNum w:abstractNumId="21" w15:restartNumberingAfterBreak="0">
     <w:nsid w:val="7B3E58D7"/>
     <w:multiLevelType w:val="multilevel"/>
     <w:tmpl w:val="EB7C7A20"/>
@@ -8926,67 +9938,76 @@
     </w:lvl>
   </w:abstractNum>
   <w:num w:numId="1" w16cid:durableId="2099210577">
-    <w:abstractNumId w:val="13"/>
+    <w:abstractNumId w:val="16"/>
   </w:num>
   <w:num w:numId="2" w16cid:durableId="472020705">
+    <w:abstractNumId w:val="5"/>
+  </w:num>
+  <w:num w:numId="3" w16cid:durableId="394160495">
+    <w:abstractNumId w:val="15"/>
+  </w:num>
+  <w:num w:numId="4" w16cid:durableId="423458319">
+    <w:abstractNumId w:val="7"/>
+  </w:num>
+  <w:num w:numId="5" w16cid:durableId="776414118">
+    <w:abstractNumId w:val="2"/>
+  </w:num>
+  <w:num w:numId="6" w16cid:durableId="1497568884">
+    <w:abstractNumId w:val="12"/>
+  </w:num>
+  <w:num w:numId="7" w16cid:durableId="660934613">
+    <w:abstractNumId w:val="19"/>
+  </w:num>
+  <w:num w:numId="8" w16cid:durableId="948731654">
+    <w:abstractNumId w:val="8"/>
+  </w:num>
+  <w:num w:numId="9" w16cid:durableId="1644432204">
+    <w:abstractNumId w:val="21"/>
+  </w:num>
+  <w:num w:numId="10" w16cid:durableId="1603028983">
+    <w:abstractNumId w:val="20"/>
+  </w:num>
+  <w:num w:numId="11" w16cid:durableId="1459496242">
+    <w:abstractNumId w:val="18"/>
+  </w:num>
+  <w:num w:numId="12" w16cid:durableId="30231920">
+    <w:abstractNumId w:val="10"/>
+  </w:num>
+  <w:num w:numId="13" w16cid:durableId="1854109799">
+    <w:abstractNumId w:val="9"/>
+  </w:num>
+  <w:num w:numId="14" w16cid:durableId="279730683">
     <w:abstractNumId w:val="4"/>
   </w:num>
-  <w:num w:numId="3" w16cid:durableId="394160495">
-    <w:abstractNumId w:val="12"/>
-  </w:num>
-  <w:num w:numId="4" w16cid:durableId="423458319">
-    <w:abstractNumId w:val="5"/>
-  </w:num>
-  <w:num w:numId="5" w16cid:durableId="776414118">
-    <w:abstractNumId w:val="1"/>
-  </w:num>
-  <w:num w:numId="6" w16cid:durableId="1497568884">
-    <w:abstractNumId w:val="10"/>
-  </w:num>
-  <w:num w:numId="7" w16cid:durableId="660934613">
-    <w:abstractNumId w:val="16"/>
-  </w:num>
-  <w:num w:numId="8" w16cid:durableId="948731654">
-    <w:abstractNumId w:val="6"/>
-  </w:num>
-  <w:num w:numId="9" w16cid:durableId="1644432204">
-    <w:abstractNumId w:val="18"/>
-  </w:num>
-  <w:num w:numId="10" w16cid:durableId="1603028983">
+  <w:num w:numId="15" w16cid:durableId="1883666493">
     <w:abstractNumId w:val="17"/>
-  </w:num>
-  <w:num w:numId="11" w16cid:durableId="1459496242">
-    <w:abstractNumId w:val="15"/>
-  </w:num>
-  <w:num w:numId="12" w16cid:durableId="30231920">
-    <w:abstractNumId w:val="8"/>
-  </w:num>
-  <w:num w:numId="13" w16cid:durableId="1854109799">
-    <w:abstractNumId w:val="7"/>
-  </w:num>
-  <w:num w:numId="14" w16cid:durableId="279730683">
-    <w:abstractNumId w:val="3"/>
-  </w:num>
-  <w:num w:numId="15" w16cid:durableId="1883666493">
-    <w:abstractNumId w:val="14"/>
   </w:num>
   <w:num w:numId="16" w16cid:durableId="1206716669">
     <w:abstractNumId w:val="0"/>
   </w:num>
   <w:num w:numId="17" w16cid:durableId="893732478">
-    <w:abstractNumId w:val="2"/>
+    <w:abstractNumId w:val="3"/>
   </w:num>
   <w:num w:numId="18" w16cid:durableId="1846360011">
+    <w:abstractNumId w:val="13"/>
+  </w:num>
+  <w:num w:numId="19" w16cid:durableId="2082754647">
     <w:abstractNumId w:val="11"/>
   </w:num>
-  <w:num w:numId="19" w16cid:durableId="2082754647">
-    <w:abstractNumId w:val="9"/>
+  <w:num w:numId="20" w16cid:durableId="867762826">
+    <w:abstractNumId w:val="1"/>
+  </w:num>
+  <w:num w:numId="21" w16cid:durableId="799033329">
+    <w:abstractNumId w:val="6"/>
+  </w:num>
+  <w:num w:numId="22" w16cid:durableId="1957059066">
+    <w:abstractNumId w:val="14"/>
   </w:num>
 </w:numbering>
 </file>
 
 <file path=word/styles.xml><?xml version="1.0" encoding="utf-8"?>
-<w:styles xmlns:mc="http://schemas.openxmlformats.org/markup-compatibility/2006" xmlns:r="http://schemas.openxmlformats.org/officeDocument/2006/relationships" xmlns:w="http://schemas.openxmlformats.org/wordprocessingml/2006/main" xmlns:w14="http://schemas.microsoft.com/office/word/2010/wordml" xmlns:w15="http://schemas.microsoft.com/office/word/2012/wordml" xmlns:w16cex="http://schemas.microsoft.com/office/word/2018/wordml/cex" xmlns:w16cid="http://schemas.microsoft.com/office/word/2016/wordml/cid" xmlns:w16="http://schemas.microsoft.com/office/word/2018/wordml" xmlns:w16sdtdh="http://schemas.microsoft.com/office/word/2020/wordml/sdtdatahash" xmlns:w16se="http://schemas.microsoft.com/office/word/2015/wordml/symex" mc:Ignorable="w14 w15 w16se w16cid w16 w16cex w16sdtdh">
+<w:styles xmlns:mc="http://schemas.openxmlformats.org/markup-compatibility/2006" xmlns:r="http://schemas.openxmlformats.org/officeDocument/2006/relationships" xmlns:w="http://schemas.openxmlformats.org/wordprocessingml/2006/main" xmlns:w14="http://schemas.microsoft.com/office/word/2010/wordml" xmlns:w15="http://schemas.microsoft.com/office/word/2012/wordml" xmlns:w16cex="http://schemas.microsoft.com/office/word/2018/wordml/cex" xmlns:w16cid="http://schemas.microsoft.com/office/word/2016/wordml/cid" xmlns:w16="http://schemas.microsoft.com/office/word/2018/wordml" xmlns:w16du="http://schemas.microsoft.com/office/word/2023/wordml/word16du" xmlns:w16sdtdh="http://schemas.microsoft.com/office/word/2020/wordml/sdtdatahash" xmlns:w16sdtfl="http://schemas.microsoft.com/office/word/2024/wordml/sdtformatlock" xmlns:w16se="http://schemas.microsoft.com/office/word/2015/wordml/symex" mc:Ignorable="w14 w15 w16se w16cid w16 w16cex w16sdtdh w16sdtfl w16du">
   <w:docDefaults>
     <w:rPrDefault>
       <w:rPr>
@@ -9383,6 +10404,7 @@
   <w:style w:type="paragraph" w:default="1" w:styleId="Normal">
     <w:name w:val="Normal"/>
     <w:qFormat/>
+    <w:rsid w:val="00F16FBE"/>
   </w:style>
   <w:style w:type="paragraph" w:styleId="Ttulo1">
     <w:name w:val="heading 1"/>
@@ -9568,7 +10590,6 @@
   <w:style w:type="character" w:default="1" w:styleId="Fuentedeprrafopredeter">
     <w:name w:val="Default Paragraph Font"/>
     <w:uiPriority w:val="1"/>
-    <w:semiHidden/>
     <w:unhideWhenUsed/>
   </w:style>
   <w:style w:type="table" w:default="1" w:styleId="Tablanormal">

</xml_diff>

<commit_message>
agrege la previcion del sprint 3
</commit_message>
<xml_diff>
--- a/docs/General/Proyecto Final Daniel.O y Arnau.S.docx
+++ b/docs/General/Proyecto Final Daniel.O y Arnau.S.docx
@@ -6108,10 +6108,6 @@
     </w:p>
     <w:p>
       <w:pPr>
-        <w:numPr>
-          <w:ilvl w:val="0"/>
-          <w:numId w:val="6"/>
-        </w:numPr>
         <w:pBdr>
           <w:top w:val="nil"/>
           <w:left w:val="nil"/>
@@ -6120,12 +6116,13 @@
           <w:between w:val="nil"/>
         </w:pBdr>
         <w:spacing w:after="0"/>
-      </w:pPr>
-      <w:r>
-        <w:rPr>
-          <w:color w:val="000000"/>
-        </w:rPr>
-        <w:t>Nombre o número del sprint (Sprint 1, Sprint 2...).</w:t>
+        <w:ind w:left="2160"/>
+      </w:pPr>
+      <w:r>
+        <w:rPr>
+          <w:color w:val="000000"/>
+        </w:rPr>
+        <w:t>Sprint 3</w:t>
       </w:r>
     </w:p>
     <w:p>
@@ -6147,48 +6144,53 @@
         <w:rPr>
           <w:color w:val="000000"/>
         </w:rPr>
-        <w:t>Fechas de inicio y de finalización.</w:t>
-      </w:r>
-    </w:p>
-    <w:p>
-      <w:pPr>
-        <w:numPr>
-          <w:ilvl w:val="0"/>
-          <w:numId w:val="6"/>
-        </w:numPr>
-        <w:pBdr>
-          <w:top w:val="nil"/>
-          <w:left w:val="nil"/>
-          <w:bottom w:val="nil"/>
-          <w:right w:val="nil"/>
-          <w:between w:val="nil"/>
-        </w:pBdr>
-      </w:pPr>
-      <w:r>
-        <w:rPr>
-          <w:color w:val="000000"/>
-        </w:rPr>
-        <w:t>Equipo responsable.</w:t>
-      </w:r>
-    </w:p>
-    <w:p>
-      <w:pPr>
-        <w:ind w:left="720"/>
-      </w:pPr>
-      <w:r>
-        <w:rPr>
-          <w:b/>
-          <w:bCs/>
-        </w:rPr>
-        <w:t>Objetivos del sprint</w:t>
-      </w:r>
-    </w:p>
-    <w:p>
-      <w:pPr>
-        <w:numPr>
-          <w:ilvl w:val="0"/>
-          <w:numId w:val="7"/>
-        </w:numPr>
+        <w:t>Fechas de inicio y de finalización</w:t>
+      </w:r>
+      <w:r>
+        <w:rPr>
+          <w:color w:val="000000"/>
+        </w:rPr>
+        <w:t>: 2</w:t>
+      </w:r>
+      <w:r>
+        <w:rPr>
+          <w:color w:val="000000"/>
+        </w:rPr>
+        <w:t xml:space="preserve"> </w:t>
+      </w:r>
+      <w:r>
+        <w:rPr>
+          <w:color w:val="000000"/>
+        </w:rPr>
+        <w:t xml:space="preserve">- </w:t>
+      </w:r>
+      <w:r>
+        <w:rPr>
+          <w:color w:val="000000"/>
+        </w:rPr>
+        <w:t xml:space="preserve">19 </w:t>
+      </w:r>
+      <w:r>
+        <w:rPr>
+          <w:color w:val="000000"/>
+        </w:rPr>
+        <w:t xml:space="preserve">de </w:t>
+      </w:r>
+      <w:r>
+        <w:rPr>
+          <w:color w:val="000000"/>
+        </w:rPr>
+        <w:t>feb</w:t>
+      </w:r>
+      <w:r>
+        <w:rPr>
+          <w:color w:val="000000"/>
+        </w:rPr>
+        <w:t>rero</w:t>
+      </w:r>
+    </w:p>
+    <w:p>
+      <w:pPr>
         <w:pBdr>
           <w:top w:val="nil"/>
           <w:left w:val="nil"/>
@@ -6197,12 +6199,19 @@
           <w:between w:val="nil"/>
         </w:pBdr>
         <w:spacing w:after="0"/>
-      </w:pPr>
-      <w:r>
-        <w:rPr>
-          <w:color w:val="000000"/>
-        </w:rPr>
-        <w:t>Qué se quiere conseguir en este sprint.</w:t>
+        <w:ind w:left="2160"/>
+      </w:pPr>
+    </w:p>
+    <w:p>
+      <w:pPr>
+        <w:ind w:left="720"/>
+      </w:pPr>
+      <w:r>
+        <w:rPr>
+          <w:b/>
+          <w:bCs/>
+        </w:rPr>
+        <w:t>Objetivos del sprint</w:t>
       </w:r>
     </w:p>
     <w:p>
@@ -6210,89 +6219,6 @@
         <w:numPr>
           <w:ilvl w:val="0"/>
           <w:numId w:val="7"/>
-        </w:numPr>
-        <w:pBdr>
-          <w:top w:val="nil"/>
-          <w:left w:val="nil"/>
-          <w:bottom w:val="nil"/>
-          <w:right w:val="nil"/>
-          <w:between w:val="nil"/>
-        </w:pBdr>
-      </w:pPr>
-      <w:r>
-        <w:rPr>
-          <w:color w:val="000000"/>
-        </w:rPr>
-        <w:t>Deben ser concretos y alcanzables.</w:t>
-      </w:r>
-    </w:p>
-    <w:p>
-      <w:pPr>
-        <w:ind w:left="720"/>
-      </w:pPr>
-      <w:r>
-        <w:rPr>
-          <w:b/>
-          <w:bCs/>
-        </w:rPr>
-        <w:t xml:space="preserve">Tareas planificadas </w:t>
-      </w:r>
-    </w:p>
-    <w:p>
-      <w:pPr>
-        <w:ind w:left="720"/>
-      </w:pPr>
-      <w:r>
-        <w:t xml:space="preserve">Lista de tareas a </w:t>
-      </w:r>
-      <w:proofErr w:type="gramStart"/>
-      <w:r>
-        <w:t>realizar :</w:t>
-      </w:r>
-      <w:proofErr w:type="gramEnd"/>
-    </w:p>
-    <w:p>
-      <w:pPr>
-        <w:numPr>
-          <w:ilvl w:val="0"/>
-          <w:numId w:val="3"/>
-        </w:numPr>
-        <w:spacing w:after="0"/>
-      </w:pPr>
-      <w:r>
-        <w:t>Los volúmenes necesarios para contenedores están preparados.</w:t>
-      </w:r>
-    </w:p>
-    <w:p>
-      <w:pPr>
-        <w:ind w:left="720"/>
-      </w:pPr>
-    </w:p>
-    <w:p>
-      <w:pPr>
-        <w:ind w:firstLine="708"/>
-        <w:rPr>
-          <w:b/>
-          <w:bCs/>
-        </w:rPr>
-      </w:pPr>
-    </w:p>
-    <w:p>
-      <w:pPr>
-        <w:numPr>
-          <w:ilvl w:val="0"/>
-          <w:numId w:val="11"/>
-        </w:numPr>
-      </w:pPr>
-      <w:r>
-        <w:t>Instalación y configuración de servicios principales (servidores web, correo, DNS, firewall, etc. según proyecto).</w:t>
-      </w:r>
-    </w:p>
-    <w:p>
-      <w:pPr>
-        <w:numPr>
-          <w:ilvl w:val="1"/>
-          <w:numId w:val="11"/>
         </w:numPr>
         <w:pBdr>
           <w:top w:val="nil"/>
@@ -6307,47 +6233,11 @@
         <w:rPr>
           <w:color w:val="000000"/>
         </w:rPr>
-        <w:t>Responsable de cada tarea.</w:t>
-      </w:r>
-    </w:p>
-    <w:p>
-      <w:pPr>
-        <w:numPr>
-          <w:ilvl w:val="1"/>
-          <w:numId w:val="11"/>
-        </w:numPr>
-        <w:pBdr>
-          <w:top w:val="nil"/>
-          <w:left w:val="nil"/>
-          <w:bottom w:val="nil"/>
-          <w:right w:val="nil"/>
-          <w:between w:val="nil"/>
-        </w:pBdr>
-      </w:pPr>
-      <w:r>
-        <w:rPr>
-          <w:color w:val="000000"/>
-        </w:rPr>
-        <w:t>Estado inicial (pendiente, en curso, hecho).</w:t>
-      </w:r>
-    </w:p>
-    <w:p>
-      <w:pPr>
-        <w:numPr>
-          <w:ilvl w:val="0"/>
-          <w:numId w:val="11"/>
-        </w:numPr>
-      </w:pPr>
-      <w:r>
-        <w:t>Integración de los distintos componentes.</w:t>
-      </w:r>
-    </w:p>
-    <w:p>
-      <w:pPr>
-        <w:numPr>
-          <w:ilvl w:val="1"/>
-          <w:numId w:val="11"/>
-        </w:numPr>
+        <w:t>Qué se quiere conseguir en este sprint.</w:t>
+      </w:r>
+    </w:p>
+    <w:p>
+      <w:pPr>
         <w:pBdr>
           <w:top w:val="nil"/>
           <w:left w:val="nil"/>
@@ -6356,52 +6246,76 @@
           <w:between w:val="nil"/>
         </w:pBdr>
         <w:spacing w:after="0"/>
-      </w:pPr>
-      <w:r>
-        <w:rPr>
-          <w:color w:val="000000"/>
-        </w:rPr>
-        <w:t>Responsable de cada tarea.</w:t>
-      </w:r>
-    </w:p>
-    <w:p>
-      <w:pPr>
-        <w:numPr>
-          <w:ilvl w:val="1"/>
-          <w:numId w:val="11"/>
-        </w:numPr>
-        <w:pBdr>
-          <w:top w:val="nil"/>
-          <w:left w:val="nil"/>
-          <w:bottom w:val="nil"/>
-          <w:right w:val="nil"/>
-          <w:between w:val="nil"/>
-        </w:pBdr>
-      </w:pPr>
-      <w:r>
-        <w:rPr>
-          <w:color w:val="000000"/>
-        </w:rPr>
-        <w:t>Estado inicial (pendiente, en curso, hecho).</w:t>
-      </w:r>
-    </w:p>
-    <w:p>
-      <w:pPr>
-        <w:numPr>
-          <w:ilvl w:val="0"/>
-          <w:numId w:val="11"/>
-        </w:numPr>
-      </w:pPr>
-      <w:r>
-        <w:t>Pruebas de funcionamiento (ping, acceso web, transferencia de archivos, etc.).</w:t>
-      </w:r>
-    </w:p>
-    <w:p>
-      <w:pPr>
-        <w:numPr>
-          <w:ilvl w:val="1"/>
-          <w:numId w:val="11"/>
-        </w:numPr>
+        <w:ind w:left="2136"/>
+        <w:rPr>
+          <w:color w:val="000000"/>
+        </w:rPr>
+      </w:pPr>
+      <w:r>
+        <w:rPr>
+          <w:color w:val="000000"/>
+        </w:rPr>
+        <w:t xml:space="preserve">En este sprint se busca ya tener </w:t>
+      </w:r>
+      <w:proofErr w:type="spellStart"/>
+      <w:r>
+        <w:rPr>
+          <w:color w:val="000000"/>
+        </w:rPr>
+        <w:t>nextcloud</w:t>
+      </w:r>
+      <w:proofErr w:type="spellEnd"/>
+      <w:r>
+        <w:rPr>
+          <w:color w:val="000000"/>
+        </w:rPr>
+        <w:t xml:space="preserve"> desplegado en el server, para ello hay que tener OMV extras, </w:t>
+      </w:r>
+      <w:proofErr w:type="spellStart"/>
+      <w:r>
+        <w:rPr>
+          <w:color w:val="000000"/>
+        </w:rPr>
+        <w:t>portainer</w:t>
+      </w:r>
+      <w:proofErr w:type="spellEnd"/>
+      <w:r>
+        <w:rPr>
+          <w:color w:val="000000"/>
+        </w:rPr>
+        <w:t xml:space="preserve">, y </w:t>
+      </w:r>
+      <w:proofErr w:type="spellStart"/>
+      <w:r>
+        <w:rPr>
+          <w:color w:val="000000"/>
+        </w:rPr>
+        <w:t>doker</w:t>
+      </w:r>
+      <w:proofErr w:type="spellEnd"/>
+      <w:r>
+        <w:rPr>
+          <w:color w:val="000000"/>
+        </w:rPr>
+        <w:t xml:space="preserve"> </w:t>
+      </w:r>
+      <w:proofErr w:type="spellStart"/>
+      <w:r>
+        <w:rPr>
+          <w:color w:val="000000"/>
+        </w:rPr>
+        <w:t>intalados</w:t>
+      </w:r>
+      <w:proofErr w:type="spellEnd"/>
+      <w:r>
+        <w:rPr>
+          <w:color w:val="000000"/>
+        </w:rPr>
+        <w:t xml:space="preserve"> en el server OMV.</w:t>
+      </w:r>
+    </w:p>
+    <w:p>
+      <w:pPr>
         <w:pBdr>
           <w:top w:val="nil"/>
           <w:left w:val="nil"/>
@@ -6410,52 +6324,11 @@
           <w:between w:val="nil"/>
         </w:pBdr>
         <w:spacing w:after="0"/>
-      </w:pPr>
-      <w:r>
-        <w:rPr>
-          <w:color w:val="000000"/>
-        </w:rPr>
-        <w:t>Responsable de cada tarea.</w:t>
-      </w:r>
-    </w:p>
-    <w:p>
-      <w:pPr>
-        <w:numPr>
-          <w:ilvl w:val="1"/>
-          <w:numId w:val="11"/>
-        </w:numPr>
-        <w:pBdr>
-          <w:top w:val="nil"/>
-          <w:left w:val="nil"/>
-          <w:bottom w:val="nil"/>
-          <w:right w:val="nil"/>
-          <w:between w:val="nil"/>
-        </w:pBdr>
-      </w:pPr>
-      <w:r>
-        <w:rPr>
-          <w:color w:val="000000"/>
-        </w:rPr>
-        <w:t>Estado inicial (pendiente, en curso, hecho).</w:t>
-      </w:r>
-    </w:p>
-    <w:p>
-      <w:pPr>
-        <w:numPr>
-          <w:ilvl w:val="0"/>
-          <w:numId w:val="11"/>
-        </w:numPr>
-      </w:pPr>
-      <w:r>
-        <w:t>Ajustes y resolución de incidencias.</w:t>
-      </w:r>
-    </w:p>
-    <w:p>
-      <w:pPr>
-        <w:numPr>
-          <w:ilvl w:val="1"/>
-          <w:numId w:val="11"/>
-        </w:numPr>
+        <w:ind w:left="2136"/>
+      </w:pPr>
+    </w:p>
+    <w:p>
+      <w:pPr>
         <w:pBdr>
           <w:top w:val="nil"/>
           <w:left w:val="nil"/>
@@ -6465,19 +6338,9 @@
         </w:pBdr>
         <w:spacing w:after="0"/>
       </w:pPr>
-      <w:r>
-        <w:rPr>
-          <w:color w:val="000000"/>
-        </w:rPr>
-        <w:t>Responsable de cada tarea.</w:t>
-      </w:r>
-    </w:p>
-    <w:p>
-      <w:pPr>
-        <w:numPr>
-          <w:ilvl w:val="1"/>
-          <w:numId w:val="11"/>
-        </w:numPr>
+    </w:p>
+    <w:p>
+      <w:pPr>
         <w:pBdr>
           <w:top w:val="nil"/>
           <w:left w:val="nil"/>
@@ -6485,14 +6348,196 @@
           <w:right w:val="nil"/>
           <w:between w:val="nil"/>
         </w:pBdr>
-      </w:pPr>
-      <w:r>
-        <w:rPr>
-          <w:color w:val="000000"/>
-        </w:rPr>
-        <w:t>Estado inicial (pendiente, en curso, hecho).</w:t>
-      </w:r>
-    </w:p>
+        <w:spacing w:after="0"/>
+      </w:pPr>
+    </w:p>
+    <w:p>
+      <w:pPr>
+        <w:ind w:left="720"/>
+        <w:rPr>
+          <w:b/>
+          <w:bCs/>
+        </w:rPr>
+      </w:pPr>
+      <w:r>
+        <w:rPr>
+          <w:b/>
+          <w:bCs/>
+        </w:rPr>
+        <w:t xml:space="preserve">Tareas planificadas </w:t>
+      </w:r>
+    </w:p>
+    <w:p>
+      <w:pPr>
+        <w:ind w:left="720"/>
+      </w:pPr>
+      <w:r>
+        <w:t xml:space="preserve">Instalar OMV extras, </w:t>
+      </w:r>
+      <w:proofErr w:type="spellStart"/>
+      <w:r>
+        <w:t>portainer</w:t>
+      </w:r>
+      <w:proofErr w:type="spellEnd"/>
+      <w:r>
+        <w:t xml:space="preserve"> y </w:t>
+      </w:r>
+      <w:proofErr w:type="spellStart"/>
+      <w:r>
+        <w:t>doker</w:t>
+      </w:r>
+      <w:proofErr w:type="spellEnd"/>
+    </w:p>
+    <w:p>
+      <w:pPr>
+        <w:numPr>
+          <w:ilvl w:val="0"/>
+          <w:numId w:val="26"/>
+        </w:numPr>
+        <w:rPr>
+          <w:lang w:val="es-ES"/>
+        </w:rPr>
+      </w:pPr>
+      <w:r>
+        <w:rPr>
+          <w:lang w:val="es-ES"/>
+        </w:rPr>
+        <w:t>Configuración de red de contenedores</w:t>
+      </w:r>
+    </w:p>
+    <w:p>
+      <w:pPr>
+        <w:numPr>
+          <w:ilvl w:val="0"/>
+          <w:numId w:val="26"/>
+        </w:numPr>
+        <w:rPr>
+          <w:lang w:val="es-ES"/>
+        </w:rPr>
+      </w:pPr>
+      <w:r>
+        <w:rPr>
+          <w:lang w:val="es-ES"/>
+        </w:rPr>
+        <w:t>Creación de volúmenes persistentes</w:t>
+      </w:r>
+    </w:p>
+    <w:p>
+      <w:pPr>
+        <w:numPr>
+          <w:ilvl w:val="0"/>
+          <w:numId w:val="27"/>
+        </w:numPr>
+        <w:rPr>
+          <w:lang w:val="es-ES"/>
+        </w:rPr>
+      </w:pPr>
+      <w:r>
+        <w:rPr>
+          <w:lang w:val="es-ES"/>
+        </w:rPr>
+        <w:t xml:space="preserve">Despliegue de </w:t>
+      </w:r>
+      <w:proofErr w:type="spellStart"/>
+      <w:r>
+        <w:rPr>
+          <w:lang w:val="es-ES"/>
+        </w:rPr>
+        <w:t>Nextcloud</w:t>
+      </w:r>
+      <w:proofErr w:type="spellEnd"/>
+      <w:r>
+        <w:rPr>
+          <w:lang w:val="es-ES"/>
+        </w:rPr>
+        <w:t xml:space="preserve"> desde </w:t>
+      </w:r>
+      <w:proofErr w:type="spellStart"/>
+      <w:r>
+        <w:rPr>
+          <w:lang w:val="es-ES"/>
+        </w:rPr>
+        <w:t>Portainer</w:t>
+      </w:r>
+      <w:proofErr w:type="spellEnd"/>
+    </w:p>
+    <w:p>
+      <w:pPr>
+        <w:numPr>
+          <w:ilvl w:val="0"/>
+          <w:numId w:val="27"/>
+        </w:numPr>
+        <w:rPr>
+          <w:lang w:val="es-ES"/>
+        </w:rPr>
+      </w:pPr>
+      <w:r>
+        <w:rPr>
+          <w:lang w:val="es-ES"/>
+        </w:rPr>
+        <w:t xml:space="preserve">Acceso web a </w:t>
+      </w:r>
+      <w:proofErr w:type="spellStart"/>
+      <w:r>
+        <w:rPr>
+          <w:lang w:val="es-ES"/>
+        </w:rPr>
+        <w:t>Nextcloud</w:t>
+      </w:r>
+      <w:proofErr w:type="spellEnd"/>
+    </w:p>
+    <w:p>
+      <w:pPr>
+        <w:numPr>
+          <w:ilvl w:val="0"/>
+          <w:numId w:val="27"/>
+        </w:numPr>
+        <w:rPr>
+          <w:lang w:val="es-ES"/>
+        </w:rPr>
+      </w:pPr>
+      <w:r>
+        <w:rPr>
+          <w:lang w:val="es-ES"/>
+        </w:rPr>
+        <w:t>Pruebas de subida y descarga</w:t>
+      </w:r>
+    </w:p>
+    <w:p>
+      <w:pPr>
+        <w:numPr>
+          <w:ilvl w:val="0"/>
+          <w:numId w:val="28"/>
+        </w:numPr>
+        <w:rPr>
+          <w:lang w:val="es-ES"/>
+        </w:rPr>
+      </w:pPr>
+      <w:r>
+        <w:rPr>
+          <w:lang w:val="es-ES"/>
+        </w:rPr>
+        <w:t>Ajustes de configuración</w:t>
+      </w:r>
+    </w:p>
+    <w:p>
+      <w:pPr>
+        <w:numPr>
+          <w:ilvl w:val="0"/>
+          <w:numId w:val="28"/>
+        </w:numPr>
+        <w:rPr>
+          <w:lang w:val="es-ES"/>
+        </w:rPr>
+      </w:pPr>
+      <w:r>
+        <w:rPr>
+          <w:lang w:val="es-ES"/>
+        </w:rPr>
+        <w:t>Documentación técnica del despliegue</w:t>
+      </w:r>
+    </w:p>
+    <w:p/>
     <w:p>
       <w:pPr>
         <w:ind w:left="720"/>
@@ -7647,6 +7692,155 @@
     </w:lvl>
   </w:abstractNum>
   <w:abstractNum w:abstractNumId="3" w15:restartNumberingAfterBreak="0">
+    <w:nsid w:val="10A1148B"/>
+    <w:multiLevelType w:val="multilevel"/>
+    <w:tmpl w:val="BB067906"/>
+    <w:lvl w:ilvl="0">
+      <w:start w:val="1"/>
+      <w:numFmt w:val="bullet"/>
+      <w:lvlText w:val=""/>
+      <w:lvlJc w:val="left"/>
+      <w:pPr>
+        <w:tabs>
+          <w:tab w:val="num" w:pos="720"/>
+        </w:tabs>
+        <w:ind w:left="720" w:hanging="360"/>
+      </w:pPr>
+      <w:rPr>
+        <w:rFonts w:ascii="Symbol" w:hAnsi="Symbol" w:hint="default"/>
+        <w:sz w:val="20"/>
+      </w:rPr>
+    </w:lvl>
+    <w:lvl w:ilvl="1" w:tentative="1">
+      <w:start w:val="1"/>
+      <w:numFmt w:val="bullet"/>
+      <w:lvlText w:val="o"/>
+      <w:lvlJc w:val="left"/>
+      <w:pPr>
+        <w:tabs>
+          <w:tab w:val="num" w:pos="1440"/>
+        </w:tabs>
+        <w:ind w:left="1440" w:hanging="360"/>
+      </w:pPr>
+      <w:rPr>
+        <w:rFonts w:ascii="Courier New" w:hAnsi="Courier New" w:hint="default"/>
+        <w:sz w:val="20"/>
+      </w:rPr>
+    </w:lvl>
+    <w:lvl w:ilvl="2" w:tentative="1">
+      <w:start w:val="1"/>
+      <w:numFmt w:val="bullet"/>
+      <w:lvlText w:val=""/>
+      <w:lvlJc w:val="left"/>
+      <w:pPr>
+        <w:tabs>
+          <w:tab w:val="num" w:pos="2160"/>
+        </w:tabs>
+        <w:ind w:left="2160" w:hanging="360"/>
+      </w:pPr>
+      <w:rPr>
+        <w:rFonts w:ascii="Wingdings" w:hAnsi="Wingdings" w:hint="default"/>
+        <w:sz w:val="20"/>
+      </w:rPr>
+    </w:lvl>
+    <w:lvl w:ilvl="3" w:tentative="1">
+      <w:start w:val="1"/>
+      <w:numFmt w:val="bullet"/>
+      <w:lvlText w:val=""/>
+      <w:lvlJc w:val="left"/>
+      <w:pPr>
+        <w:tabs>
+          <w:tab w:val="num" w:pos="2880"/>
+        </w:tabs>
+        <w:ind w:left="2880" w:hanging="360"/>
+      </w:pPr>
+      <w:rPr>
+        <w:rFonts w:ascii="Wingdings" w:hAnsi="Wingdings" w:hint="default"/>
+        <w:sz w:val="20"/>
+      </w:rPr>
+    </w:lvl>
+    <w:lvl w:ilvl="4" w:tentative="1">
+      <w:start w:val="1"/>
+      <w:numFmt w:val="bullet"/>
+      <w:lvlText w:val=""/>
+      <w:lvlJc w:val="left"/>
+      <w:pPr>
+        <w:tabs>
+          <w:tab w:val="num" w:pos="3600"/>
+        </w:tabs>
+        <w:ind w:left="3600" w:hanging="360"/>
+      </w:pPr>
+      <w:rPr>
+        <w:rFonts w:ascii="Wingdings" w:hAnsi="Wingdings" w:hint="default"/>
+        <w:sz w:val="20"/>
+      </w:rPr>
+    </w:lvl>
+    <w:lvl w:ilvl="5" w:tentative="1">
+      <w:start w:val="1"/>
+      <w:numFmt w:val="bullet"/>
+      <w:lvlText w:val=""/>
+      <w:lvlJc w:val="left"/>
+      <w:pPr>
+        <w:tabs>
+          <w:tab w:val="num" w:pos="4320"/>
+        </w:tabs>
+        <w:ind w:left="4320" w:hanging="360"/>
+      </w:pPr>
+      <w:rPr>
+        <w:rFonts w:ascii="Wingdings" w:hAnsi="Wingdings" w:hint="default"/>
+        <w:sz w:val="20"/>
+      </w:rPr>
+    </w:lvl>
+    <w:lvl w:ilvl="6" w:tentative="1">
+      <w:start w:val="1"/>
+      <w:numFmt w:val="bullet"/>
+      <w:lvlText w:val=""/>
+      <w:lvlJc w:val="left"/>
+      <w:pPr>
+        <w:tabs>
+          <w:tab w:val="num" w:pos="5040"/>
+        </w:tabs>
+        <w:ind w:left="5040" w:hanging="360"/>
+      </w:pPr>
+      <w:rPr>
+        <w:rFonts w:ascii="Wingdings" w:hAnsi="Wingdings" w:hint="default"/>
+        <w:sz w:val="20"/>
+      </w:rPr>
+    </w:lvl>
+    <w:lvl w:ilvl="7" w:tentative="1">
+      <w:start w:val="1"/>
+      <w:numFmt w:val="bullet"/>
+      <w:lvlText w:val=""/>
+      <w:lvlJc w:val="left"/>
+      <w:pPr>
+        <w:tabs>
+          <w:tab w:val="num" w:pos="5760"/>
+        </w:tabs>
+        <w:ind w:left="5760" w:hanging="360"/>
+      </w:pPr>
+      <w:rPr>
+        <w:rFonts w:ascii="Wingdings" w:hAnsi="Wingdings" w:hint="default"/>
+        <w:sz w:val="20"/>
+      </w:rPr>
+    </w:lvl>
+    <w:lvl w:ilvl="8" w:tentative="1">
+      <w:start w:val="1"/>
+      <w:numFmt w:val="bullet"/>
+      <w:lvlText w:val=""/>
+      <w:lvlJc w:val="left"/>
+      <w:pPr>
+        <w:tabs>
+          <w:tab w:val="num" w:pos="6480"/>
+        </w:tabs>
+        <w:ind w:left="6480" w:hanging="360"/>
+      </w:pPr>
+      <w:rPr>
+        <w:rFonts w:ascii="Wingdings" w:hAnsi="Wingdings" w:hint="default"/>
+        <w:sz w:val="20"/>
+      </w:rPr>
+    </w:lvl>
+  </w:abstractNum>
+  <w:abstractNum w:abstractNumId="4" w15:restartNumberingAfterBreak="0">
     <w:nsid w:val="148E33FA"/>
     <w:multiLevelType w:val="multilevel"/>
     <w:tmpl w:val="6594487A"/>
@@ -7777,7 +7971,7 @@
       </w:rPr>
     </w:lvl>
   </w:abstractNum>
-  <w:abstractNum w:abstractNumId="4" w15:restartNumberingAfterBreak="0">
+  <w:abstractNum w:abstractNumId="5" w15:restartNumberingAfterBreak="0">
     <w:nsid w:val="14900BDC"/>
     <w:multiLevelType w:val="multilevel"/>
     <w:tmpl w:val="4D2AD7DE"/>
@@ -7908,7 +8102,7 @@
       </w:rPr>
     </w:lvl>
   </w:abstractNum>
-  <w:abstractNum w:abstractNumId="5" w15:restartNumberingAfterBreak="0">
+  <w:abstractNum w:abstractNumId="6" w15:restartNumberingAfterBreak="0">
     <w:nsid w:val="15DF46DF"/>
     <w:multiLevelType w:val="multilevel"/>
     <w:tmpl w:val="3E7EBBCC"/>
@@ -8021,7 +8215,7 @@
       </w:rPr>
     </w:lvl>
   </w:abstractNum>
-  <w:abstractNum w:abstractNumId="6" w15:restartNumberingAfterBreak="0">
+  <w:abstractNum w:abstractNumId="7" w15:restartNumberingAfterBreak="0">
     <w:nsid w:val="186C0DBB"/>
     <w:multiLevelType w:val="multilevel"/>
     <w:tmpl w:val="EC74B558"/>
@@ -8170,7 +8364,7 @@
       </w:rPr>
     </w:lvl>
   </w:abstractNum>
-  <w:abstractNum w:abstractNumId="7" w15:restartNumberingAfterBreak="0">
+  <w:abstractNum w:abstractNumId="8" w15:restartNumberingAfterBreak="0">
     <w:nsid w:val="22566F3B"/>
     <w:multiLevelType w:val="multilevel"/>
     <w:tmpl w:val="F9EEA7D0"/>
@@ -8283,7 +8477,7 @@
       </w:rPr>
     </w:lvl>
   </w:abstractNum>
-  <w:abstractNum w:abstractNumId="8" w15:restartNumberingAfterBreak="0">
+  <w:abstractNum w:abstractNumId="9" w15:restartNumberingAfterBreak="0">
     <w:nsid w:val="28770B1C"/>
     <w:multiLevelType w:val="multilevel"/>
     <w:tmpl w:val="9FFCF7C6"/>
@@ -8396,7 +8590,7 @@
       </w:rPr>
     </w:lvl>
   </w:abstractNum>
-  <w:abstractNum w:abstractNumId="9" w15:restartNumberingAfterBreak="0">
+  <w:abstractNum w:abstractNumId="10" w15:restartNumberingAfterBreak="0">
     <w:nsid w:val="31DB6C07"/>
     <w:multiLevelType w:val="multilevel"/>
     <w:tmpl w:val="4022D8E8"/>
@@ -8509,7 +8703,7 @@
       </w:rPr>
     </w:lvl>
   </w:abstractNum>
-  <w:abstractNum w:abstractNumId="10" w15:restartNumberingAfterBreak="0">
+  <w:abstractNum w:abstractNumId="11" w15:restartNumberingAfterBreak="0">
     <w:nsid w:val="35B804E3"/>
     <w:multiLevelType w:val="multilevel"/>
     <w:tmpl w:val="2ABA785A"/>
@@ -8640,7 +8834,7 @@
       </w:rPr>
     </w:lvl>
   </w:abstractNum>
-  <w:abstractNum w:abstractNumId="11" w15:restartNumberingAfterBreak="0">
+  <w:abstractNum w:abstractNumId="12" w15:restartNumberingAfterBreak="0">
     <w:nsid w:val="379347EF"/>
     <w:multiLevelType w:val="multilevel"/>
     <w:tmpl w:val="9B6AD1F8"/>
@@ -8753,7 +8947,156 @@
       </w:rPr>
     </w:lvl>
   </w:abstractNum>
-  <w:abstractNum w:abstractNumId="12" w15:restartNumberingAfterBreak="0">
+  <w:abstractNum w:abstractNumId="13" w15:restartNumberingAfterBreak="0">
+    <w:nsid w:val="3ADF3923"/>
+    <w:multiLevelType w:val="multilevel"/>
+    <w:tmpl w:val="632C2858"/>
+    <w:lvl w:ilvl="0">
+      <w:start w:val="1"/>
+      <w:numFmt w:val="bullet"/>
+      <w:lvlText w:val=""/>
+      <w:lvlJc w:val="left"/>
+      <w:pPr>
+        <w:tabs>
+          <w:tab w:val="num" w:pos="720"/>
+        </w:tabs>
+        <w:ind w:left="720" w:hanging="360"/>
+      </w:pPr>
+      <w:rPr>
+        <w:rFonts w:ascii="Symbol" w:hAnsi="Symbol" w:hint="default"/>
+        <w:sz w:val="20"/>
+      </w:rPr>
+    </w:lvl>
+    <w:lvl w:ilvl="1" w:tentative="1">
+      <w:start w:val="1"/>
+      <w:numFmt w:val="bullet"/>
+      <w:lvlText w:val="o"/>
+      <w:lvlJc w:val="left"/>
+      <w:pPr>
+        <w:tabs>
+          <w:tab w:val="num" w:pos="1440"/>
+        </w:tabs>
+        <w:ind w:left="1440" w:hanging="360"/>
+      </w:pPr>
+      <w:rPr>
+        <w:rFonts w:ascii="Courier New" w:hAnsi="Courier New" w:hint="default"/>
+        <w:sz w:val="20"/>
+      </w:rPr>
+    </w:lvl>
+    <w:lvl w:ilvl="2" w:tentative="1">
+      <w:start w:val="1"/>
+      <w:numFmt w:val="bullet"/>
+      <w:lvlText w:val=""/>
+      <w:lvlJc w:val="left"/>
+      <w:pPr>
+        <w:tabs>
+          <w:tab w:val="num" w:pos="2160"/>
+        </w:tabs>
+        <w:ind w:left="2160" w:hanging="360"/>
+      </w:pPr>
+      <w:rPr>
+        <w:rFonts w:ascii="Wingdings" w:hAnsi="Wingdings" w:hint="default"/>
+        <w:sz w:val="20"/>
+      </w:rPr>
+    </w:lvl>
+    <w:lvl w:ilvl="3" w:tentative="1">
+      <w:start w:val="1"/>
+      <w:numFmt w:val="bullet"/>
+      <w:lvlText w:val=""/>
+      <w:lvlJc w:val="left"/>
+      <w:pPr>
+        <w:tabs>
+          <w:tab w:val="num" w:pos="2880"/>
+        </w:tabs>
+        <w:ind w:left="2880" w:hanging="360"/>
+      </w:pPr>
+      <w:rPr>
+        <w:rFonts w:ascii="Wingdings" w:hAnsi="Wingdings" w:hint="default"/>
+        <w:sz w:val="20"/>
+      </w:rPr>
+    </w:lvl>
+    <w:lvl w:ilvl="4" w:tentative="1">
+      <w:start w:val="1"/>
+      <w:numFmt w:val="bullet"/>
+      <w:lvlText w:val=""/>
+      <w:lvlJc w:val="left"/>
+      <w:pPr>
+        <w:tabs>
+          <w:tab w:val="num" w:pos="3600"/>
+        </w:tabs>
+        <w:ind w:left="3600" w:hanging="360"/>
+      </w:pPr>
+      <w:rPr>
+        <w:rFonts w:ascii="Wingdings" w:hAnsi="Wingdings" w:hint="default"/>
+        <w:sz w:val="20"/>
+      </w:rPr>
+    </w:lvl>
+    <w:lvl w:ilvl="5" w:tentative="1">
+      <w:start w:val="1"/>
+      <w:numFmt w:val="bullet"/>
+      <w:lvlText w:val=""/>
+      <w:lvlJc w:val="left"/>
+      <w:pPr>
+        <w:tabs>
+          <w:tab w:val="num" w:pos="4320"/>
+        </w:tabs>
+        <w:ind w:left="4320" w:hanging="360"/>
+      </w:pPr>
+      <w:rPr>
+        <w:rFonts w:ascii="Wingdings" w:hAnsi="Wingdings" w:hint="default"/>
+        <w:sz w:val="20"/>
+      </w:rPr>
+    </w:lvl>
+    <w:lvl w:ilvl="6" w:tentative="1">
+      <w:start w:val="1"/>
+      <w:numFmt w:val="bullet"/>
+      <w:lvlText w:val=""/>
+      <w:lvlJc w:val="left"/>
+      <w:pPr>
+        <w:tabs>
+          <w:tab w:val="num" w:pos="5040"/>
+        </w:tabs>
+        <w:ind w:left="5040" w:hanging="360"/>
+      </w:pPr>
+      <w:rPr>
+        <w:rFonts w:ascii="Wingdings" w:hAnsi="Wingdings" w:hint="default"/>
+        <w:sz w:val="20"/>
+      </w:rPr>
+    </w:lvl>
+    <w:lvl w:ilvl="7" w:tentative="1">
+      <w:start w:val="1"/>
+      <w:numFmt w:val="bullet"/>
+      <w:lvlText w:val=""/>
+      <w:lvlJc w:val="left"/>
+      <w:pPr>
+        <w:tabs>
+          <w:tab w:val="num" w:pos="5760"/>
+        </w:tabs>
+        <w:ind w:left="5760" w:hanging="360"/>
+      </w:pPr>
+      <w:rPr>
+        <w:rFonts w:ascii="Wingdings" w:hAnsi="Wingdings" w:hint="default"/>
+        <w:sz w:val="20"/>
+      </w:rPr>
+    </w:lvl>
+    <w:lvl w:ilvl="8" w:tentative="1">
+      <w:start w:val="1"/>
+      <w:numFmt w:val="bullet"/>
+      <w:lvlText w:val=""/>
+      <w:lvlJc w:val="left"/>
+      <w:pPr>
+        <w:tabs>
+          <w:tab w:val="num" w:pos="6480"/>
+        </w:tabs>
+        <w:ind w:left="6480" w:hanging="360"/>
+      </w:pPr>
+      <w:rPr>
+        <w:rFonts w:ascii="Wingdings" w:hAnsi="Wingdings" w:hint="default"/>
+        <w:sz w:val="20"/>
+      </w:rPr>
+    </w:lvl>
+  </w:abstractNum>
+  <w:abstractNum w:abstractNumId="14" w15:restartNumberingAfterBreak="0">
     <w:nsid w:val="3B9F77CD"/>
     <w:multiLevelType w:val="multilevel"/>
     <w:tmpl w:val="8FC2AD88"/>
@@ -8866,7 +9209,7 @@
       </w:rPr>
     </w:lvl>
   </w:abstractNum>
-  <w:abstractNum w:abstractNumId="13" w15:restartNumberingAfterBreak="0">
+  <w:abstractNum w:abstractNumId="15" w15:restartNumberingAfterBreak="0">
     <w:nsid w:val="3BD0604D"/>
     <w:multiLevelType w:val="multilevel"/>
     <w:tmpl w:val="733A136E"/>
@@ -8979,7 +9322,7 @@
       </w:rPr>
     </w:lvl>
   </w:abstractNum>
-  <w:abstractNum w:abstractNumId="14" w15:restartNumberingAfterBreak="0">
+  <w:abstractNum w:abstractNumId="16" w15:restartNumberingAfterBreak="0">
     <w:nsid w:val="3F1B2745"/>
     <w:multiLevelType w:val="multilevel"/>
     <w:tmpl w:val="835615F6"/>
@@ -9128,7 +9471,7 @@
       </w:rPr>
     </w:lvl>
   </w:abstractNum>
-  <w:abstractNum w:abstractNumId="15" w15:restartNumberingAfterBreak="0">
+  <w:abstractNum w:abstractNumId="17" w15:restartNumberingAfterBreak="0">
     <w:nsid w:val="48D679A7"/>
     <w:multiLevelType w:val="multilevel"/>
     <w:tmpl w:val="A7AE4A52"/>
@@ -9241,7 +9584,7 @@
       </w:rPr>
     </w:lvl>
   </w:abstractNum>
-  <w:abstractNum w:abstractNumId="16" w15:restartNumberingAfterBreak="0">
+  <w:abstractNum w:abstractNumId="18" w15:restartNumberingAfterBreak="0">
     <w:nsid w:val="51184C7D"/>
     <w:multiLevelType w:val="multilevel"/>
     <w:tmpl w:val="2EBADDEC"/>
@@ -9354,7 +9697,305 @@
       </w:rPr>
     </w:lvl>
   </w:abstractNum>
-  <w:abstractNum w:abstractNumId="17" w15:restartNumberingAfterBreak="0">
+  <w:abstractNum w:abstractNumId="19" w15:restartNumberingAfterBreak="0">
+    <w:nsid w:val="53540FBC"/>
+    <w:multiLevelType w:val="multilevel"/>
+    <w:tmpl w:val="B57E593E"/>
+    <w:lvl w:ilvl="0">
+      <w:start w:val="1"/>
+      <w:numFmt w:val="bullet"/>
+      <w:lvlText w:val=""/>
+      <w:lvlJc w:val="left"/>
+      <w:pPr>
+        <w:tabs>
+          <w:tab w:val="num" w:pos="720"/>
+        </w:tabs>
+        <w:ind w:left="720" w:hanging="360"/>
+      </w:pPr>
+      <w:rPr>
+        <w:rFonts w:ascii="Symbol" w:hAnsi="Symbol" w:hint="default"/>
+        <w:sz w:val="20"/>
+      </w:rPr>
+    </w:lvl>
+    <w:lvl w:ilvl="1" w:tentative="1">
+      <w:start w:val="1"/>
+      <w:numFmt w:val="bullet"/>
+      <w:lvlText w:val="o"/>
+      <w:lvlJc w:val="left"/>
+      <w:pPr>
+        <w:tabs>
+          <w:tab w:val="num" w:pos="1440"/>
+        </w:tabs>
+        <w:ind w:left="1440" w:hanging="360"/>
+      </w:pPr>
+      <w:rPr>
+        <w:rFonts w:ascii="Courier New" w:hAnsi="Courier New" w:hint="default"/>
+        <w:sz w:val="20"/>
+      </w:rPr>
+    </w:lvl>
+    <w:lvl w:ilvl="2" w:tentative="1">
+      <w:start w:val="1"/>
+      <w:numFmt w:val="bullet"/>
+      <w:lvlText w:val=""/>
+      <w:lvlJc w:val="left"/>
+      <w:pPr>
+        <w:tabs>
+          <w:tab w:val="num" w:pos="2160"/>
+        </w:tabs>
+        <w:ind w:left="2160" w:hanging="360"/>
+      </w:pPr>
+      <w:rPr>
+        <w:rFonts w:ascii="Wingdings" w:hAnsi="Wingdings" w:hint="default"/>
+        <w:sz w:val="20"/>
+      </w:rPr>
+    </w:lvl>
+    <w:lvl w:ilvl="3" w:tentative="1">
+      <w:start w:val="1"/>
+      <w:numFmt w:val="bullet"/>
+      <w:lvlText w:val=""/>
+      <w:lvlJc w:val="left"/>
+      <w:pPr>
+        <w:tabs>
+          <w:tab w:val="num" w:pos="2880"/>
+        </w:tabs>
+        <w:ind w:left="2880" w:hanging="360"/>
+      </w:pPr>
+      <w:rPr>
+        <w:rFonts w:ascii="Wingdings" w:hAnsi="Wingdings" w:hint="default"/>
+        <w:sz w:val="20"/>
+      </w:rPr>
+    </w:lvl>
+    <w:lvl w:ilvl="4" w:tentative="1">
+      <w:start w:val="1"/>
+      <w:numFmt w:val="bullet"/>
+      <w:lvlText w:val=""/>
+      <w:lvlJc w:val="left"/>
+      <w:pPr>
+        <w:tabs>
+          <w:tab w:val="num" w:pos="3600"/>
+        </w:tabs>
+        <w:ind w:left="3600" w:hanging="360"/>
+      </w:pPr>
+      <w:rPr>
+        <w:rFonts w:ascii="Wingdings" w:hAnsi="Wingdings" w:hint="default"/>
+        <w:sz w:val="20"/>
+      </w:rPr>
+    </w:lvl>
+    <w:lvl w:ilvl="5" w:tentative="1">
+      <w:start w:val="1"/>
+      <w:numFmt w:val="bullet"/>
+      <w:lvlText w:val=""/>
+      <w:lvlJc w:val="left"/>
+      <w:pPr>
+        <w:tabs>
+          <w:tab w:val="num" w:pos="4320"/>
+        </w:tabs>
+        <w:ind w:left="4320" w:hanging="360"/>
+      </w:pPr>
+      <w:rPr>
+        <w:rFonts w:ascii="Wingdings" w:hAnsi="Wingdings" w:hint="default"/>
+        <w:sz w:val="20"/>
+      </w:rPr>
+    </w:lvl>
+    <w:lvl w:ilvl="6" w:tentative="1">
+      <w:start w:val="1"/>
+      <w:numFmt w:val="bullet"/>
+      <w:lvlText w:val=""/>
+      <w:lvlJc w:val="left"/>
+      <w:pPr>
+        <w:tabs>
+          <w:tab w:val="num" w:pos="5040"/>
+        </w:tabs>
+        <w:ind w:left="5040" w:hanging="360"/>
+      </w:pPr>
+      <w:rPr>
+        <w:rFonts w:ascii="Wingdings" w:hAnsi="Wingdings" w:hint="default"/>
+        <w:sz w:val="20"/>
+      </w:rPr>
+    </w:lvl>
+    <w:lvl w:ilvl="7" w:tentative="1">
+      <w:start w:val="1"/>
+      <w:numFmt w:val="bullet"/>
+      <w:lvlText w:val=""/>
+      <w:lvlJc w:val="left"/>
+      <w:pPr>
+        <w:tabs>
+          <w:tab w:val="num" w:pos="5760"/>
+        </w:tabs>
+        <w:ind w:left="5760" w:hanging="360"/>
+      </w:pPr>
+      <w:rPr>
+        <w:rFonts w:ascii="Wingdings" w:hAnsi="Wingdings" w:hint="default"/>
+        <w:sz w:val="20"/>
+      </w:rPr>
+    </w:lvl>
+    <w:lvl w:ilvl="8" w:tentative="1">
+      <w:start w:val="1"/>
+      <w:numFmt w:val="bullet"/>
+      <w:lvlText w:val=""/>
+      <w:lvlJc w:val="left"/>
+      <w:pPr>
+        <w:tabs>
+          <w:tab w:val="num" w:pos="6480"/>
+        </w:tabs>
+        <w:ind w:left="6480" w:hanging="360"/>
+      </w:pPr>
+      <w:rPr>
+        <w:rFonts w:ascii="Wingdings" w:hAnsi="Wingdings" w:hint="default"/>
+        <w:sz w:val="20"/>
+      </w:rPr>
+    </w:lvl>
+  </w:abstractNum>
+  <w:abstractNum w:abstractNumId="20" w15:restartNumberingAfterBreak="0">
+    <w:nsid w:val="5C5024B7"/>
+    <w:multiLevelType w:val="multilevel"/>
+    <w:tmpl w:val="604A7BE2"/>
+    <w:lvl w:ilvl="0">
+      <w:start w:val="1"/>
+      <w:numFmt w:val="bullet"/>
+      <w:lvlText w:val=""/>
+      <w:lvlJc w:val="left"/>
+      <w:pPr>
+        <w:tabs>
+          <w:tab w:val="num" w:pos="720"/>
+        </w:tabs>
+        <w:ind w:left="720" w:hanging="360"/>
+      </w:pPr>
+      <w:rPr>
+        <w:rFonts w:ascii="Symbol" w:hAnsi="Symbol" w:hint="default"/>
+        <w:sz w:val="20"/>
+      </w:rPr>
+    </w:lvl>
+    <w:lvl w:ilvl="1" w:tentative="1">
+      <w:start w:val="1"/>
+      <w:numFmt w:val="bullet"/>
+      <w:lvlText w:val="o"/>
+      <w:lvlJc w:val="left"/>
+      <w:pPr>
+        <w:tabs>
+          <w:tab w:val="num" w:pos="1440"/>
+        </w:tabs>
+        <w:ind w:left="1440" w:hanging="360"/>
+      </w:pPr>
+      <w:rPr>
+        <w:rFonts w:ascii="Courier New" w:hAnsi="Courier New" w:hint="default"/>
+        <w:sz w:val="20"/>
+      </w:rPr>
+    </w:lvl>
+    <w:lvl w:ilvl="2" w:tentative="1">
+      <w:start w:val="1"/>
+      <w:numFmt w:val="bullet"/>
+      <w:lvlText w:val=""/>
+      <w:lvlJc w:val="left"/>
+      <w:pPr>
+        <w:tabs>
+          <w:tab w:val="num" w:pos="2160"/>
+        </w:tabs>
+        <w:ind w:left="2160" w:hanging="360"/>
+      </w:pPr>
+      <w:rPr>
+        <w:rFonts w:ascii="Wingdings" w:hAnsi="Wingdings" w:hint="default"/>
+        <w:sz w:val="20"/>
+      </w:rPr>
+    </w:lvl>
+    <w:lvl w:ilvl="3" w:tentative="1">
+      <w:start w:val="1"/>
+      <w:numFmt w:val="bullet"/>
+      <w:lvlText w:val=""/>
+      <w:lvlJc w:val="left"/>
+      <w:pPr>
+        <w:tabs>
+          <w:tab w:val="num" w:pos="2880"/>
+        </w:tabs>
+        <w:ind w:left="2880" w:hanging="360"/>
+      </w:pPr>
+      <w:rPr>
+        <w:rFonts w:ascii="Wingdings" w:hAnsi="Wingdings" w:hint="default"/>
+        <w:sz w:val="20"/>
+      </w:rPr>
+    </w:lvl>
+    <w:lvl w:ilvl="4" w:tentative="1">
+      <w:start w:val="1"/>
+      <w:numFmt w:val="bullet"/>
+      <w:lvlText w:val=""/>
+      <w:lvlJc w:val="left"/>
+      <w:pPr>
+        <w:tabs>
+          <w:tab w:val="num" w:pos="3600"/>
+        </w:tabs>
+        <w:ind w:left="3600" w:hanging="360"/>
+      </w:pPr>
+      <w:rPr>
+        <w:rFonts w:ascii="Wingdings" w:hAnsi="Wingdings" w:hint="default"/>
+        <w:sz w:val="20"/>
+      </w:rPr>
+    </w:lvl>
+    <w:lvl w:ilvl="5" w:tentative="1">
+      <w:start w:val="1"/>
+      <w:numFmt w:val="bullet"/>
+      <w:lvlText w:val=""/>
+      <w:lvlJc w:val="left"/>
+      <w:pPr>
+        <w:tabs>
+          <w:tab w:val="num" w:pos="4320"/>
+        </w:tabs>
+        <w:ind w:left="4320" w:hanging="360"/>
+      </w:pPr>
+      <w:rPr>
+        <w:rFonts w:ascii="Wingdings" w:hAnsi="Wingdings" w:hint="default"/>
+        <w:sz w:val="20"/>
+      </w:rPr>
+    </w:lvl>
+    <w:lvl w:ilvl="6" w:tentative="1">
+      <w:start w:val="1"/>
+      <w:numFmt w:val="bullet"/>
+      <w:lvlText w:val=""/>
+      <w:lvlJc w:val="left"/>
+      <w:pPr>
+        <w:tabs>
+          <w:tab w:val="num" w:pos="5040"/>
+        </w:tabs>
+        <w:ind w:left="5040" w:hanging="360"/>
+      </w:pPr>
+      <w:rPr>
+        <w:rFonts w:ascii="Wingdings" w:hAnsi="Wingdings" w:hint="default"/>
+        <w:sz w:val="20"/>
+      </w:rPr>
+    </w:lvl>
+    <w:lvl w:ilvl="7" w:tentative="1">
+      <w:start w:val="1"/>
+      <w:numFmt w:val="bullet"/>
+      <w:lvlText w:val=""/>
+      <w:lvlJc w:val="left"/>
+      <w:pPr>
+        <w:tabs>
+          <w:tab w:val="num" w:pos="5760"/>
+        </w:tabs>
+        <w:ind w:left="5760" w:hanging="360"/>
+      </w:pPr>
+      <w:rPr>
+        <w:rFonts w:ascii="Wingdings" w:hAnsi="Wingdings" w:hint="default"/>
+        <w:sz w:val="20"/>
+      </w:rPr>
+    </w:lvl>
+    <w:lvl w:ilvl="8" w:tentative="1">
+      <w:start w:val="1"/>
+      <w:numFmt w:val="bullet"/>
+      <w:lvlText w:val=""/>
+      <w:lvlJc w:val="left"/>
+      <w:pPr>
+        <w:tabs>
+          <w:tab w:val="num" w:pos="6480"/>
+        </w:tabs>
+        <w:ind w:left="6480" w:hanging="360"/>
+      </w:pPr>
+      <w:rPr>
+        <w:rFonts w:ascii="Wingdings" w:hAnsi="Wingdings" w:hint="default"/>
+        <w:sz w:val="20"/>
+      </w:rPr>
+    </w:lvl>
+  </w:abstractNum>
+  <w:abstractNum w:abstractNumId="21" w15:restartNumberingAfterBreak="0">
     <w:nsid w:val="5EC44E02"/>
     <w:multiLevelType w:val="multilevel"/>
     <w:tmpl w:val="ACE6A026"/>
@@ -9467,7 +10108,7 @@
       </w:rPr>
     </w:lvl>
   </w:abstractNum>
-  <w:abstractNum w:abstractNumId="18" w15:restartNumberingAfterBreak="0">
+  <w:abstractNum w:abstractNumId="22" w15:restartNumberingAfterBreak="0">
     <w:nsid w:val="686F2BDE"/>
     <w:multiLevelType w:val="multilevel"/>
     <w:tmpl w:val="62B099A0"/>
@@ -9598,7 +10239,156 @@
       </w:rPr>
     </w:lvl>
   </w:abstractNum>
-  <w:abstractNum w:abstractNumId="19" w15:restartNumberingAfterBreak="0">
+  <w:abstractNum w:abstractNumId="23" w15:restartNumberingAfterBreak="0">
+    <w:nsid w:val="6C9307A7"/>
+    <w:multiLevelType w:val="multilevel"/>
+    <w:tmpl w:val="A24012F2"/>
+    <w:lvl w:ilvl="0">
+      <w:start w:val="1"/>
+      <w:numFmt w:val="bullet"/>
+      <w:lvlText w:val=""/>
+      <w:lvlJc w:val="left"/>
+      <w:pPr>
+        <w:tabs>
+          <w:tab w:val="num" w:pos="720"/>
+        </w:tabs>
+        <w:ind w:left="720" w:hanging="360"/>
+      </w:pPr>
+      <w:rPr>
+        <w:rFonts w:ascii="Symbol" w:hAnsi="Symbol" w:hint="default"/>
+        <w:sz w:val="20"/>
+      </w:rPr>
+    </w:lvl>
+    <w:lvl w:ilvl="1" w:tentative="1">
+      <w:start w:val="1"/>
+      <w:numFmt w:val="bullet"/>
+      <w:lvlText w:val="o"/>
+      <w:lvlJc w:val="left"/>
+      <w:pPr>
+        <w:tabs>
+          <w:tab w:val="num" w:pos="1440"/>
+        </w:tabs>
+        <w:ind w:left="1440" w:hanging="360"/>
+      </w:pPr>
+      <w:rPr>
+        <w:rFonts w:ascii="Courier New" w:hAnsi="Courier New" w:hint="default"/>
+        <w:sz w:val="20"/>
+      </w:rPr>
+    </w:lvl>
+    <w:lvl w:ilvl="2" w:tentative="1">
+      <w:start w:val="1"/>
+      <w:numFmt w:val="bullet"/>
+      <w:lvlText w:val=""/>
+      <w:lvlJc w:val="left"/>
+      <w:pPr>
+        <w:tabs>
+          <w:tab w:val="num" w:pos="2160"/>
+        </w:tabs>
+        <w:ind w:left="2160" w:hanging="360"/>
+      </w:pPr>
+      <w:rPr>
+        <w:rFonts w:ascii="Wingdings" w:hAnsi="Wingdings" w:hint="default"/>
+        <w:sz w:val="20"/>
+      </w:rPr>
+    </w:lvl>
+    <w:lvl w:ilvl="3" w:tentative="1">
+      <w:start w:val="1"/>
+      <w:numFmt w:val="bullet"/>
+      <w:lvlText w:val=""/>
+      <w:lvlJc w:val="left"/>
+      <w:pPr>
+        <w:tabs>
+          <w:tab w:val="num" w:pos="2880"/>
+        </w:tabs>
+        <w:ind w:left="2880" w:hanging="360"/>
+      </w:pPr>
+      <w:rPr>
+        <w:rFonts w:ascii="Wingdings" w:hAnsi="Wingdings" w:hint="default"/>
+        <w:sz w:val="20"/>
+      </w:rPr>
+    </w:lvl>
+    <w:lvl w:ilvl="4" w:tentative="1">
+      <w:start w:val="1"/>
+      <w:numFmt w:val="bullet"/>
+      <w:lvlText w:val=""/>
+      <w:lvlJc w:val="left"/>
+      <w:pPr>
+        <w:tabs>
+          <w:tab w:val="num" w:pos="3600"/>
+        </w:tabs>
+        <w:ind w:left="3600" w:hanging="360"/>
+      </w:pPr>
+      <w:rPr>
+        <w:rFonts w:ascii="Wingdings" w:hAnsi="Wingdings" w:hint="default"/>
+        <w:sz w:val="20"/>
+      </w:rPr>
+    </w:lvl>
+    <w:lvl w:ilvl="5" w:tentative="1">
+      <w:start w:val="1"/>
+      <w:numFmt w:val="bullet"/>
+      <w:lvlText w:val=""/>
+      <w:lvlJc w:val="left"/>
+      <w:pPr>
+        <w:tabs>
+          <w:tab w:val="num" w:pos="4320"/>
+        </w:tabs>
+        <w:ind w:left="4320" w:hanging="360"/>
+      </w:pPr>
+      <w:rPr>
+        <w:rFonts w:ascii="Wingdings" w:hAnsi="Wingdings" w:hint="default"/>
+        <w:sz w:val="20"/>
+      </w:rPr>
+    </w:lvl>
+    <w:lvl w:ilvl="6" w:tentative="1">
+      <w:start w:val="1"/>
+      <w:numFmt w:val="bullet"/>
+      <w:lvlText w:val=""/>
+      <w:lvlJc w:val="left"/>
+      <w:pPr>
+        <w:tabs>
+          <w:tab w:val="num" w:pos="5040"/>
+        </w:tabs>
+        <w:ind w:left="5040" w:hanging="360"/>
+      </w:pPr>
+      <w:rPr>
+        <w:rFonts w:ascii="Wingdings" w:hAnsi="Wingdings" w:hint="default"/>
+        <w:sz w:val="20"/>
+      </w:rPr>
+    </w:lvl>
+    <w:lvl w:ilvl="7" w:tentative="1">
+      <w:start w:val="1"/>
+      <w:numFmt w:val="bullet"/>
+      <w:lvlText w:val=""/>
+      <w:lvlJc w:val="left"/>
+      <w:pPr>
+        <w:tabs>
+          <w:tab w:val="num" w:pos="5760"/>
+        </w:tabs>
+        <w:ind w:left="5760" w:hanging="360"/>
+      </w:pPr>
+      <w:rPr>
+        <w:rFonts w:ascii="Wingdings" w:hAnsi="Wingdings" w:hint="default"/>
+        <w:sz w:val="20"/>
+      </w:rPr>
+    </w:lvl>
+    <w:lvl w:ilvl="8" w:tentative="1">
+      <w:start w:val="1"/>
+      <w:numFmt w:val="bullet"/>
+      <w:lvlText w:val=""/>
+      <w:lvlJc w:val="left"/>
+      <w:pPr>
+        <w:tabs>
+          <w:tab w:val="num" w:pos="6480"/>
+        </w:tabs>
+        <w:ind w:left="6480" w:hanging="360"/>
+      </w:pPr>
+      <w:rPr>
+        <w:rFonts w:ascii="Wingdings" w:hAnsi="Wingdings" w:hint="default"/>
+        <w:sz w:val="20"/>
+      </w:rPr>
+    </w:lvl>
+  </w:abstractNum>
+  <w:abstractNum w:abstractNumId="24" w15:restartNumberingAfterBreak="0">
     <w:nsid w:val="76C8261E"/>
     <w:multiLevelType w:val="multilevel"/>
     <w:tmpl w:val="F0B264EA"/>
@@ -9711,7 +10501,156 @@
       </w:rPr>
     </w:lvl>
   </w:abstractNum>
-  <w:abstractNum w:abstractNumId="20" w15:restartNumberingAfterBreak="0">
+  <w:abstractNum w:abstractNumId="25" w15:restartNumberingAfterBreak="0">
+    <w:nsid w:val="78077CD9"/>
+    <w:multiLevelType w:val="multilevel"/>
+    <w:tmpl w:val="BDD6591C"/>
+    <w:lvl w:ilvl="0">
+      <w:start w:val="1"/>
+      <w:numFmt w:val="bullet"/>
+      <w:lvlText w:val=""/>
+      <w:lvlJc w:val="left"/>
+      <w:pPr>
+        <w:tabs>
+          <w:tab w:val="num" w:pos="720"/>
+        </w:tabs>
+        <w:ind w:left="720" w:hanging="360"/>
+      </w:pPr>
+      <w:rPr>
+        <w:rFonts w:ascii="Symbol" w:hAnsi="Symbol" w:hint="default"/>
+        <w:sz w:val="20"/>
+      </w:rPr>
+    </w:lvl>
+    <w:lvl w:ilvl="1" w:tentative="1">
+      <w:start w:val="1"/>
+      <w:numFmt w:val="bullet"/>
+      <w:lvlText w:val="o"/>
+      <w:lvlJc w:val="left"/>
+      <w:pPr>
+        <w:tabs>
+          <w:tab w:val="num" w:pos="1440"/>
+        </w:tabs>
+        <w:ind w:left="1440" w:hanging="360"/>
+      </w:pPr>
+      <w:rPr>
+        <w:rFonts w:ascii="Courier New" w:hAnsi="Courier New" w:hint="default"/>
+        <w:sz w:val="20"/>
+      </w:rPr>
+    </w:lvl>
+    <w:lvl w:ilvl="2" w:tentative="1">
+      <w:start w:val="1"/>
+      <w:numFmt w:val="bullet"/>
+      <w:lvlText w:val=""/>
+      <w:lvlJc w:val="left"/>
+      <w:pPr>
+        <w:tabs>
+          <w:tab w:val="num" w:pos="2160"/>
+        </w:tabs>
+        <w:ind w:left="2160" w:hanging="360"/>
+      </w:pPr>
+      <w:rPr>
+        <w:rFonts w:ascii="Wingdings" w:hAnsi="Wingdings" w:hint="default"/>
+        <w:sz w:val="20"/>
+      </w:rPr>
+    </w:lvl>
+    <w:lvl w:ilvl="3" w:tentative="1">
+      <w:start w:val="1"/>
+      <w:numFmt w:val="bullet"/>
+      <w:lvlText w:val=""/>
+      <w:lvlJc w:val="left"/>
+      <w:pPr>
+        <w:tabs>
+          <w:tab w:val="num" w:pos="2880"/>
+        </w:tabs>
+        <w:ind w:left="2880" w:hanging="360"/>
+      </w:pPr>
+      <w:rPr>
+        <w:rFonts w:ascii="Wingdings" w:hAnsi="Wingdings" w:hint="default"/>
+        <w:sz w:val="20"/>
+      </w:rPr>
+    </w:lvl>
+    <w:lvl w:ilvl="4" w:tentative="1">
+      <w:start w:val="1"/>
+      <w:numFmt w:val="bullet"/>
+      <w:lvlText w:val=""/>
+      <w:lvlJc w:val="left"/>
+      <w:pPr>
+        <w:tabs>
+          <w:tab w:val="num" w:pos="3600"/>
+        </w:tabs>
+        <w:ind w:left="3600" w:hanging="360"/>
+      </w:pPr>
+      <w:rPr>
+        <w:rFonts w:ascii="Wingdings" w:hAnsi="Wingdings" w:hint="default"/>
+        <w:sz w:val="20"/>
+      </w:rPr>
+    </w:lvl>
+    <w:lvl w:ilvl="5" w:tentative="1">
+      <w:start w:val="1"/>
+      <w:numFmt w:val="bullet"/>
+      <w:lvlText w:val=""/>
+      <w:lvlJc w:val="left"/>
+      <w:pPr>
+        <w:tabs>
+          <w:tab w:val="num" w:pos="4320"/>
+        </w:tabs>
+        <w:ind w:left="4320" w:hanging="360"/>
+      </w:pPr>
+      <w:rPr>
+        <w:rFonts w:ascii="Wingdings" w:hAnsi="Wingdings" w:hint="default"/>
+        <w:sz w:val="20"/>
+      </w:rPr>
+    </w:lvl>
+    <w:lvl w:ilvl="6" w:tentative="1">
+      <w:start w:val="1"/>
+      <w:numFmt w:val="bullet"/>
+      <w:lvlText w:val=""/>
+      <w:lvlJc w:val="left"/>
+      <w:pPr>
+        <w:tabs>
+          <w:tab w:val="num" w:pos="5040"/>
+        </w:tabs>
+        <w:ind w:left="5040" w:hanging="360"/>
+      </w:pPr>
+      <w:rPr>
+        <w:rFonts w:ascii="Wingdings" w:hAnsi="Wingdings" w:hint="default"/>
+        <w:sz w:val="20"/>
+      </w:rPr>
+    </w:lvl>
+    <w:lvl w:ilvl="7" w:tentative="1">
+      <w:start w:val="1"/>
+      <w:numFmt w:val="bullet"/>
+      <w:lvlText w:val=""/>
+      <w:lvlJc w:val="left"/>
+      <w:pPr>
+        <w:tabs>
+          <w:tab w:val="num" w:pos="5760"/>
+        </w:tabs>
+        <w:ind w:left="5760" w:hanging="360"/>
+      </w:pPr>
+      <w:rPr>
+        <w:rFonts w:ascii="Wingdings" w:hAnsi="Wingdings" w:hint="default"/>
+        <w:sz w:val="20"/>
+      </w:rPr>
+    </w:lvl>
+    <w:lvl w:ilvl="8" w:tentative="1">
+      <w:start w:val="1"/>
+      <w:numFmt w:val="bullet"/>
+      <w:lvlText w:val=""/>
+      <w:lvlJc w:val="left"/>
+      <w:pPr>
+        <w:tabs>
+          <w:tab w:val="num" w:pos="6480"/>
+        </w:tabs>
+        <w:ind w:left="6480" w:hanging="360"/>
+      </w:pPr>
+      <w:rPr>
+        <w:rFonts w:ascii="Wingdings" w:hAnsi="Wingdings" w:hint="default"/>
+        <w:sz w:val="20"/>
+      </w:rPr>
+    </w:lvl>
+  </w:abstractNum>
+  <w:abstractNum w:abstractNumId="26" w15:restartNumberingAfterBreak="0">
     <w:nsid w:val="781056F9"/>
     <w:multiLevelType w:val="multilevel"/>
     <w:tmpl w:val="9CB69BA2"/>
@@ -9824,7 +10763,7 @@
       </w:rPr>
     </w:lvl>
   </w:abstractNum>
-  <w:abstractNum w:abstractNumId="21" w15:restartNumberingAfterBreak="0">
+  <w:abstractNum w:abstractNumId="27" w15:restartNumberingAfterBreak="0">
     <w:nsid w:val="7B3E58D7"/>
     <w:multiLevelType w:val="multilevel"/>
     <w:tmpl w:val="EB7C7A20"/>
@@ -9938,70 +10877,88 @@
     </w:lvl>
   </w:abstractNum>
   <w:num w:numId="1" w16cid:durableId="2099210577">
-    <w:abstractNumId w:val="16"/>
+    <w:abstractNumId w:val="18"/>
   </w:num>
   <w:num w:numId="2" w16cid:durableId="472020705">
-    <w:abstractNumId w:val="5"/>
+    <w:abstractNumId w:val="6"/>
   </w:num>
   <w:num w:numId="3" w16cid:durableId="394160495">
-    <w:abstractNumId w:val="15"/>
+    <w:abstractNumId w:val="17"/>
   </w:num>
   <w:num w:numId="4" w16cid:durableId="423458319">
-    <w:abstractNumId w:val="7"/>
+    <w:abstractNumId w:val="8"/>
   </w:num>
   <w:num w:numId="5" w16cid:durableId="776414118">
     <w:abstractNumId w:val="2"/>
   </w:num>
   <w:num w:numId="6" w16cid:durableId="1497568884">
-    <w:abstractNumId w:val="12"/>
+    <w:abstractNumId w:val="14"/>
   </w:num>
   <w:num w:numId="7" w16cid:durableId="660934613">
-    <w:abstractNumId w:val="19"/>
+    <w:abstractNumId w:val="24"/>
   </w:num>
   <w:num w:numId="8" w16cid:durableId="948731654">
-    <w:abstractNumId w:val="8"/>
+    <w:abstractNumId w:val="9"/>
   </w:num>
   <w:num w:numId="9" w16cid:durableId="1644432204">
-    <w:abstractNumId w:val="21"/>
+    <w:abstractNumId w:val="27"/>
   </w:num>
   <w:num w:numId="10" w16cid:durableId="1603028983">
-    <w:abstractNumId w:val="20"/>
+    <w:abstractNumId w:val="26"/>
   </w:num>
   <w:num w:numId="11" w16cid:durableId="1459496242">
-    <w:abstractNumId w:val="18"/>
+    <w:abstractNumId w:val="22"/>
   </w:num>
   <w:num w:numId="12" w16cid:durableId="30231920">
+    <w:abstractNumId w:val="11"/>
+  </w:num>
+  <w:num w:numId="13" w16cid:durableId="1854109799">
     <w:abstractNumId w:val="10"/>
   </w:num>
-  <w:num w:numId="13" w16cid:durableId="1854109799">
-    <w:abstractNumId w:val="9"/>
-  </w:num>
   <w:num w:numId="14" w16cid:durableId="279730683">
-    <w:abstractNumId w:val="4"/>
+    <w:abstractNumId w:val="5"/>
   </w:num>
   <w:num w:numId="15" w16cid:durableId="1883666493">
-    <w:abstractNumId w:val="17"/>
+    <w:abstractNumId w:val="21"/>
   </w:num>
   <w:num w:numId="16" w16cid:durableId="1206716669">
     <w:abstractNumId w:val="0"/>
   </w:num>
   <w:num w:numId="17" w16cid:durableId="893732478">
-    <w:abstractNumId w:val="3"/>
+    <w:abstractNumId w:val="4"/>
   </w:num>
   <w:num w:numId="18" w16cid:durableId="1846360011">
-    <w:abstractNumId w:val="13"/>
+    <w:abstractNumId w:val="15"/>
   </w:num>
   <w:num w:numId="19" w16cid:durableId="2082754647">
-    <w:abstractNumId w:val="11"/>
+    <w:abstractNumId w:val="12"/>
   </w:num>
   <w:num w:numId="20" w16cid:durableId="867762826">
     <w:abstractNumId w:val="1"/>
   </w:num>
   <w:num w:numId="21" w16cid:durableId="799033329">
-    <w:abstractNumId w:val="6"/>
+    <w:abstractNumId w:val="7"/>
   </w:num>
   <w:num w:numId="22" w16cid:durableId="1957059066">
-    <w:abstractNumId w:val="14"/>
+    <w:abstractNumId w:val="16"/>
+  </w:num>
+  <w:num w:numId="23" w16cid:durableId="321158474">
+    <w:abstractNumId w:val="13"/>
+  </w:num>
+  <w:num w:numId="24" w16cid:durableId="59985133">
+    <w:abstractNumId w:val="20"/>
+  </w:num>
+  <w:num w:numId="25" w16cid:durableId="91820350">
+    <w:abstractNumId w:val="19"/>
+  </w:num>
+  <w:num w:numId="26" w16cid:durableId="623200107">
+    <w:abstractNumId w:val="23"/>
+  </w:num>
+  <w:num w:numId="27" w16cid:durableId="805508983">
+    <w:abstractNumId w:val="3"/>
+  </w:num>
+  <w:num w:numId="28" w16cid:durableId="1998801301">
+    <w:abstractNumId w:val="25"/>
   </w:num>
 </w:numbering>
 </file>
@@ -10939,6 +11896,17 @@
       <w:tblStyleColBandSize w:val="1"/>
     </w:tblPr>
   </w:style>
+  <w:style w:type="character" w:styleId="Fuerte">
+    <w:name w:val="Strong"/>
+    <w:basedOn w:val="Fuentedeprrafopredeter"/>
+    <w:uiPriority w:val="22"/>
+    <w:qFormat/>
+    <w:rsid w:val="00B209EB"/>
+    <w:rPr>
+      <w:b/>
+      <w:bCs/>
+    </w:rPr>
+  </w:style>
 </w:styles>
 </file>
 

</xml_diff>

<commit_message>
actualize la info del sprint 3
</commit_message>
<xml_diff>
--- a/docs/General/Proyecto Final Daniel.O y Arnau.S.docx
+++ b/docs/General/Proyecto Final Daniel.O y Arnau.S.docx
@@ -6603,57 +6603,135 @@
         <w:rPr>
           <w:color w:val="000000"/>
         </w:rPr>
-        <w:t>Breve registro de problemas encontrados y cómo se han resuelto.</w:t>
-      </w:r>
-    </w:p>
-    <w:p>
-      <w:pPr>
-        <w:numPr>
-          <w:ilvl w:val="2"/>
-          <w:numId w:val="9"/>
-        </w:numPr>
-        <w:pBdr>
-          <w:top w:val="nil"/>
-          <w:left w:val="nil"/>
-          <w:bottom w:val="nil"/>
-          <w:right w:val="nil"/>
-          <w:between w:val="nil"/>
-        </w:pBdr>
-      </w:pPr>
-      <w:r>
-        <w:rPr>
-          <w:color w:val="000000"/>
-        </w:rPr>
-        <w:t>Avance real vs planificado.</w:t>
-      </w:r>
-    </w:p>
-    <w:p>
-      <w:pPr>
-        <w:ind w:left="720"/>
-      </w:pPr>
+        <w:t>Problemas</w:t>
+      </w:r>
+      <w:r>
+        <w:rPr>
+          <w:color w:val="000000"/>
+        </w:rPr>
+        <w:t>:</w:t>
+      </w:r>
+      <w:r>
+        <w:rPr>
+          <w:color w:val="000000"/>
+        </w:rPr>
+        <w:br/>
+        <w:t xml:space="preserve">este sprint tubo muchísimos retrasos sobre todo por problemas con la red y conexiones que no nos dejaban avanzar, ya que al servidor solo se puede configurar accediendo a </w:t>
+      </w:r>
       <w:proofErr w:type="spellStart"/>
       <w:r>
         <w:rPr>
-          <w:b/>
-          <w:bCs/>
-        </w:rPr>
-        <w:t>Revisió</w:t>
+          <w:color w:val="000000"/>
+        </w:rPr>
+        <w:t>el</w:t>
       </w:r>
       <w:proofErr w:type="spellEnd"/>
       <w:r>
         <w:rPr>
-          <w:b/>
-          <w:bCs/>
-        </w:rPr>
-        <w:t xml:space="preserve"> i retrospectiva</w:t>
-      </w:r>
-    </w:p>
-    <w:p>
-      <w:pPr>
-        <w:numPr>
-          <w:ilvl w:val="0"/>
-          <w:numId w:val="10"/>
-        </w:numPr>
+          <w:color w:val="000000"/>
+        </w:rPr>
+        <w:t xml:space="preserve"> a través de la web lo que hace que tenga que estar conectado y no podamos </w:t>
+      </w:r>
+      <w:proofErr w:type="spellStart"/>
+      <w:r>
+        <w:rPr>
+          <w:color w:val="000000"/>
+        </w:rPr>
+        <w:t>abanzar</w:t>
+      </w:r>
+      <w:proofErr w:type="spellEnd"/>
+      <w:r>
+        <w:rPr>
+          <w:color w:val="000000"/>
+        </w:rPr>
+        <w:t>.</w:t>
+      </w:r>
+      <w:r>
+        <w:rPr>
+          <w:color w:val="000000"/>
+        </w:rPr>
+        <w:br/>
+      </w:r>
+      <w:r>
+        <w:rPr>
+          <w:color w:val="000000"/>
+        </w:rPr>
+        <w:br/>
+        <w:t xml:space="preserve">aun así pudimos avanzar los últimos 2 días muy </w:t>
+      </w:r>
+      <w:proofErr w:type="spellStart"/>
+      <w:r>
+        <w:rPr>
+          <w:color w:val="000000"/>
+        </w:rPr>
+        <w:t>rapido</w:t>
+      </w:r>
+      <w:proofErr w:type="spellEnd"/>
+      <w:r>
+        <w:rPr>
+          <w:color w:val="000000"/>
+        </w:rPr>
+        <w:t xml:space="preserve"> ya que </w:t>
+      </w:r>
+      <w:proofErr w:type="spellStart"/>
+      <w:r>
+        <w:rPr>
+          <w:color w:val="000000"/>
+        </w:rPr>
+        <w:t>teniamos</w:t>
+      </w:r>
+      <w:proofErr w:type="spellEnd"/>
+      <w:r>
+        <w:rPr>
+          <w:color w:val="000000"/>
+        </w:rPr>
+        <w:t xml:space="preserve"> toda la </w:t>
+      </w:r>
+      <w:proofErr w:type="spellStart"/>
+      <w:r>
+        <w:rPr>
+          <w:color w:val="000000"/>
+        </w:rPr>
+        <w:t>documentacion</w:t>
+      </w:r>
+      <w:proofErr w:type="spellEnd"/>
+      <w:r>
+        <w:rPr>
+          <w:color w:val="000000"/>
+        </w:rPr>
+        <w:t xml:space="preserve"> y </w:t>
+      </w:r>
+      <w:proofErr w:type="spellStart"/>
+      <w:r>
+        <w:rPr>
+          <w:color w:val="000000"/>
+        </w:rPr>
+        <w:t>guias</w:t>
+      </w:r>
+      <w:proofErr w:type="spellEnd"/>
+      <w:r>
+        <w:rPr>
+          <w:color w:val="000000"/>
+        </w:rPr>
+        <w:t xml:space="preserve"> ya hechas lo que nos </w:t>
+      </w:r>
+      <w:proofErr w:type="spellStart"/>
+      <w:r>
+        <w:rPr>
+          <w:color w:val="000000"/>
+        </w:rPr>
+        <w:t>permitio</w:t>
+      </w:r>
+      <w:proofErr w:type="spellEnd"/>
+      <w:r>
+        <w:rPr>
+          <w:color w:val="000000"/>
+        </w:rPr>
+        <w:t xml:space="preserve"> seguirlas y montar todo bastante rápido.</w:t>
+      </w:r>
+    </w:p>
+    <w:p>
+      <w:pPr>
         <w:pBdr>
           <w:top w:val="nil"/>
           <w:left w:val="nil"/>
@@ -6662,12 +6740,146 @@
           <w:between w:val="nil"/>
         </w:pBdr>
         <w:spacing w:after="0"/>
-      </w:pPr>
-      <w:r>
-        <w:rPr>
-          <w:color w:val="000000"/>
-        </w:rPr>
-        <w:t>Qué se ha conseguido.</w:t>
+        <w:ind w:left="1776"/>
+      </w:pPr>
+    </w:p>
+    <w:p>
+      <w:pPr>
+        <w:numPr>
+          <w:ilvl w:val="2"/>
+          <w:numId w:val="9"/>
+        </w:numPr>
+        <w:pBdr>
+          <w:top w:val="nil"/>
+          <w:left w:val="nil"/>
+          <w:bottom w:val="nil"/>
+          <w:right w:val="nil"/>
+          <w:between w:val="nil"/>
+        </w:pBdr>
+      </w:pPr>
+      <w:r>
+        <w:rPr>
+          <w:color w:val="000000"/>
+        </w:rPr>
+        <w:t>Avance real vs planificado.</w:t>
+      </w:r>
+    </w:p>
+    <w:p>
+      <w:pPr>
+        <w:pBdr>
+          <w:top w:val="nil"/>
+          <w:left w:val="nil"/>
+          <w:bottom w:val="nil"/>
+          <w:right w:val="nil"/>
+          <w:between w:val="nil"/>
+        </w:pBdr>
+      </w:pPr>
+      <w:r>
+        <w:t xml:space="preserve">Logramos </w:t>
+      </w:r>
+      <w:proofErr w:type="spellStart"/>
+      <w:r>
+        <w:t>intalar</w:t>
+      </w:r>
+      <w:proofErr w:type="spellEnd"/>
+      <w:r>
+        <w:t xml:space="preserve"> muchas cosas como </w:t>
+      </w:r>
+      <w:proofErr w:type="spellStart"/>
+      <w:r>
+        <w:t>doker</w:t>
+      </w:r>
+      <w:proofErr w:type="spellEnd"/>
+      <w:r>
+        <w:t xml:space="preserve">, OVM extra, </w:t>
+      </w:r>
+      <w:proofErr w:type="spellStart"/>
+      <w:r>
+        <w:t>Portainer</w:t>
+      </w:r>
+      <w:proofErr w:type="spellEnd"/>
+      <w:r>
+        <w:t xml:space="preserve"> y casi todas las configuraciones detrás. Ademas </w:t>
+      </w:r>
+      <w:proofErr w:type="spellStart"/>
+      <w:r>
+        <w:t>intalamos</w:t>
+      </w:r>
+      <w:proofErr w:type="spellEnd"/>
+      <w:r>
+        <w:t xml:space="preserve"> una VPN que es un extra que </w:t>
+      </w:r>
+      <w:proofErr w:type="spellStart"/>
+      <w:r>
+        <w:t>nesesitavamos</w:t>
+      </w:r>
+      <w:proofErr w:type="spellEnd"/>
+      <w:r>
+        <w:t xml:space="preserve"> y no estaba planeado, aun </w:t>
+      </w:r>
+      <w:proofErr w:type="spellStart"/>
+      <w:r>
+        <w:t>asi</w:t>
+      </w:r>
+      <w:proofErr w:type="spellEnd"/>
+      <w:r>
+        <w:t xml:space="preserve"> se </w:t>
+      </w:r>
+      <w:proofErr w:type="spellStart"/>
+      <w:r>
+        <w:t>intalo</w:t>
+      </w:r>
+      <w:proofErr w:type="spellEnd"/>
+      <w:r>
+        <w:t xml:space="preserve"> y hacer pruebas muy </w:t>
+      </w:r>
+      <w:proofErr w:type="spellStart"/>
+      <w:r>
+        <w:t>rapido</w:t>
+      </w:r>
+      <w:proofErr w:type="spellEnd"/>
+      <w:r>
+        <w:t xml:space="preserve"> y pudimos utilizarla sin </w:t>
+      </w:r>
+      <w:proofErr w:type="spellStart"/>
+      <w:r>
+        <w:t>problkemas</w:t>
+      </w:r>
+      <w:proofErr w:type="spellEnd"/>
+      <w:r>
+        <w:t>.</w:t>
+      </w:r>
+    </w:p>
+    <w:p>
+      <w:pPr>
+        <w:pBdr>
+          <w:top w:val="nil"/>
+          <w:left w:val="nil"/>
+          <w:bottom w:val="nil"/>
+          <w:right w:val="nil"/>
+          <w:between w:val="nil"/>
+        </w:pBdr>
+      </w:pPr>
+    </w:p>
+    <w:p>
+      <w:pPr>
+        <w:ind w:left="720"/>
+      </w:pPr>
+      <w:proofErr w:type="spellStart"/>
+      <w:r>
+        <w:rPr>
+          <w:b/>
+          <w:bCs/>
+        </w:rPr>
+        <w:t>Revisió</w:t>
+      </w:r>
+      <w:proofErr w:type="spellEnd"/>
+      <w:r>
+        <w:rPr>
+          <w:b/>
+          <w:bCs/>
+        </w:rPr>
+        <w:t xml:space="preserve"> i retrospectiva</w:t>
       </w:r>
     </w:p>
     <w:p>
@@ -6689,8 +6901,391 @@
         <w:rPr>
           <w:color w:val="000000"/>
         </w:rPr>
+        <w:t>Qué se ha conseguido.</w:t>
+      </w:r>
+    </w:p>
+    <w:p>
+      <w:pPr>
+        <w:pBdr>
+          <w:top w:val="nil"/>
+          <w:left w:val="nil"/>
+          <w:bottom w:val="nil"/>
+          <w:right w:val="nil"/>
+          <w:between w:val="nil"/>
+        </w:pBdr>
+        <w:spacing w:after="0"/>
+        <w:ind w:left="1776"/>
+        <w:rPr>
+          <w:color w:val="000000"/>
+        </w:rPr>
+      </w:pPr>
+      <w:proofErr w:type="spellStart"/>
+      <w:r>
+        <w:rPr>
+          <w:color w:val="000000"/>
+        </w:rPr>
+        <w:t>Intalar</w:t>
+      </w:r>
+      <w:proofErr w:type="spellEnd"/>
+      <w:r>
+        <w:rPr>
+          <w:color w:val="000000"/>
+        </w:rPr>
+        <w:t xml:space="preserve"> </w:t>
+      </w:r>
+      <w:proofErr w:type="spellStart"/>
+      <w:r>
+        <w:rPr>
+          <w:color w:val="000000"/>
+        </w:rPr>
+        <w:t>ovm</w:t>
+      </w:r>
+      <w:proofErr w:type="spellEnd"/>
+      <w:r>
+        <w:rPr>
+          <w:color w:val="000000"/>
+        </w:rPr>
+        <w:t xml:space="preserve"> extras, configurarlo, crear todas las configuraciones </w:t>
+      </w:r>
+      <w:proofErr w:type="spellStart"/>
+      <w:r>
+        <w:rPr>
+          <w:color w:val="000000"/>
+        </w:rPr>
+        <w:t>nesesarias</w:t>
+      </w:r>
+      <w:proofErr w:type="spellEnd"/>
+      <w:r>
+        <w:rPr>
+          <w:color w:val="000000"/>
+        </w:rPr>
+        <w:t xml:space="preserve"> para </w:t>
+      </w:r>
+      <w:proofErr w:type="spellStart"/>
+      <w:r>
+        <w:rPr>
+          <w:color w:val="000000"/>
+        </w:rPr>
+        <w:t>intalar</w:t>
+      </w:r>
+      <w:proofErr w:type="spellEnd"/>
+      <w:r>
+        <w:rPr>
+          <w:color w:val="000000"/>
+        </w:rPr>
+        <w:t xml:space="preserve"> </w:t>
+      </w:r>
+      <w:proofErr w:type="spellStart"/>
+      <w:r>
+        <w:rPr>
+          <w:color w:val="000000"/>
+        </w:rPr>
+        <w:t>docker</w:t>
+      </w:r>
+      <w:proofErr w:type="spellEnd"/>
+      <w:r>
+        <w:rPr>
+          <w:color w:val="000000"/>
+        </w:rPr>
+        <w:t xml:space="preserve"> </w:t>
+      </w:r>
+      <w:proofErr w:type="spellStart"/>
+      <w:r>
+        <w:rPr>
+          <w:color w:val="000000"/>
+        </w:rPr>
+        <w:t>compose</w:t>
+      </w:r>
+      <w:proofErr w:type="spellEnd"/>
+      <w:r>
+        <w:rPr>
+          <w:color w:val="000000"/>
+        </w:rPr>
+        <w:t xml:space="preserve">, </w:t>
+      </w:r>
+      <w:proofErr w:type="spellStart"/>
+      <w:r>
+        <w:rPr>
+          <w:color w:val="000000"/>
+        </w:rPr>
+        <w:t>intalamos</w:t>
+      </w:r>
+      <w:proofErr w:type="spellEnd"/>
+      <w:r>
+        <w:rPr>
+          <w:color w:val="000000"/>
+        </w:rPr>
+        <w:t xml:space="preserve"> </w:t>
+      </w:r>
+      <w:proofErr w:type="spellStart"/>
+      <w:r>
+        <w:rPr>
+          <w:color w:val="000000"/>
+        </w:rPr>
+        <w:t>dockercopose</w:t>
+      </w:r>
+      <w:proofErr w:type="spellEnd"/>
+      <w:r>
+        <w:rPr>
+          <w:color w:val="000000"/>
+        </w:rPr>
+        <w:t xml:space="preserve">, dentro </w:t>
+      </w:r>
+      <w:proofErr w:type="spellStart"/>
+      <w:r>
+        <w:rPr>
+          <w:color w:val="000000"/>
+        </w:rPr>
+        <w:t>intalamos</w:t>
+      </w:r>
+      <w:proofErr w:type="spellEnd"/>
+      <w:r>
+        <w:rPr>
+          <w:color w:val="000000"/>
+        </w:rPr>
+        <w:t xml:space="preserve"> </w:t>
+      </w:r>
+      <w:proofErr w:type="spellStart"/>
+      <w:r>
+        <w:rPr>
+          <w:color w:val="000000"/>
+        </w:rPr>
+        <w:t>portainer</w:t>
+      </w:r>
+      <w:proofErr w:type="spellEnd"/>
+      <w:r>
+        <w:rPr>
+          <w:color w:val="000000"/>
+        </w:rPr>
+        <w:t xml:space="preserve"> y creamos el puerto para acceder a </w:t>
+      </w:r>
+      <w:proofErr w:type="spellStart"/>
+      <w:r>
+        <w:rPr>
+          <w:color w:val="000000"/>
+        </w:rPr>
+        <w:t>el</w:t>
+      </w:r>
+      <w:proofErr w:type="spellEnd"/>
+      <w:r>
+        <w:rPr>
+          <w:color w:val="000000"/>
+        </w:rPr>
+        <w:t xml:space="preserve">. Investigamos sobre como </w:t>
+      </w:r>
+      <w:proofErr w:type="spellStart"/>
+      <w:r>
+        <w:rPr>
+          <w:color w:val="000000"/>
+        </w:rPr>
+        <w:t>intalar</w:t>
+      </w:r>
+      <w:proofErr w:type="spellEnd"/>
+      <w:r>
+        <w:rPr>
+          <w:color w:val="000000"/>
+        </w:rPr>
+        <w:t xml:space="preserve"> una </w:t>
+      </w:r>
+      <w:proofErr w:type="spellStart"/>
+      <w:r>
+        <w:rPr>
+          <w:color w:val="000000"/>
+        </w:rPr>
+        <w:t>vpn</w:t>
+      </w:r>
+      <w:proofErr w:type="spellEnd"/>
+      <w:r>
+        <w:rPr>
+          <w:color w:val="000000"/>
+        </w:rPr>
+        <w:t xml:space="preserve">, </w:t>
+      </w:r>
+      <w:proofErr w:type="spellStart"/>
+      <w:r>
+        <w:rPr>
+          <w:color w:val="000000"/>
+        </w:rPr>
+        <w:t>intalamos</w:t>
+      </w:r>
+      <w:proofErr w:type="spellEnd"/>
+      <w:r>
+        <w:rPr>
+          <w:color w:val="000000"/>
+        </w:rPr>
+        <w:t xml:space="preserve"> la </w:t>
+      </w:r>
+      <w:proofErr w:type="spellStart"/>
+      <w:r>
+        <w:rPr>
+          <w:color w:val="000000"/>
+        </w:rPr>
+        <w:t>vpn</w:t>
+      </w:r>
+      <w:proofErr w:type="spellEnd"/>
+      <w:r>
+        <w:rPr>
+          <w:color w:val="000000"/>
+        </w:rPr>
+        <w:t xml:space="preserve">, hicimos todas las pruebas </w:t>
+      </w:r>
+      <w:proofErr w:type="spellStart"/>
+      <w:r>
+        <w:rPr>
+          <w:color w:val="000000"/>
+        </w:rPr>
+        <w:t>nesesarias</w:t>
+      </w:r>
+      <w:proofErr w:type="spellEnd"/>
+      <w:r>
+        <w:rPr>
+          <w:color w:val="000000"/>
+        </w:rPr>
+        <w:t xml:space="preserve"> para la </w:t>
+      </w:r>
+      <w:proofErr w:type="spellStart"/>
+      <w:r>
+        <w:rPr>
+          <w:color w:val="000000"/>
+        </w:rPr>
+        <w:t>vpn</w:t>
+      </w:r>
+      <w:proofErr w:type="spellEnd"/>
+      <w:r>
+        <w:rPr>
+          <w:color w:val="000000"/>
+        </w:rPr>
+        <w:t xml:space="preserve">. </w:t>
+      </w:r>
+      <w:proofErr w:type="spellStart"/>
+      <w:r>
+        <w:rPr>
+          <w:color w:val="000000"/>
+        </w:rPr>
+        <w:t>Intalamos</w:t>
+      </w:r>
+      <w:proofErr w:type="spellEnd"/>
+      <w:r>
+        <w:rPr>
+          <w:color w:val="000000"/>
+        </w:rPr>
+        <w:t xml:space="preserve"> varios </w:t>
+      </w:r>
+      <w:proofErr w:type="spellStart"/>
+      <w:r>
+        <w:rPr>
+          <w:color w:val="000000"/>
+        </w:rPr>
+        <w:t>plugins</w:t>
+      </w:r>
+      <w:proofErr w:type="spellEnd"/>
+      <w:r>
+        <w:rPr>
+          <w:color w:val="000000"/>
+        </w:rPr>
+        <w:t xml:space="preserve"> en el server, configuramos varas cosas de red para que </w:t>
+      </w:r>
+      <w:proofErr w:type="gramStart"/>
+      <w:r>
+        <w:rPr>
+          <w:color w:val="000000"/>
+        </w:rPr>
+        <w:t>funciona</w:t>
+      </w:r>
+      <w:proofErr w:type="gramEnd"/>
+      <w:r>
+        <w:rPr>
+          <w:color w:val="000000"/>
+        </w:rPr>
+        <w:t xml:space="preserve"> con los cambios constantes</w:t>
+      </w:r>
+    </w:p>
+    <w:p>
+      <w:pPr>
+        <w:pBdr>
+          <w:top w:val="nil"/>
+          <w:left w:val="nil"/>
+          <w:bottom w:val="nil"/>
+          <w:right w:val="nil"/>
+          <w:between w:val="nil"/>
+        </w:pBdr>
+        <w:spacing w:after="0"/>
+        <w:ind w:left="1776"/>
+      </w:pPr>
+    </w:p>
+    <w:p>
+      <w:pPr>
+        <w:numPr>
+          <w:ilvl w:val="0"/>
+          <w:numId w:val="10"/>
+        </w:numPr>
+        <w:pBdr>
+          <w:top w:val="nil"/>
+          <w:left w:val="nil"/>
+          <w:bottom w:val="nil"/>
+          <w:right w:val="nil"/>
+          <w:between w:val="nil"/>
+        </w:pBdr>
+        <w:spacing w:after="0"/>
+      </w:pPr>
+      <w:r>
+        <w:rPr>
+          <w:color w:val="000000"/>
+        </w:rPr>
         <w:t>Qué no se ha podido hacer y por qué.</w:t>
       </w:r>
+    </w:p>
+    <w:p>
+      <w:pPr>
+        <w:pBdr>
+          <w:top w:val="nil"/>
+          <w:left w:val="nil"/>
+          <w:bottom w:val="nil"/>
+          <w:right w:val="nil"/>
+          <w:between w:val="nil"/>
+        </w:pBdr>
+        <w:spacing w:after="0"/>
+        <w:ind w:left="1776"/>
+        <w:rPr>
+          <w:color w:val="000000"/>
+        </w:rPr>
+      </w:pPr>
+      <w:r>
+        <w:rPr>
+          <w:color w:val="000000"/>
+        </w:rPr>
+        <w:t xml:space="preserve">Desplegar </w:t>
+      </w:r>
+      <w:proofErr w:type="spellStart"/>
+      <w:r>
+        <w:rPr>
+          <w:color w:val="000000"/>
+        </w:rPr>
+        <w:t>Nextcloud</w:t>
+      </w:r>
+      <w:proofErr w:type="spellEnd"/>
+      <w:r>
+        <w:rPr>
+          <w:color w:val="000000"/>
+        </w:rPr>
+        <w:t xml:space="preserve"> en el server, no pudimos por falta de tiempo por los problemas constantes con la red</w:t>
+      </w:r>
+    </w:p>
+    <w:p>
+      <w:pPr>
+        <w:pBdr>
+          <w:top w:val="nil"/>
+          <w:left w:val="nil"/>
+          <w:bottom w:val="nil"/>
+          <w:right w:val="nil"/>
+          <w:between w:val="nil"/>
+        </w:pBdr>
+        <w:spacing w:after="0"/>
+        <w:ind w:left="1776"/>
+        <w:rPr>
+          <w:u w:val="single"/>
+        </w:rPr>
+      </w:pPr>
     </w:p>
     <w:p>
       <w:pPr>
@@ -11547,6 +12142,7 @@
   <w:style w:type="character" w:default="1" w:styleId="Fuentedeprrafopredeter">
     <w:name w:val="Default Paragraph Font"/>
     <w:uiPriority w:val="1"/>
+    <w:semiHidden/>
     <w:unhideWhenUsed/>
   </w:style>
   <w:style w:type="table" w:default="1" w:styleId="Tablanormal">

</xml_diff>

<commit_message>
Nueva informacion añadida al documento
</commit_message>
<xml_diff>
--- a/docs/General/Proyecto Final Daniel.O y Arnau.S.docx
+++ b/docs/General/Proyecto Final Daniel.O y Arnau.S.docx
@@ -602,31 +602,7 @@
     </w:p>
     <w:p>
       <w:r>
-        <w:t xml:space="preserve">El proyecto consiste en crear un servicio de almacenamiento en la nube privado para una empresa ficticia, utilizando </w:t>
-      </w:r>
-      <w:proofErr w:type="spellStart"/>
-      <w:r>
-        <w:t>Nextcloud</w:t>
-      </w:r>
-      <w:proofErr w:type="spellEnd"/>
-      <w:r>
-        <w:t xml:space="preserve"> instalado como </w:t>
-      </w:r>
-      <w:proofErr w:type="spellStart"/>
-      <w:r>
-        <w:t>docker</w:t>
-      </w:r>
-      <w:proofErr w:type="spellEnd"/>
-      <w:r>
-        <w:t xml:space="preserve"> en un servidor con el sistema operativo open </w:t>
-      </w:r>
-      <w:proofErr w:type="spellStart"/>
-      <w:r>
-        <w:t>mediavault</w:t>
-      </w:r>
-      <w:proofErr w:type="spellEnd"/>
-      <w:r>
-        <w:t>. Su finalidad es ofrecer una alternativa segura, controlada y funcional a servicios como Google Drive o Dropbox, permitiendo almacenar, compartir y sincronizar archivos desde cualquier dispositivo.</w:t>
+        <w:t>El proyecto consiste en crear un servicio de almacenamiento en la nube privado para una empresa ficticia, utilizando Nextcloud instalado como docker en un servidor con el sistema operativo open mediavault. Su finalidad es ofrecer una alternativa segura, controlada y funcional a servicios como Google Drive o Dropbox, permitiendo almacenar, compartir y sincronizar archivos desde cualquier dispositivo.</w:t>
       </w:r>
     </w:p>
     <w:p/>
@@ -647,97 +623,17 @@
     </w:p>
     <w:p>
       <w:r>
-        <w:t xml:space="preserve">El proyecto desarrolla la implementación de un sistema de cloud privado mediante la instalación y configuración de la plataforma </w:t>
-      </w:r>
-      <w:proofErr w:type="spellStart"/>
-      <w:r>
-        <w:t>Nextcloud</w:t>
-      </w:r>
-      <w:proofErr w:type="spellEnd"/>
-      <w:r>
-        <w:t xml:space="preserve"> en un servidor </w:t>
-      </w:r>
-      <w:proofErr w:type="spellStart"/>
-      <w:r>
-        <w:t>openmediavaul</w:t>
-      </w:r>
-      <w:proofErr w:type="spellEnd"/>
-      <w:r>
-        <w:t>. Este servicio permitirá a los empleados de una empresa ficticia almacenar, sincronizar y compartir archivos de forma segura, garantizando el acceso desde diferentes dispositivos y mejorando la colaboración interna.</w:t>
-      </w:r>
-    </w:p>
-    <w:p>
-      <w:r>
-        <w:t xml:space="preserve">Para conseguirlo, se instalarán todos los componentes necesarios, necesitamos un servidor con </w:t>
-      </w:r>
-      <w:proofErr w:type="spellStart"/>
-      <w:r>
-        <w:t>openmediavault</w:t>
-      </w:r>
-      <w:proofErr w:type="spellEnd"/>
-      <w:r>
-        <w:t xml:space="preserve"> e instalar </w:t>
-      </w:r>
-      <w:proofErr w:type="spellStart"/>
-      <w:r>
-        <w:t>nextcloud</w:t>
-      </w:r>
-      <w:proofErr w:type="spellEnd"/>
-      <w:r>
-        <w:t xml:space="preserve"> con </w:t>
-      </w:r>
-      <w:proofErr w:type="spellStart"/>
-      <w:r>
-        <w:t>docker</w:t>
-      </w:r>
-      <w:proofErr w:type="spellEnd"/>
-      <w:r>
-        <w:t xml:space="preserve">, incluyendo también instalar todo lo necesario para que funcione todo con permisos, </w:t>
-      </w:r>
-      <w:proofErr w:type="spellStart"/>
-      <w:r>
-        <w:t>backups</w:t>
-      </w:r>
-      <w:proofErr w:type="spellEnd"/>
-      <w:r>
-        <w:t xml:space="preserve"> y sistema de usuarios con carpetas personales… </w:t>
-      </w:r>
-      <w:proofErr w:type="spellStart"/>
-      <w:r>
-        <w:t>andemas</w:t>
-      </w:r>
-      <w:proofErr w:type="spellEnd"/>
-      <w:r>
-        <w:t xml:space="preserve"> instalar todo para proteger las comunicaciones. También se crearán usuarios, grupos y permisos, asegurando que cada empleado tenga acceso únicamente a los recursos autorizados.</w:t>
-      </w:r>
-    </w:p>
-    <w:p>
-      <w:r>
-        <w:t xml:space="preserve">El proyecto incluirá medidas de seguridad como firewall con UFW, cifrado SSL mediante </w:t>
-      </w:r>
-      <w:proofErr w:type="spellStart"/>
-      <w:r>
-        <w:t>Let’s</w:t>
-      </w:r>
-      <w:proofErr w:type="spellEnd"/>
-      <w:r>
-        <w:t xml:space="preserve"> </w:t>
-      </w:r>
-      <w:proofErr w:type="spellStart"/>
-      <w:r>
-        <w:t>Encrypt</w:t>
-      </w:r>
-      <w:proofErr w:type="spellEnd"/>
-      <w:r>
-        <w:t xml:space="preserve">, protección contra intrusiones con Fail2ban y un sistema de copias de seguridad automáticas tanto del directorio de datos como de la base de datos. Se configurarán clientes de </w:t>
-      </w:r>
-      <w:proofErr w:type="spellStart"/>
-      <w:r>
-        <w:t>Nextcloud</w:t>
-      </w:r>
-      <w:proofErr w:type="spellEnd"/>
-      <w:r>
-        <w:t xml:space="preserve"> en equipos Windows y dispositivos móviles para garantizar el uso real del sistema por parte de los usuarios.</w:t>
+        <w:t>El proyecto desarrolla la implementación de un sistema de cloud privado mediante la instalación y configuración de la plataforma Nextcloud en un servidor openmediavaul. Este servicio permitirá a los empleados de una empresa ficticia almacenar, sincronizar y compartir archivos de forma segura, garantizando el acceso desde diferentes dispositivos y mejorando la colaboración interna.</w:t>
+      </w:r>
+    </w:p>
+    <w:p>
+      <w:r>
+        <w:t>Para conseguirlo, se instalarán todos los componentes necesarios, necesitamos un servidor con openmediavault e instalar nextcloud con docker, incluyendo también instalar todo lo necesario para que funcione todo con permisos, backups y sistema de usuarios con carpetas personales… andemas instalar todo para proteger las comunicaciones. También se crearán usuarios, grupos y permisos, asegurando que cada empleado tenga acceso únicamente a los recursos autorizados.</w:t>
+      </w:r>
+    </w:p>
+    <w:p>
+      <w:r>
+        <w:t>El proyecto incluirá medidas de seguridad como firewall con UFW, cifrado SSL mediante Let’s Encrypt, protección contra intrusiones con Fail2ban y un sistema de copias de seguridad automáticas tanto del directorio de datos como de la base de datos. Se configurarán clientes de Nextcloud en equipos Windows y dispositivos móviles para garantizar el uso real del sistema por parte de los usuarios.</w:t>
       </w:r>
     </w:p>
     <w:p>
@@ -778,15 +674,11 @@
     </w:p>
     <w:p>
       <w:r>
-        <w:t xml:space="preserve">Actualmente, las empresas utilizan servicios como Google Drive, Dropbox o OneDrive para el almacenamiento y la colaboración en la nube. Sin embargo, estos servicios dependen de servidores externos y no ofrecen control total sobre los datos. </w:t>
-      </w:r>
-      <w:proofErr w:type="spellStart"/>
-      <w:r>
-        <w:t>Nextcloud</w:t>
-      </w:r>
-      <w:proofErr w:type="spellEnd"/>
-      <w:r>
-        <w:t xml:space="preserve"> surge como una alternativa de software libre que permite implementar una nube privada, ofreciendo:</w:t>
+        <w:t xml:space="preserve">Actualmente, las empresas utilizan servicios como Google Drive, Dropbox o OneDrive para el almacenamiento y la colaboración en la nube. Sin embargo, </w:t>
+      </w:r>
+      <w:r>
+        <w:lastRenderedPageBreak/>
+        <w:t>estos servicios dependen de servidores externos y no ofrecen control total sobre los datos. Nextcloud surge como una alternativa de software libre que permite implementar una nube privada, ofreciendo:</w:t>
       </w:r>
     </w:p>
     <w:p>
@@ -881,7 +773,6 @@
           <w:bCs/>
         </w:rPr>
       </w:pPr>
-      <w:proofErr w:type="gramStart"/>
       <w:r>
         <w:rPr>
           <w:b/>
@@ -889,19 +780,10 @@
         </w:rPr>
         <w:t>Requisitos :</w:t>
       </w:r>
-      <w:proofErr w:type="gramEnd"/>
-    </w:p>
-    <w:p>
-      <w:r>
-        <w:t xml:space="preserve">Para implementar el servidor </w:t>
-      </w:r>
-      <w:proofErr w:type="spellStart"/>
-      <w:r>
-        <w:t>Nextcloud</w:t>
-      </w:r>
-      <w:proofErr w:type="spellEnd"/>
-      <w:r>
-        <w:t xml:space="preserve"> se necesitan los siguientes recursos técnicos:</w:t>
+    </w:p>
+    <w:p>
+      <w:r>
+        <w:t>Para implementar el servidor Nextcloud se necesitan los siguientes recursos técnicos:</w:t>
       </w:r>
     </w:p>
     <w:p>
@@ -1224,21 +1106,7 @@
         <w:rPr>
           <w:color w:val="000000"/>
         </w:rPr>
-        <w:t xml:space="preserve"> Apache o </w:t>
-      </w:r>
-      <w:proofErr w:type="spellStart"/>
-      <w:r>
-        <w:rPr>
-          <w:color w:val="000000"/>
-        </w:rPr>
-        <w:t>Nginx</w:t>
-      </w:r>
-      <w:proofErr w:type="spellEnd"/>
-      <w:r>
-        <w:rPr>
-          <w:color w:val="000000"/>
-        </w:rPr>
-        <w:t>.</w:t>
+        <w:t xml:space="preserve"> Apache o Nginx.</w:t>
       </w:r>
     </w:p>
     <w:p>
@@ -1268,16 +1136,8 @@
         <w:rPr>
           <w:color w:val="000000"/>
         </w:rPr>
-        <w:t xml:space="preserve"> </w:t>
-      </w:r>
-      <w:proofErr w:type="spellStart"/>
-      <w:r>
-        <w:rPr>
-          <w:color w:val="000000"/>
-        </w:rPr>
-        <w:t>MariaDB</w:t>
-      </w:r>
-      <w:proofErr w:type="spellEnd"/>
+        <w:t xml:space="preserve"> MariaDB</w:t>
+      </w:r>
     </w:p>
     <w:p>
       <w:pPr>
@@ -1306,21 +1166,7 @@
         <w:rPr>
           <w:color w:val="000000"/>
         </w:rPr>
-        <w:t xml:space="preserve"> PHP con módulos necesarios para </w:t>
-      </w:r>
-      <w:proofErr w:type="spellStart"/>
-      <w:r>
-        <w:rPr>
-          <w:color w:val="000000"/>
-        </w:rPr>
-        <w:t>Nextcloud</w:t>
-      </w:r>
-      <w:proofErr w:type="spellEnd"/>
-      <w:r>
-        <w:rPr>
-          <w:color w:val="000000"/>
-        </w:rPr>
-        <w:t>.</w:t>
+        <w:t xml:space="preserve"> PHP con módulos necesarios para Nextcloud.</w:t>
       </w:r>
     </w:p>
     <w:p>
@@ -1350,35 +1196,7 @@
         <w:rPr>
           <w:color w:val="000000"/>
         </w:rPr>
-        <w:t xml:space="preserve"> </w:t>
-      </w:r>
-      <w:proofErr w:type="spellStart"/>
-      <w:r>
-        <w:rPr>
-          <w:color w:val="000000"/>
-        </w:rPr>
-        <w:t>Let’s</w:t>
-      </w:r>
-      <w:proofErr w:type="spellEnd"/>
-      <w:r>
-        <w:rPr>
-          <w:color w:val="000000"/>
-        </w:rPr>
-        <w:t xml:space="preserve"> </w:t>
-      </w:r>
-      <w:proofErr w:type="spellStart"/>
-      <w:r>
-        <w:rPr>
-          <w:color w:val="000000"/>
-        </w:rPr>
-        <w:t>Encrypt</w:t>
-      </w:r>
-      <w:proofErr w:type="spellEnd"/>
-      <w:r>
-        <w:rPr>
-          <w:color w:val="000000"/>
-        </w:rPr>
-        <w:t xml:space="preserve"> para HTTPS.</w:t>
+        <w:t xml:space="preserve"> Let’s Encrypt para HTTPS.</w:t>
       </w:r>
     </w:p>
     <w:p>
@@ -1432,6 +1250,7 @@
           <w:bCs/>
           <w:color w:val="000000"/>
         </w:rPr>
+        <w:lastRenderedPageBreak/>
         <w:t>Herramientas de seguridad:</w:t>
       </w:r>
       <w:r>
@@ -1489,21 +1308,7 @@
         <w:rPr>
           <w:color w:val="000000"/>
         </w:rPr>
-        <w:t xml:space="preserve">Backup automático del directorio de datos de </w:t>
-      </w:r>
-      <w:proofErr w:type="spellStart"/>
-      <w:r>
-        <w:rPr>
-          <w:color w:val="000000"/>
-        </w:rPr>
-        <w:t>Nextcloud</w:t>
-      </w:r>
-      <w:proofErr w:type="spellEnd"/>
-      <w:r>
-        <w:rPr>
-          <w:color w:val="000000"/>
-        </w:rPr>
-        <w:t>.</w:t>
+        <w:t>Backup automático del directorio de datos de Nextcloud.</w:t>
       </w:r>
     </w:p>
     <w:p>
@@ -1601,21 +1406,7 @@
         <w:rPr>
           <w:color w:val="000000"/>
         </w:rPr>
-        <w:t xml:space="preserve"> Clientes de </w:t>
-      </w:r>
-      <w:proofErr w:type="spellStart"/>
-      <w:r>
-        <w:rPr>
-          <w:color w:val="000000"/>
-        </w:rPr>
-        <w:t>Nextcloud</w:t>
-      </w:r>
-      <w:proofErr w:type="spellEnd"/>
-      <w:r>
-        <w:rPr>
-          <w:color w:val="000000"/>
-        </w:rPr>
-        <w:t xml:space="preserve"> instalados en equipos Windows y dispositivos móviles.</w:t>
+        <w:t xml:space="preserve"> Clientes de Nextcloud instalados en equipos Windows y dispositivos móviles.</w:t>
       </w:r>
     </w:p>
     <w:p>
@@ -1669,37 +1460,13 @@
           <w:bCs/>
           <w:color w:val="000000"/>
         </w:rPr>
-        <w:t xml:space="preserve">Cron </w:t>
-      </w:r>
-      <w:proofErr w:type="spellStart"/>
-      <w:r>
-        <w:rPr>
-          <w:b/>
-          <w:bCs/>
-          <w:color w:val="000000"/>
-        </w:rPr>
-        <w:t>jobs</w:t>
-      </w:r>
-      <w:proofErr w:type="spellEnd"/>
-      <w:r>
-        <w:rPr>
-          <w:color w:val="000000"/>
-        </w:rPr>
-        <w:t xml:space="preserve"> configurados para tareas internas de </w:t>
-      </w:r>
-      <w:proofErr w:type="spellStart"/>
-      <w:r>
-        <w:rPr>
-          <w:color w:val="000000"/>
-        </w:rPr>
-        <w:t>Nextcloud</w:t>
-      </w:r>
-      <w:proofErr w:type="spellEnd"/>
-      <w:r>
-        <w:rPr>
-          <w:color w:val="000000"/>
-        </w:rPr>
-        <w:t>.</w:t>
+        <w:t>Cron jobs</w:t>
+      </w:r>
+      <w:r>
+        <w:rPr>
+          <w:color w:val="000000"/>
+        </w:rPr>
+        <w:t xml:space="preserve"> configurados para tareas internas de Nextcloud.</w:t>
       </w:r>
     </w:p>
     <w:p>
@@ -1815,36 +1582,14 @@
         <w:rPr>
           <w:color w:val="000000"/>
         </w:rPr>
-        <w:t xml:space="preserve"> (</w:t>
-      </w:r>
-      <w:proofErr w:type="spellStart"/>
-      <w:r>
-        <w:rPr>
-          <w:color w:val="000000"/>
-        </w:rPr>
-        <w:t>Apac</w:t>
-      </w:r>
-      <w:proofErr w:type="spellEnd"/>
+        <w:t xml:space="preserve"> (Apac</w:t>
+      </w:r>
       <w:r>
         <w:rPr>
           <w:color w:val="000000"/>
         </w:rPr>
         <w:tab/>
-        <w:t>he/</w:t>
-      </w:r>
-      <w:proofErr w:type="spellStart"/>
-      <w:r>
-        <w:rPr>
-          <w:color w:val="000000"/>
-        </w:rPr>
-        <w:t>Nginx</w:t>
-      </w:r>
-      <w:proofErr w:type="spellEnd"/>
-      <w:r>
-        <w:rPr>
-          <w:color w:val="000000"/>
-        </w:rPr>
-        <w:t>).</w:t>
+        <w:t>he/Nginx).</w:t>
       </w:r>
     </w:p>
     <w:p>
@@ -1877,21 +1622,7 @@
         <w:rPr>
           <w:color w:val="000000"/>
         </w:rPr>
-        <w:t xml:space="preserve"> (</w:t>
-      </w:r>
-      <w:proofErr w:type="spellStart"/>
-      <w:r>
-        <w:rPr>
-          <w:color w:val="000000"/>
-        </w:rPr>
-        <w:t>MariaDB</w:t>
-      </w:r>
-      <w:proofErr w:type="spellEnd"/>
-      <w:r>
-        <w:rPr>
-          <w:color w:val="000000"/>
-        </w:rPr>
-        <w:t>).</w:t>
+        <w:t xml:space="preserve"> (MariaDB).</w:t>
       </w:r>
     </w:p>
     <w:p>
@@ -1990,21 +1721,7 @@
         <w:rPr>
           <w:color w:val="000000"/>
         </w:rPr>
-        <w:t xml:space="preserve"> dentro de </w:t>
-      </w:r>
-      <w:proofErr w:type="spellStart"/>
-      <w:r>
-        <w:rPr>
-          <w:color w:val="000000"/>
-        </w:rPr>
-        <w:t>Nextcloud</w:t>
-      </w:r>
-      <w:proofErr w:type="spellEnd"/>
-      <w:r>
-        <w:rPr>
-          <w:color w:val="000000"/>
-        </w:rPr>
-        <w:t>.</w:t>
+        <w:t xml:space="preserve"> dentro de Nextcloud.</w:t>
       </w:r>
     </w:p>
     <w:p>
@@ -2070,21 +1787,7 @@
         <w:rPr>
           <w:color w:val="000000"/>
         </w:rPr>
-        <w:t xml:space="preserve"> del servidor a largo plazo (actualizaciones, monitorización, </w:t>
-      </w:r>
-      <w:proofErr w:type="spellStart"/>
-      <w:r>
-        <w:rPr>
-          <w:color w:val="000000"/>
-        </w:rPr>
-        <w:t>backups</w:t>
-      </w:r>
-      <w:proofErr w:type="spellEnd"/>
-      <w:r>
-        <w:rPr>
-          <w:color w:val="000000"/>
-        </w:rPr>
-        <w:t>).</w:t>
+        <w:t xml:space="preserve"> del servidor a largo plazo (actualizaciones, monitorización, backups).</w:t>
       </w:r>
     </w:p>
     <w:p>
@@ -2200,6 +1903,7 @@
         <w:br/>
       </w:r>
       <w:r>
+        <w:lastRenderedPageBreak/>
         <w:br/>
       </w:r>
     </w:p>
@@ -2561,11 +2265,7 @@
         <w:ind w:left="720"/>
       </w:pPr>
       <w:r>
-        <w:t xml:space="preserve">Se encargará de hacer una documentación de todo lo necesario para darle seguridad a nuestro servidor todo lo que se instalará, </w:t>
-      </w:r>
-      <w:proofErr w:type="spellStart"/>
-      <w:r>
-        <w:t xml:space="preserve">el </w:t>
+        <w:t xml:space="preserve">Se encargará de hacer una documentación de todo lo necesario para darle seguridad a nuestro servidor todo lo que se instalará, el </w:t>
       </w:r>
       <w:r>
         <w:rPr>
@@ -2573,7 +2273,6 @@
         </w:rPr>
         <w:t>porqué</w:t>
       </w:r>
-      <w:proofErr w:type="spellEnd"/>
       <w:r>
         <w:t xml:space="preserve"> y cómo</w:t>
       </w:r>
@@ -2612,15 +2311,7 @@
         <w:ind w:left="1276"/>
       </w:pPr>
       <w:r>
-        <w:t>Elegir sistema operativo (</w:t>
-      </w:r>
-      <w:proofErr w:type="spellStart"/>
-      <w:r>
-        <w:t>openmediavault</w:t>
-      </w:r>
-      <w:proofErr w:type="spellEnd"/>
-      <w:r>
-        <w:t>)</w:t>
+        <w:t>Elegir sistema operativo (openmediavault)</w:t>
       </w:r>
     </w:p>
     <w:p>
@@ -2656,15 +2347,7 @@
         <w:ind w:left="1276"/>
       </w:pPr>
       <w:r>
-        <w:t xml:space="preserve">Decidir qué servicios se van a instalar (Apache, </w:t>
-      </w:r>
-      <w:proofErr w:type="spellStart"/>
-      <w:r>
-        <w:t>MariaDB</w:t>
-      </w:r>
-      <w:proofErr w:type="spellEnd"/>
-      <w:r>
-        <w:t>, PHP…)</w:t>
+        <w:t>Decidir qué servicios se van a instalar (Apache, MariaDB, PHP…)</w:t>
       </w:r>
     </w:p>
     <w:p>
@@ -2676,15 +2359,7 @@
         <w:ind w:left="1276"/>
       </w:pPr>
       <w:r>
-        <w:t xml:space="preserve">Planificación de seguridad (firewall, HTTPS, </w:t>
-      </w:r>
-      <w:proofErr w:type="gramStart"/>
-      <w:r>
-        <w:t>backups,fail</w:t>
-      </w:r>
-      <w:proofErr w:type="gramEnd"/>
-      <w:r>
-        <w:t>2ban)</w:t>
+        <w:t>Planificación de seguridad (firewall, HTTPS, backups,fail2ban)</w:t>
       </w:r>
     </w:p>
     <w:p>
@@ -2765,15 +2440,7 @@
         <w:t>planificación y preparación</w:t>
       </w:r>
       <w:r>
-        <w:t xml:space="preserve">, sirviendo como base para el correcto desarrollo de los siguientes </w:t>
-      </w:r>
-      <w:proofErr w:type="spellStart"/>
-      <w:r>
-        <w:t>sprints</w:t>
-      </w:r>
-      <w:proofErr w:type="spellEnd"/>
-      <w:r>
-        <w:t>. Al tratarse del inicio del proyecto, el ritmo de trabajo ha sido más tranquilo y enfocado en la organización general del equipo y del proyecto.</w:t>
+        <w:t>, sirviendo como base para el correcto desarrollo de los siguientes sprints. Al tratarse del inicio del proyecto, el ritmo de trabajo ha sido más tranquilo y enfocado en la organización general del equipo y del proyecto.</w:t>
       </w:r>
     </w:p>
     <w:p>
@@ -2819,15 +2486,7 @@
         <w:t>organización del tablero de Trello</w:t>
       </w:r>
       <w:r>
-        <w:t xml:space="preserve">, estructurándolo de manera que sea funcional y fácil de usar en los próximos </w:t>
-      </w:r>
-      <w:proofErr w:type="spellStart"/>
-      <w:r>
-        <w:t>sprints</w:t>
-      </w:r>
-      <w:proofErr w:type="spellEnd"/>
-      <w:r>
-        <w:t>. Se han creado las listas necesarias para el seguimiento de tareas (pendientes, en proceso y finalizadas), dejando preparado el entorno de trabajo colaborativo.</w:t>
+        <w:t>, estructurándolo de manera que sea funcional y fácil de usar en los próximos sprints. Se han creado las listas necesarias para el seguimiento de tareas (pendientes, en proceso y finalizadas), dejando preparado el entorno de trabajo colaborativo.</w:t>
       </w:r>
     </w:p>
     <w:p>
@@ -3045,15 +2704,7 @@
         <w:spacing w:after="0"/>
       </w:pPr>
       <w:r>
-        <w:t xml:space="preserve">Planificar el desarrollo del proyecto, distribuyendo el trabajo a lo largo de los distintos </w:t>
-      </w:r>
-      <w:proofErr w:type="spellStart"/>
-      <w:r>
-        <w:t>sprints</w:t>
-      </w:r>
-      <w:proofErr w:type="spellEnd"/>
-      <w:r>
-        <w:t>.</w:t>
+        <w:t>Planificar el desarrollo del proyecto, distribuyendo el trabajo a lo largo de los distintos sprints.</w:t>
       </w:r>
       <w:r>
         <w:br/>
@@ -3100,17 +2751,8 @@
           <w:b/>
           <w:bCs/>
         </w:rPr>
-        <w:t xml:space="preserve">sistema operativo y </w:t>
-      </w:r>
-      <w:proofErr w:type="gramStart"/>
-      <w:r>
-        <w:rPr>
-          <w:b/>
-          <w:bCs/>
-        </w:rPr>
-        <w:t>el hardware seleccionados</w:t>
-      </w:r>
-      <w:proofErr w:type="gramEnd"/>
+        <w:t>sistema operativo y el hardware seleccionados</w:t>
+      </w:r>
       <w:r>
         <w:t xml:space="preserve"> son adecuados para el proyecto.</w:t>
       </w:r>
@@ -3208,15 +2850,7 @@
         <w:t>eficiencia en la gestión del tiempo</w:t>
       </w:r>
       <w:r>
-        <w:t xml:space="preserve">. En este primer sprint el ritmo de trabajo ha sido más relajado, lo cual es comprensible al tratarse de la fase inicial, pero en los próximos </w:t>
-      </w:r>
-      <w:proofErr w:type="spellStart"/>
-      <w:r>
-        <w:t>sprints</w:t>
-      </w:r>
-      <w:proofErr w:type="spellEnd"/>
-      <w:r>
-        <w:t xml:space="preserve"> será importante optimizar el tiempo y mantener un ritmo de trabajo más constante para cumplir los plazos establecidos.</w:t>
+        <w:t>. En este primer sprint el ritmo de trabajo ha sido más relajado, lo cual es comprensible al tratarse de la fase inicial, pero en los próximos sprints será importante optimizar el tiempo y mantener un ritmo de trabajo más constante para cumplir los plazos establecidos.</w:t>
       </w:r>
     </w:p>
     <w:p>
@@ -3428,31 +3062,7 @@
           <w:sz w:val="34"/>
           <w:szCs w:val="34"/>
         </w:rPr>
-        <w:t xml:space="preserve">2 </w:t>
-      </w:r>
-      <w:proofErr w:type="gramStart"/>
-      <w:r>
-        <w:rPr>
-          <w:rFonts w:ascii="Aptos" w:eastAsia="Aptos" w:hAnsi="Aptos" w:cs="Aptos"/>
-          <w:b/>
-          <w:bCs/>
-          <w:color w:val="000000"/>
-          <w:sz w:val="34"/>
-          <w:szCs w:val="34"/>
-        </w:rPr>
-        <w:t>Objetivos</w:t>
-      </w:r>
-      <w:proofErr w:type="gramEnd"/>
-      <w:r>
-        <w:rPr>
-          <w:rFonts w:ascii="Aptos" w:eastAsia="Aptos" w:hAnsi="Aptos" w:cs="Aptos"/>
-          <w:b/>
-          <w:bCs/>
-          <w:color w:val="000000"/>
-          <w:sz w:val="34"/>
-          <w:szCs w:val="34"/>
-        </w:rPr>
-        <w:t xml:space="preserve"> del sprint</w:t>
+        <w:t>2 Objetivos del sprint</w:t>
       </w:r>
     </w:p>
     <w:p>
@@ -3470,45 +3080,69 @@
         <w:t>preparar y dejar operativo el entorno base del servidor</w:t>
       </w:r>
       <w:r>
-        <w:t xml:space="preserve">, sobre el cual se desplegarán los servicios del proyecto en los siguientes </w:t>
-      </w:r>
-      <w:proofErr w:type="spellStart"/>
-      <w:r>
-        <w:t>sprints</w:t>
-      </w:r>
-      <w:proofErr w:type="spellEnd"/>
+        <w:t>, sobre el cual se desplegarán los servicios del proyecto en los siguientes sprints.</w:t>
+      </w:r>
+    </w:p>
+    <w:p>
+      <w:pPr>
+        <w:spacing w:before="240" w:after="240"/>
+      </w:pPr>
+      <w:r>
+        <w:t>Durante este sprint se pretende:</w:t>
+      </w:r>
+    </w:p>
+    <w:p>
+      <w:pPr>
+        <w:numPr>
+          <w:ilvl w:val="0"/>
+          <w:numId w:val="1"/>
+        </w:numPr>
+        <w:spacing w:before="240" w:after="0"/>
+      </w:pPr>
+      <w:r>
+        <w:t xml:space="preserve">Instalar y configurar el sistema operativo </w:t>
+      </w:r>
+      <w:r>
+        <w:rPr>
+          <w:b/>
+          <w:bCs/>
+        </w:rPr>
+        <w:t>OpenMediaVault</w:t>
+      </w:r>
       <w:r>
         <w:t>.</w:t>
       </w:r>
     </w:p>
     <w:p>
       <w:pPr>
-        <w:spacing w:before="240" w:after="240"/>
-      </w:pPr>
-      <w:r>
-        <w:t>Durante este sprint se pretende:</w:t>
-      </w:r>
-    </w:p>
-    <w:p>
-      <w:pPr>
         <w:numPr>
           <w:ilvl w:val="0"/>
           <w:numId w:val="1"/>
         </w:numPr>
-        <w:spacing w:before="240" w:after="0"/>
-      </w:pPr>
-      <w:r>
-        <w:t xml:space="preserve">Instalar y configurar el sistema operativo </w:t>
-      </w:r>
-      <w:proofErr w:type="spellStart"/>
-      <w:r>
-        <w:rPr>
-          <w:b/>
-          <w:bCs/>
-        </w:rPr>
-        <w:t>OpenMediaVault</w:t>
-      </w:r>
-      <w:proofErr w:type="spellEnd"/>
+        <w:spacing w:after="0"/>
+      </w:pPr>
+      <w:r>
+        <w:t>Preparar el entorno de almacenamiento y red del servidor.</w:t>
+      </w:r>
+    </w:p>
+    <w:p>
+      <w:pPr>
+        <w:numPr>
+          <w:ilvl w:val="0"/>
+          <w:numId w:val="1"/>
+        </w:numPr>
+        <w:spacing w:after="0"/>
+      </w:pPr>
+      <w:r>
+        <w:t xml:space="preserve">Instalar Docker y la herramienta de gestión </w:t>
+      </w:r>
+      <w:r>
+        <w:rPr>
+          <w:b/>
+          <w:bCs/>
+        </w:rPr>
+        <w:t>Portainer</w:t>
+      </w:r>
       <w:r>
         <w:t>.</w:t>
       </w:r>
@@ -3522,7 +3156,7 @@
         <w:spacing w:after="0"/>
       </w:pPr>
       <w:r>
-        <w:t>Preparar el entorno de almacenamiento y red del servidor.</w:t>
+        <w:t>Crear documentación técnica detallada de todos los procesos realizados.</w:t>
       </w:r>
     </w:p>
     <w:p>
@@ -3534,59 +3168,7 @@
         <w:spacing w:after="0"/>
       </w:pPr>
       <w:r>
-        <w:t xml:space="preserve">Instalar Docker y la herramienta de gestión </w:t>
-      </w:r>
-      <w:proofErr w:type="spellStart"/>
-      <w:r>
-        <w:rPr>
-          <w:b/>
-          <w:bCs/>
-        </w:rPr>
-        <w:t>Portainer</w:t>
-      </w:r>
-      <w:proofErr w:type="spellEnd"/>
-      <w:r>
-        <w:t>.</w:t>
-      </w:r>
-    </w:p>
-    <w:p>
-      <w:pPr>
-        <w:numPr>
-          <w:ilvl w:val="0"/>
-          <w:numId w:val="1"/>
-        </w:numPr>
-        <w:spacing w:after="0"/>
-      </w:pPr>
-      <w:r>
-        <w:t>Crear documentación técnica detallada de todos los procesos realizados.</w:t>
-      </w:r>
-    </w:p>
-    <w:p>
-      <w:pPr>
-        <w:numPr>
-          <w:ilvl w:val="0"/>
-          <w:numId w:val="1"/>
-        </w:numPr>
-        <w:spacing w:after="0"/>
-      </w:pPr>
-      <w:r>
-        <w:t xml:space="preserve">Analizar y decidir la herramienta más adecuada para la gestión de contenedores (Docker </w:t>
-      </w:r>
-      <w:proofErr w:type="spellStart"/>
-      <w:r>
-        <w:t>Compose</w:t>
-      </w:r>
-      <w:proofErr w:type="spellEnd"/>
-      <w:r>
-        <w:t xml:space="preserve"> o </w:t>
-      </w:r>
-      <w:proofErr w:type="spellStart"/>
-      <w:r>
-        <w:t>Portainer</w:t>
-      </w:r>
-      <w:proofErr w:type="spellEnd"/>
-      <w:r>
-        <w:t>).</w:t>
+        <w:t>Analizar y decidir la herramienta más adecuada para la gestión de contenedores (Docker Compose o Portainer).</w:t>
       </w:r>
     </w:p>
     <w:p>
@@ -3721,13 +3303,39 @@
         <w:spacing w:after="0"/>
       </w:pPr>
       <w:r>
-        <w:t xml:space="preserve">Instalación del sistema operativo </w:t>
-      </w:r>
-      <w:proofErr w:type="spellStart"/>
-      <w:r>
-        <w:t>OpenMediaVault</w:t>
-      </w:r>
-      <w:proofErr w:type="spellEnd"/>
+        <w:t>Instalación del sistema operativo OpenMediaVault.</w:t>
+      </w:r>
+    </w:p>
+    <w:p>
+      <w:pPr>
+        <w:numPr>
+          <w:ilvl w:val="0"/>
+          <w:numId w:val="5"/>
+        </w:numPr>
+        <w:spacing w:after="0"/>
+      </w:pPr>
+      <w:r>
+        <w:t>Configuración inicial de OpenMediaVault.</w:t>
+      </w:r>
+    </w:p>
+    <w:p>
+      <w:pPr>
+        <w:numPr>
+          <w:ilvl w:val="0"/>
+          <w:numId w:val="5"/>
+        </w:numPr>
+        <w:spacing w:after="0"/>
+      </w:pPr>
+      <w:r>
+        <w:t xml:space="preserve">Instalación del complemento </w:t>
+      </w:r>
+      <w:r>
+        <w:rPr>
+          <w:b/>
+          <w:bCs/>
+        </w:rPr>
+        <w:t>OpenMediaVault Extras</w:t>
+      </w:r>
       <w:r>
         <w:t>.</w:t>
       </w:r>
@@ -3741,15 +3349,7 @@
         <w:spacing w:after="0"/>
       </w:pPr>
       <w:r>
-        <w:t xml:space="preserve">Configuración inicial de </w:t>
-      </w:r>
-      <w:proofErr w:type="spellStart"/>
-      <w:r>
-        <w:t>OpenMediaVault</w:t>
-      </w:r>
-      <w:proofErr w:type="spellEnd"/>
-      <w:r>
-        <w:t>.</w:t>
+        <w:t>Instalación del motor de contenedores Docker.</w:t>
       </w:r>
     </w:p>
     <w:p>
@@ -3761,26 +3361,7 @@
         <w:spacing w:after="0"/>
       </w:pPr>
       <w:r>
-        <w:t xml:space="preserve">Instalación del complemento </w:t>
-      </w:r>
-      <w:proofErr w:type="spellStart"/>
-      <w:r>
-        <w:rPr>
-          <w:b/>
-          <w:bCs/>
-        </w:rPr>
-        <w:t>OpenMediaVault</w:t>
-      </w:r>
-      <w:proofErr w:type="spellEnd"/>
-      <w:r>
-        <w:rPr>
-          <w:b/>
-          <w:bCs/>
-        </w:rPr>
-        <w:t xml:space="preserve"> Extras</w:t>
-      </w:r>
-      <w:r>
-        <w:t>.</w:t>
+        <w:t>Preparación del almacenamiento y volúmenes necesarios para contenedores.</w:t>
       </w:r>
     </w:p>
     <w:p>
@@ -3792,47 +3373,7 @@
         <w:spacing w:after="0"/>
       </w:pPr>
       <w:r>
-        <w:t>Instalación del motor de contenedores Docker.</w:t>
-      </w:r>
-    </w:p>
-    <w:p>
-      <w:pPr>
-        <w:numPr>
-          <w:ilvl w:val="0"/>
-          <w:numId w:val="5"/>
-        </w:numPr>
-        <w:spacing w:after="0"/>
-      </w:pPr>
-      <w:r>
-        <w:t>Preparación del almacenamiento y volúmenes necesarios para contenedores.</w:t>
-      </w:r>
-    </w:p>
-    <w:p>
-      <w:pPr>
-        <w:numPr>
-          <w:ilvl w:val="0"/>
-          <w:numId w:val="5"/>
-        </w:numPr>
-        <w:spacing w:after="0"/>
-      </w:pPr>
-      <w:r>
-        <w:t xml:space="preserve">Investigación y comparación entre Docker </w:t>
-      </w:r>
-      <w:proofErr w:type="spellStart"/>
-      <w:r>
-        <w:t>Compose</w:t>
-      </w:r>
-      <w:proofErr w:type="spellEnd"/>
-      <w:r>
-        <w:t xml:space="preserve"> y </w:t>
-      </w:r>
-      <w:proofErr w:type="spellStart"/>
-      <w:r>
-        <w:t>Portainer</w:t>
-      </w:r>
-      <w:proofErr w:type="spellEnd"/>
-      <w:r>
-        <w:t>.</w:t>
+        <w:t>Investigación y comparación entre Docker Compose y Portainer.</w:t>
       </w:r>
     </w:p>
     <w:p>
@@ -3922,31 +3463,7 @@
           <w:sz w:val="34"/>
           <w:szCs w:val="34"/>
         </w:rPr>
-        <w:t xml:space="preserve">4️ </w:t>
-      </w:r>
-      <w:proofErr w:type="gramStart"/>
-      <w:r>
-        <w:rPr>
-          <w:rFonts w:ascii="Aptos" w:eastAsia="Aptos" w:hAnsi="Aptos" w:cs="Aptos"/>
-          <w:b/>
-          <w:bCs/>
-          <w:color w:val="000000"/>
-          <w:sz w:val="34"/>
-          <w:szCs w:val="34"/>
-        </w:rPr>
-        <w:t>Responsable</w:t>
-      </w:r>
-      <w:proofErr w:type="gramEnd"/>
-      <w:r>
-        <w:rPr>
-          <w:rFonts w:ascii="Aptos" w:eastAsia="Aptos" w:hAnsi="Aptos" w:cs="Aptos"/>
-          <w:b/>
-          <w:bCs/>
-          <w:color w:val="000000"/>
-          <w:sz w:val="34"/>
-          <w:szCs w:val="34"/>
-        </w:rPr>
-        <w:t xml:space="preserve"> de cada tarea</w:t>
+        <w:t>4️ Responsable de cada tarea</w:t>
       </w:r>
     </w:p>
     <w:tbl>
@@ -4103,13 +3620,8 @@
           </w:tcPr>
           <w:p>
             <w:r>
-              <w:t xml:space="preserve">Instalación de </w:t>
+              <w:t>Instalación de OpenMediaVault</w:t>
             </w:r>
-            <w:proofErr w:type="spellStart"/>
-            <w:r>
-              <w:t>OpenMediaVault</w:t>
-            </w:r>
-            <w:proofErr w:type="spellEnd"/>
           </w:p>
         </w:tc>
         <w:tc>
@@ -4157,13 +3669,8 @@
           </w:tcPr>
           <w:p>
             <w:r>
-              <w:t xml:space="preserve">Configuración inicial de </w:t>
+              <w:t>Configuración inicial de OpenMediaVault</w:t>
             </w:r>
-            <w:proofErr w:type="spellStart"/>
-            <w:r>
-              <w:t>OpenMediaVault</w:t>
-            </w:r>
-            <w:proofErr w:type="spellEnd"/>
           </w:p>
         </w:tc>
         <w:tc>
@@ -4264,15 +3771,7 @@
           </w:tcPr>
           <w:p>
             <w:r>
-              <w:t xml:space="preserve">Instalación de </w:t>
-            </w:r>
-            <w:proofErr w:type="spellStart"/>
-            <w:r>
-              <w:t>OpenMediaVault</w:t>
-            </w:r>
-            <w:proofErr w:type="spellEnd"/>
-            <w:r>
-              <w:t xml:space="preserve"> Extras</w:t>
+              <w:t>Instalación de OpenMediaVault Extras</w:t>
             </w:r>
           </w:p>
         </w:tc>
@@ -4370,13 +3869,9 @@
           </w:tcPr>
           <w:p>
             <w:r>
-              <w:t xml:space="preserve">Instalación y acceso a </w:t>
+              <w:lastRenderedPageBreak/>
+              <w:t>Instalación y acceso a Portainer</w:t>
             </w:r>
-            <w:proofErr w:type="spellStart"/>
-            <w:r>
-              <w:t>Portainer</w:t>
-            </w:r>
-            <w:proofErr w:type="spellEnd"/>
           </w:p>
         </w:tc>
         <w:tc>
@@ -4473,21 +3968,8 @@
           </w:tcPr>
           <w:p>
             <w:r>
-              <w:t xml:space="preserve">Investigación Docker </w:t>
+              <w:t>Investigación Docker Compose vs Portainer</w:t>
             </w:r>
-            <w:proofErr w:type="spellStart"/>
-            <w:r>
-              <w:t>Compose</w:t>
-            </w:r>
-            <w:proofErr w:type="spellEnd"/>
-            <w:r>
-              <w:t xml:space="preserve"> vs </w:t>
-            </w:r>
-            <w:proofErr w:type="spellStart"/>
-            <w:r>
-              <w:t>Portainer</w:t>
-            </w:r>
-            <w:proofErr w:type="spellEnd"/>
           </w:p>
         </w:tc>
         <w:tc>
@@ -4889,17 +4371,8 @@
           <w:b/>
           <w:bCs/>
         </w:rPr>
-        <w:t xml:space="preserve">Documentación de instalación y configuración inicial de </w:t>
-      </w:r>
-      <w:proofErr w:type="spellStart"/>
-      <w:r>
-        <w:rPr>
-          <w:b/>
-          <w:bCs/>
-        </w:rPr>
-        <w:t>OpenMediaVault</w:t>
-      </w:r>
-      <w:proofErr w:type="spellEnd"/>
+        <w:t>Documentación de instalación y configuración inicial de OpenMediaVault</w:t>
+      </w:r>
     </w:p>
     <w:p>
       <w:pPr>
@@ -4950,23 +4423,7 @@
           <w:b/>
           <w:bCs/>
         </w:rPr>
-        <w:t xml:space="preserve">Documentación de </w:t>
-      </w:r>
-      <w:proofErr w:type="spellStart"/>
-      <w:r>
-        <w:rPr>
-          <w:b/>
-          <w:bCs/>
-        </w:rPr>
-        <w:t>OpenMediaVault</w:t>
-      </w:r>
-      <w:proofErr w:type="spellEnd"/>
-      <w:r>
-        <w:rPr>
-          <w:b/>
-          <w:bCs/>
-        </w:rPr>
-        <w:t xml:space="preserve"> Extras</w:t>
+        <w:t>Documentación de OpenMediaVault Extras</w:t>
       </w:r>
     </w:p>
     <w:p>
@@ -4978,6 +4435,7 @@
         <w:spacing w:after="0"/>
       </w:pPr>
       <w:r>
+        <w:lastRenderedPageBreak/>
         <w:t>Instalación del complemento.</w:t>
       </w:r>
     </w:p>
@@ -5002,15 +4460,7 @@
         <w:spacing w:after="0"/>
       </w:pPr>
       <w:r>
-        <w:t xml:space="preserve">Relación con Docker y </w:t>
-      </w:r>
-      <w:proofErr w:type="spellStart"/>
-      <w:r>
-        <w:t>Portainer</w:t>
-      </w:r>
-      <w:proofErr w:type="spellEnd"/>
-      <w:r>
-        <w:t>.</w:t>
+        <w:t>Relación con Docker y Portainer.</w:t>
       </w:r>
     </w:p>
     <w:p>
@@ -5050,15 +4500,7 @@
         <w:spacing w:after="0"/>
       </w:pPr>
       <w:r>
-        <w:t xml:space="preserve">Relación entre Docker y </w:t>
-      </w:r>
-      <w:proofErr w:type="spellStart"/>
-      <w:r>
-        <w:t>Portainer</w:t>
-      </w:r>
-      <w:proofErr w:type="spellEnd"/>
-      <w:r>
-        <w:t>.</w:t>
+        <w:t>Relación entre Docker y Portainer.</w:t>
       </w:r>
     </w:p>
     <w:p>
@@ -5074,33 +4516,8 @@
           <w:b/>
           <w:bCs/>
         </w:rPr>
-        <w:t xml:space="preserve">Documentación de análisis Docker </w:t>
-      </w:r>
-      <w:proofErr w:type="spellStart"/>
-      <w:r>
-        <w:rPr>
-          <w:b/>
-          <w:bCs/>
-        </w:rPr>
-        <w:t>Compose</w:t>
-      </w:r>
-      <w:proofErr w:type="spellEnd"/>
-      <w:r>
-        <w:rPr>
-          <w:b/>
-          <w:bCs/>
-        </w:rPr>
-        <w:t xml:space="preserve"> vs </w:t>
-      </w:r>
-      <w:proofErr w:type="spellStart"/>
-      <w:r>
-        <w:rPr>
-          <w:b/>
-          <w:bCs/>
-        </w:rPr>
-        <w:t>Portainer</w:t>
-      </w:r>
-      <w:proofErr w:type="spellEnd"/>
+        <w:t>Documentación de análisis Docker Compose vs Portainer</w:t>
+      </w:r>
     </w:p>
     <w:p>
       <w:pPr>
@@ -5236,13 +4653,8 @@
         </w:numPr>
         <w:spacing w:before="240" w:after="0"/>
       </w:pPr>
-      <w:proofErr w:type="spellStart"/>
-      <w:r>
-        <w:t>OpenMediaVault</w:t>
-      </w:r>
-      <w:proofErr w:type="spellEnd"/>
-      <w:r>
-        <w:t xml:space="preserve"> está instalado y accesible desde su interfaz web.</w:t>
+      <w:r>
+        <w:t>OpenMediaVault está instalado y accesible desde su interfaz web.</w:t>
       </w:r>
     </w:p>
     <w:p>
@@ -5277,13 +4689,8 @@
         </w:numPr>
         <w:spacing w:after="0"/>
       </w:pPr>
-      <w:proofErr w:type="spellStart"/>
-      <w:r>
-        <w:t>Portainer</w:t>
-      </w:r>
-      <w:proofErr w:type="spellEnd"/>
-      <w:r>
-        <w:t xml:space="preserve"> está instalado y accesible desde navegador.</w:t>
+      <w:r>
+        <w:t>Portainer está instalado y accesible desde navegador.</w:t>
       </w:r>
     </w:p>
     <w:p>
@@ -5295,42 +4702,637 @@
         <w:spacing w:after="0"/>
       </w:pPr>
       <w:r>
-        <w:t xml:space="preserve">Se ha realizado una comparación técnica entre Docker </w:t>
-      </w:r>
-      <w:proofErr w:type="spellStart"/>
-      <w:r>
-        <w:t>Compose</w:t>
-      </w:r>
-      <w:proofErr w:type="spellEnd"/>
-      <w:r>
-        <w:t xml:space="preserve"> y </w:t>
-      </w:r>
-      <w:proofErr w:type="spellStart"/>
-      <w:r>
-        <w:t>Portainer</w:t>
-      </w:r>
-      <w:proofErr w:type="spellEnd"/>
+        <w:t>Se ha realizado una comparación técnica entre Docker Compose y Portainer.</w:t>
+      </w:r>
+    </w:p>
+    <w:p>
+      <w:pPr>
+        <w:numPr>
+          <w:ilvl w:val="0"/>
+          <w:numId w:val="3"/>
+        </w:numPr>
+        <w:spacing w:after="0"/>
+      </w:pPr>
+      <w:r>
+        <w:t>Se ha justificado y documentado la elección final de Portainer.</w:t>
+      </w:r>
+    </w:p>
+    <w:p>
+      <w:pPr>
+        <w:numPr>
+          <w:ilvl w:val="0"/>
+          <w:numId w:val="3"/>
+        </w:numPr>
+        <w:spacing w:after="0"/>
+      </w:pPr>
+      <w:r>
+        <w:t>El repositorio GitHub está creado y estructurado correctamente.</w:t>
+      </w:r>
+    </w:p>
+    <w:p>
+      <w:pPr>
+        <w:numPr>
+          <w:ilvl w:val="0"/>
+          <w:numId w:val="3"/>
+        </w:numPr>
+        <w:spacing w:after="0"/>
+      </w:pPr>
+      <w:r>
+        <w:t>Toda la documentación del sprint está subida a GitHub.</w:t>
+      </w:r>
+    </w:p>
+    <w:p>
+      <w:pPr>
+        <w:numPr>
+          <w:ilvl w:val="0"/>
+          <w:numId w:val="3"/>
+        </w:numPr>
+        <w:spacing w:after="240"/>
+      </w:pPr>
+      <w:r>
+        <w:t>Las tareas del sprint están reflejadas y cerradas en Trello.</w:t>
+      </w:r>
+    </w:p>
+    <w:p>
+      <w:pPr>
+        <w:spacing w:before="240" w:after="240"/>
+      </w:pPr>
+      <w:r>
+        <w:t xml:space="preserve">Si cualquiera de estos puntos no se cumple, el sprint se considera </w:t>
+      </w:r>
+      <w:r>
+        <w:rPr>
+          <w:b/>
+          <w:bCs/>
+        </w:rPr>
+        <w:t>incompleto</w:t>
+      </w:r>
       <w:r>
         <w:t>.</w:t>
       </w:r>
     </w:p>
     <w:p>
       <w:pPr>
-        <w:numPr>
-          <w:ilvl w:val="0"/>
-          <w:numId w:val="3"/>
-        </w:numPr>
-        <w:spacing w:after="0"/>
-      </w:pPr>
-      <w:r>
-        <w:t xml:space="preserve">Se ha justificado y documentado la elección final de </w:t>
-      </w:r>
-      <w:proofErr w:type="spellStart"/>
-      <w:r>
-        <w:t>Portainer</w:t>
-      </w:r>
-      <w:proofErr w:type="spellEnd"/>
-      <w:r>
+        <w:rPr>
+          <w:lang w:val="es-ES"/>
+        </w:rPr>
+      </w:pPr>
+    </w:p>
+    <w:p>
+      <w:pPr>
+        <w:rPr>
+          <w:b/>
+          <w:bCs/>
+          <w:lang w:val="es-ES"/>
+        </w:rPr>
+      </w:pPr>
+      <w:r>
+        <w:rPr>
+          <w:b/>
+          <w:bCs/>
+          <w:lang w:val="es-ES"/>
+        </w:rPr>
+        <w:t>Seguimiento del Sprint 2</w:t>
+      </w:r>
+    </w:p>
+    <w:p>
+      <w:pPr>
+        <w:rPr>
+          <w:b/>
+          <w:bCs/>
+          <w:lang w:val="es-ES"/>
+        </w:rPr>
+      </w:pPr>
+      <w:r>
+        <w:rPr>
+          <w:b/>
+          <w:bCs/>
+          <w:lang w:val="es-ES"/>
+        </w:rPr>
+        <w:t>Registro de problemas encontrados y cómo se han resuelto</w:t>
+      </w:r>
+    </w:p>
+    <w:p>
+      <w:pPr>
+        <w:rPr>
+          <w:lang w:val="es-ES"/>
+        </w:rPr>
+      </w:pPr>
+      <w:r>
+        <w:rPr>
+          <w:lang w:val="es-ES"/>
+        </w:rPr>
+        <w:t xml:space="preserve">En general, el segundo sprint ha tenido un desarrollo positivo. Aunque no se han obtenido resultados perfectos, se ha logrado avanzar de forma significativa en el </w:t>
+      </w:r>
+      <w:r>
+        <w:rPr>
+          <w:lang w:val="es-ES"/>
+        </w:rPr>
+        <w:lastRenderedPageBreak/>
+        <w:t>proyecto. A lo largo del sprint han surgido algunos problemas técnicos que han retrasado ciertas tareas, pero todos ellos han sido gestionados y resueltos correctamente.</w:t>
+      </w:r>
+    </w:p>
+    <w:p>
+      <w:pPr>
+        <w:rPr>
+          <w:lang w:val="es-ES"/>
+        </w:rPr>
+      </w:pPr>
+      <w:r>
+        <w:rPr>
+          <w:lang w:val="es-ES"/>
+        </w:rPr>
+        <w:t xml:space="preserve">Uno de los principales problemas encontrados fue la </w:t>
+      </w:r>
+      <w:r>
+        <w:rPr>
+          <w:b/>
+          <w:bCs/>
+          <w:lang w:val="es-ES"/>
+        </w:rPr>
+        <w:t>pérdida de la contraseña del usuario administrador del servidor</w:t>
+      </w:r>
+      <w:r>
+        <w:rPr>
+          <w:lang w:val="es-ES"/>
+        </w:rPr>
+        <w:t>, lo que impidió el acceso al sistema durante un periodo de tiempo. Para solucionarlo, se realizaron los procedimientos necesarios de recuperación de credenciales, lo que permitió volver a acceder al servidor y continuar con el trabajo.</w:t>
+      </w:r>
+    </w:p>
+    <w:p>
+      <w:pPr>
+        <w:rPr>
+          <w:lang w:val="es-ES"/>
+        </w:rPr>
+      </w:pPr>
+      <w:r>
+        <w:rPr>
+          <w:lang w:val="es-ES"/>
+        </w:rPr>
+        <w:t xml:space="preserve">Otro problema relevante fue que la </w:t>
+      </w:r>
+      <w:r>
+        <w:rPr>
+          <w:b/>
+          <w:bCs/>
+          <w:lang w:val="es-ES"/>
+        </w:rPr>
+        <w:t>imagen ISO del sistema operativo</w:t>
+      </w:r>
+      <w:r>
+        <w:rPr>
+          <w:lang w:val="es-ES"/>
+        </w:rPr>
+        <w:t xml:space="preserve"> que se estaba utilizando para la instalación se encontraba </w:t>
+      </w:r>
+      <w:r>
+        <w:rPr>
+          <w:b/>
+          <w:bCs/>
+          <w:lang w:val="es-ES"/>
+        </w:rPr>
+        <w:t>corrompida</w:t>
+      </w:r>
+      <w:r>
+        <w:rPr>
+          <w:lang w:val="es-ES"/>
+        </w:rPr>
+        <w:t>, provocando errores durante el proceso de instalación. Este inconveniente se resolvió descargando nuevamente la ISO desde una fuente fiable y verificando su integridad antes de volver a iniciar la instalación.</w:t>
+      </w:r>
+    </w:p>
+    <w:p>
+      <w:pPr>
+        <w:rPr>
+          <w:b/>
+          <w:bCs/>
+          <w:lang w:val="es-ES"/>
+        </w:rPr>
+      </w:pPr>
+      <w:r>
+        <w:rPr>
+          <w:b/>
+          <w:bCs/>
+          <w:lang w:val="es-ES"/>
+        </w:rPr>
+        <w:t>Avance real vs avance planificado</w:t>
+      </w:r>
+    </w:p>
+    <w:p>
+      <w:pPr>
+        <w:rPr>
+          <w:lang w:val="es-ES"/>
+        </w:rPr>
+      </w:pPr>
+      <w:r>
+        <w:rPr>
+          <w:lang w:val="es-ES"/>
+        </w:rPr>
+        <w:t xml:space="preserve">Durante este sprint se ha conseguido completar la </w:t>
+      </w:r>
+      <w:r>
+        <w:rPr>
+          <w:b/>
+          <w:bCs/>
+          <w:lang w:val="es-ES"/>
+        </w:rPr>
+        <w:t>gran mayoría de las tareas planificadas</w:t>
+      </w:r>
+      <w:r>
+        <w:rPr>
+          <w:lang w:val="es-ES"/>
+        </w:rPr>
+        <w:t>. Las tareas que no se han podido finalizar no han sido debido a una mala gestión del tiempo, sino principalmente a los problemas técnicos surgidos durante el proceso de instalación y configuración del sistema, que han requerido más tiempo del previsto para su resolución.</w:t>
+      </w:r>
+    </w:p>
+    <w:p>
+      <w:pPr>
+        <w:rPr>
+          <w:lang w:val="es-ES"/>
+        </w:rPr>
+      </w:pPr>
+    </w:p>
+    <w:p>
+      <w:pPr>
+        <w:rPr>
+          <w:b/>
+          <w:bCs/>
+          <w:lang w:val="es-ES"/>
+        </w:rPr>
+      </w:pPr>
+      <w:r>
+        <w:rPr>
+          <w:b/>
+          <w:bCs/>
+          <w:lang w:val="es-ES"/>
+        </w:rPr>
+        <w:t>Revisión y retrospectiva</w:t>
+      </w:r>
+    </w:p>
+    <w:p>
+      <w:pPr>
+        <w:rPr>
+          <w:b/>
+          <w:bCs/>
+          <w:lang w:val="es-ES"/>
+        </w:rPr>
+      </w:pPr>
+      <w:r>
+        <w:rPr>
+          <w:b/>
+          <w:bCs/>
+          <w:lang w:val="es-ES"/>
+        </w:rPr>
+        <w:t>Qué se ha conseguido</w:t>
+      </w:r>
+    </w:p>
+    <w:p>
+      <w:pPr>
+        <w:rPr>
+          <w:lang w:val="es-ES"/>
+        </w:rPr>
+      </w:pPr>
+      <w:r>
+        <w:rPr>
+          <w:lang w:val="es-ES"/>
+        </w:rPr>
+        <w:t>A pesar de las dificultades encontradas, durante este sprint se han alcanzado logros importantes para el proyecto:</w:t>
+      </w:r>
+    </w:p>
+    <w:p>
+      <w:pPr>
+        <w:numPr>
+          <w:ilvl w:val="0"/>
+          <w:numId w:val="20"/>
+        </w:numPr>
+        <w:rPr>
+          <w:lang w:val="es-ES"/>
+        </w:rPr>
+      </w:pPr>
+      <w:r>
+        <w:rPr>
+          <w:lang w:val="es-ES"/>
+        </w:rPr>
+        <w:t xml:space="preserve">Se ha conseguido </w:t>
+      </w:r>
+      <w:r>
+        <w:rPr>
+          <w:b/>
+          <w:bCs/>
+          <w:lang w:val="es-ES"/>
+        </w:rPr>
+        <w:t>instalar definitivamente el sistema operativo</w:t>
+      </w:r>
+      <w:r>
+        <w:rPr>
+          <w:lang w:val="es-ES"/>
+        </w:rPr>
+        <w:t xml:space="preserve"> en el servidor tras varios intentos, estableciendo este sistema como la versión final que se utilizará en el proyecto, sin necesidad de futuras reinstalaciones.</w:t>
+      </w:r>
+    </w:p>
+    <w:p>
+      <w:pPr>
+        <w:numPr>
+          <w:ilvl w:val="0"/>
+          <w:numId w:val="20"/>
+        </w:numPr>
+        <w:rPr>
+          <w:lang w:val="es-ES"/>
+        </w:rPr>
+      </w:pPr>
+      <w:r>
+        <w:rPr>
+          <w:lang w:val="es-ES"/>
+        </w:rPr>
+        <w:t xml:space="preserve">Se han realizado todas las </w:t>
+      </w:r>
+      <w:r>
+        <w:rPr>
+          <w:b/>
+          <w:bCs/>
+          <w:lang w:val="es-ES"/>
+        </w:rPr>
+        <w:t>configuraciones iniciales del sistema</w:t>
+      </w:r>
+      <w:r>
+        <w:rPr>
+          <w:lang w:val="es-ES"/>
+        </w:rPr>
+        <w:t>, incluyendo la configuración de red y otros parámetros básicos necesarios para su correcto funcionamiento.</w:t>
+      </w:r>
+    </w:p>
+    <w:p>
+      <w:pPr>
+        <w:numPr>
+          <w:ilvl w:val="0"/>
+          <w:numId w:val="20"/>
+        </w:numPr>
+        <w:rPr>
+          <w:lang w:val="es-ES"/>
+        </w:rPr>
+      </w:pPr>
+      <w:r>
+        <w:rPr>
+          <w:lang w:val="es-ES"/>
+        </w:rPr>
+        <w:t xml:space="preserve">Se ha creado el </w:t>
+      </w:r>
+      <w:r>
+        <w:rPr>
+          <w:b/>
+          <w:bCs/>
+          <w:lang w:val="es-ES"/>
+        </w:rPr>
+        <w:t>repositorio de GitHub</w:t>
+      </w:r>
+      <w:r>
+        <w:rPr>
+          <w:lang w:val="es-ES"/>
+        </w:rPr>
+        <w:t xml:space="preserve"> del proyecto, estableciendo un sistema de control de versiones para el código y la documentación.</w:t>
+      </w:r>
+    </w:p>
+    <w:p>
+      <w:pPr>
+        <w:numPr>
+          <w:ilvl w:val="0"/>
+          <w:numId w:val="20"/>
+        </w:numPr>
+        <w:rPr>
+          <w:lang w:val="es-ES"/>
+        </w:rPr>
+      </w:pPr>
+      <w:r>
+        <w:rPr>
+          <w:lang w:val="es-ES"/>
+        </w:rPr>
+        <w:t xml:space="preserve">Se ha continuado con la </w:t>
+      </w:r>
+      <w:r>
+        <w:rPr>
+          <w:b/>
+          <w:bCs/>
+          <w:lang w:val="es-ES"/>
+        </w:rPr>
+        <w:t>gestión y seguimiento de tareas mediante Trello</w:t>
+      </w:r>
+      <w:r>
+        <w:rPr>
+          <w:lang w:val="es-ES"/>
+        </w:rPr>
+        <w:t>, manteniendo el proyecto organizado.</w:t>
+      </w:r>
+    </w:p>
+    <w:p>
+      <w:pPr>
+        <w:numPr>
+          <w:ilvl w:val="0"/>
+          <w:numId w:val="20"/>
+        </w:numPr>
+        <w:rPr>
+          <w:lang w:val="es-ES"/>
+        </w:rPr>
+      </w:pPr>
+      <w:r>
+        <w:rPr>
+          <w:lang w:val="es-ES"/>
+        </w:rPr>
+        <w:lastRenderedPageBreak/>
+        <w:t xml:space="preserve">Se ha logrado </w:t>
+      </w:r>
+      <w:r>
+        <w:rPr>
+          <w:b/>
+          <w:bCs/>
+          <w:lang w:val="es-ES"/>
+        </w:rPr>
+        <w:t>instalar Docker en el servidor</w:t>
+      </w:r>
+      <w:r>
+        <w:rPr>
+          <w:lang w:val="es-ES"/>
+        </w:rPr>
+        <w:t xml:space="preserve">, así como </w:t>
+      </w:r>
+      <w:r>
+        <w:rPr>
+          <w:b/>
+          <w:bCs/>
+          <w:lang w:val="es-ES"/>
+        </w:rPr>
+        <w:t>OpenMediaVault Extras</w:t>
+      </w:r>
+      <w:r>
+        <w:rPr>
+          <w:lang w:val="es-ES"/>
+        </w:rPr>
+        <w:t>, un complemento necesario para ampliar las funcionalidades del sistema y permitir el correcto funcionamiento de los servicios.</w:t>
+      </w:r>
+    </w:p>
+    <w:p>
+      <w:pPr>
+        <w:numPr>
+          <w:ilvl w:val="0"/>
+          <w:numId w:val="20"/>
+        </w:numPr>
+        <w:rPr>
+          <w:lang w:val="es-ES"/>
+        </w:rPr>
+      </w:pPr>
+      <w:r>
+        <w:rPr>
+          <w:lang w:val="es-ES"/>
+        </w:rPr>
+        <w:t xml:space="preserve">Aunque no se ha podido instalar Portainer, se ha elaborado una </w:t>
+      </w:r>
+      <w:r>
+        <w:rPr>
+          <w:b/>
+          <w:bCs/>
+          <w:lang w:val="es-ES"/>
+        </w:rPr>
+        <w:t>documentación completa</w:t>
+      </w:r>
+      <w:r>
+        <w:rPr>
+          <w:lang w:val="es-ES"/>
+        </w:rPr>
+        <w:t xml:space="preserve"> sobre qué es Portainer, su funcionamiento y una </w:t>
+      </w:r>
+      <w:r>
+        <w:rPr>
+          <w:b/>
+          <w:bCs/>
+          <w:lang w:val="es-ES"/>
+        </w:rPr>
+        <w:t>comparativa entre Docker y otras soluciones</w:t>
+      </w:r>
+      <w:r>
+        <w:rPr>
+          <w:lang w:val="es-ES"/>
+        </w:rPr>
+        <w:t>, lo que facilitará su futura implementación.</w:t>
+      </w:r>
+    </w:p>
+    <w:p>
+      <w:pPr>
+        <w:numPr>
+          <w:ilvl w:val="0"/>
+          <w:numId w:val="20"/>
+        </w:numPr>
+        <w:rPr>
+          <w:lang w:val="es-ES"/>
+        </w:rPr>
+      </w:pPr>
+      <w:r>
+        <w:rPr>
+          <w:lang w:val="es-ES"/>
+        </w:rPr>
+        <w:t xml:space="preserve">Este sprint ha tenido un fuerte enfoque en la </w:t>
+      </w:r>
+      <w:r>
+        <w:rPr>
+          <w:b/>
+          <w:bCs/>
+          <w:lang w:val="es-ES"/>
+        </w:rPr>
+        <w:t>investigación y elaboración de documentación</w:t>
+      </w:r>
+      <w:r>
+        <w:rPr>
+          <w:lang w:val="es-ES"/>
+        </w:rPr>
+        <w:t>, analizando paso a paso cómo realizar cada una de las tareas técnicas.</w:t>
+      </w:r>
+    </w:p>
+    <w:p>
+      <w:pPr>
+        <w:numPr>
+          <w:ilvl w:val="0"/>
+          <w:numId w:val="20"/>
+        </w:numPr>
+        <w:rPr>
+          <w:lang w:val="es-ES"/>
+        </w:rPr>
+      </w:pPr>
+      <w:r>
+        <w:rPr>
+          <w:lang w:val="es-ES"/>
+        </w:rPr>
+        <w:t xml:space="preserve">Se ha desarrollado la </w:t>
+      </w:r>
+      <w:r>
+        <w:rPr>
+          <w:b/>
+          <w:bCs/>
+          <w:lang w:val="es-ES"/>
+        </w:rPr>
+        <w:t>documentación sobre la planificación de la división de los discos duros</w:t>
+      </w:r>
+      <w:r>
+        <w:rPr>
+          <w:lang w:val="es-ES"/>
+        </w:rPr>
+        <w:t>, definiendo cómo se gestionará el almacenamiento y el sistema de copias de seguridad (backups).</w:t>
+      </w:r>
+    </w:p>
+    <w:p>
+      <w:pPr>
+        <w:rPr>
+          <w:b/>
+          <w:bCs/>
+          <w:lang w:val="es-ES"/>
+        </w:rPr>
+      </w:pPr>
+      <w:r>
+        <w:rPr>
+          <w:b/>
+          <w:bCs/>
+          <w:lang w:val="es-ES"/>
+        </w:rPr>
+        <w:t>Qué no se ha podido hacer y por qué</w:t>
+      </w:r>
+    </w:p>
+    <w:p>
+      <w:pPr>
+        <w:rPr>
+          <w:lang w:val="es-ES"/>
+        </w:rPr>
+      </w:pPr>
+      <w:r>
+        <w:rPr>
+          <w:lang w:val="es-ES"/>
+        </w:rPr>
+        <w:t>Las tareas que no se han podido completar durante este sprint son:</w:t>
+      </w:r>
+    </w:p>
+    <w:p>
+      <w:pPr>
+        <w:numPr>
+          <w:ilvl w:val="0"/>
+          <w:numId w:val="21"/>
+        </w:numPr>
+        <w:rPr>
+          <w:lang w:val="es-ES"/>
+        </w:rPr>
+      </w:pPr>
+      <w:r>
+        <w:rPr>
+          <w:lang w:val="es-ES"/>
+        </w:rPr>
+        <w:t xml:space="preserve">La </w:t>
+      </w:r>
+      <w:r>
+        <w:rPr>
+          <w:b/>
+          <w:bCs/>
+          <w:lang w:val="es-ES"/>
+        </w:rPr>
+        <w:t>instalación de Portainer en el servidor</w:t>
+      </w:r>
+      <w:r>
+        <w:rPr>
+          <w:lang w:val="es-ES"/>
+        </w:rPr>
         <w:t>.</w:t>
       </w:r>
     </w:p>
@@ -5338,726 +5340,31 @@
       <w:pPr>
         <w:numPr>
           <w:ilvl w:val="0"/>
-          <w:numId w:val="3"/>
-        </w:numPr>
-        <w:spacing w:after="0"/>
-      </w:pPr>
-      <w:r>
-        <w:t>El repositorio GitHub está creado y estructurado correctamente.</w:t>
-      </w:r>
-    </w:p>
-    <w:p>
-      <w:pPr>
-        <w:numPr>
-          <w:ilvl w:val="0"/>
-          <w:numId w:val="3"/>
-        </w:numPr>
-        <w:spacing w:after="0"/>
-      </w:pPr>
-      <w:r>
-        <w:t>Toda la documentación del sprint está subida a GitHub.</w:t>
-      </w:r>
-    </w:p>
-    <w:p>
-      <w:pPr>
-        <w:numPr>
-          <w:ilvl w:val="0"/>
-          <w:numId w:val="3"/>
-        </w:numPr>
-        <w:spacing w:after="240"/>
-      </w:pPr>
-      <w:r>
-        <w:t>Las tareas del sprint están reflejadas y cerradas en Trello.</w:t>
-      </w:r>
-    </w:p>
-    <w:p>
-      <w:pPr>
-        <w:spacing w:before="240" w:after="240"/>
-      </w:pPr>
-      <w:r>
-        <w:t xml:space="preserve">Si cualquiera de estos puntos no se cumple, el sprint se considera </w:t>
-      </w:r>
-      <w:r>
-        <w:rPr>
-          <w:b/>
-          <w:bCs/>
-        </w:rPr>
-        <w:t>incompleto</w:t>
-      </w:r>
-      <w:r>
-        <w:t>.</w:t>
-      </w:r>
-    </w:p>
-    <w:p>
-      <w:pPr>
+          <w:numId w:val="21"/>
+        </w:numPr>
         <w:rPr>
           <w:lang w:val="es-ES"/>
         </w:rPr>
       </w:pPr>
-    </w:p>
-    <w:p>
-      <w:pPr>
-        <w:rPr>
-          <w:b/>
-          <w:bCs/>
+      <w:r>
+        <w:rPr>
           <w:lang w:val="es-ES"/>
         </w:rPr>
-      </w:pPr>
+        <w:t xml:space="preserve">La </w:t>
+      </w:r>
       <w:r>
         <w:rPr>
           <w:b/>
           <w:bCs/>
           <w:lang w:val="es-ES"/>
         </w:rPr>
-        <w:t>Seguimiento del Sprint 2</w:t>
-      </w:r>
-    </w:p>
-    <w:p>
-      <w:pPr>
-        <w:rPr>
-          <w:b/>
-          <w:bCs/>
+        <w:t>configuración definitiva de los discos duros</w:t>
+      </w:r>
+      <w:r>
+        <w:rPr>
           <w:lang w:val="es-ES"/>
         </w:rPr>
-      </w:pPr>
-      <w:r>
-        <w:rPr>
-          <w:b/>
-          <w:bCs/>
-          <w:lang w:val="es-ES"/>
-        </w:rPr>
-        <w:t>Registro de problemas encontrados y cómo se han resuelto</w:t>
-      </w:r>
-    </w:p>
-    <w:p>
-      <w:pPr>
-        <w:rPr>
-          <w:lang w:val="es-ES"/>
-        </w:rPr>
-      </w:pPr>
-      <w:r>
-        <w:rPr>
-          <w:lang w:val="es-ES"/>
-        </w:rPr>
-        <w:t>En general, el segundo sprint ha tenido un desarrollo positivo. Aunque no se han obtenido resultados perfectos, se ha logrado avanzar de forma significativa en el proyecto. A lo largo del sprint han surgido algunos problemas técnicos que han retrasado ciertas tareas, pero todos ellos han sido gestionados y resueltos correctamente.</w:t>
-      </w:r>
-    </w:p>
-    <w:p>
-      <w:pPr>
-        <w:rPr>
-          <w:lang w:val="es-ES"/>
-        </w:rPr>
-      </w:pPr>
-      <w:r>
-        <w:rPr>
-          <w:lang w:val="es-ES"/>
-        </w:rPr>
-        <w:t xml:space="preserve">Uno de los principales problemas encontrados fue la </w:t>
-      </w:r>
-      <w:r>
-        <w:rPr>
-          <w:b/>
-          <w:bCs/>
-          <w:lang w:val="es-ES"/>
-        </w:rPr>
-        <w:t>pérdida de la contraseña del usuario administrador del servidor</w:t>
-      </w:r>
-      <w:r>
-        <w:rPr>
-          <w:lang w:val="es-ES"/>
-        </w:rPr>
-        <w:t>, lo que impidió el acceso al sistema durante un periodo de tiempo. Para solucionarlo, se realizaron los procedimientos necesarios de recuperación de credenciales, lo que permitió volver a acceder al servidor y continuar con el trabajo.</w:t>
-      </w:r>
-    </w:p>
-    <w:p>
-      <w:pPr>
-        <w:rPr>
-          <w:lang w:val="es-ES"/>
-        </w:rPr>
-      </w:pPr>
-      <w:r>
-        <w:rPr>
-          <w:lang w:val="es-ES"/>
-        </w:rPr>
-        <w:t xml:space="preserve">Otro problema relevante fue que la </w:t>
-      </w:r>
-      <w:r>
-        <w:rPr>
-          <w:b/>
-          <w:bCs/>
-          <w:lang w:val="es-ES"/>
-        </w:rPr>
-        <w:t>imagen ISO del sistema operativo</w:t>
-      </w:r>
-      <w:r>
-        <w:rPr>
-          <w:lang w:val="es-ES"/>
-        </w:rPr>
-        <w:t xml:space="preserve"> que se estaba utilizando para la instalación se encontraba </w:t>
-      </w:r>
-      <w:r>
-        <w:rPr>
-          <w:b/>
-          <w:bCs/>
-          <w:lang w:val="es-ES"/>
-        </w:rPr>
-        <w:t>corrompida</w:t>
-      </w:r>
-      <w:r>
-        <w:rPr>
-          <w:lang w:val="es-ES"/>
-        </w:rPr>
-        <w:t>, provocando errores durante el proceso de instalación. Este inconveniente se resolvió descargando nuevamente la ISO desde una fuente fiable y verificando su integridad antes de volver a iniciar la instalación.</w:t>
-      </w:r>
-    </w:p>
-    <w:p>
-      <w:pPr>
-        <w:rPr>
-          <w:b/>
-          <w:bCs/>
-          <w:lang w:val="es-ES"/>
-        </w:rPr>
-      </w:pPr>
-      <w:r>
-        <w:rPr>
-          <w:b/>
-          <w:bCs/>
-          <w:lang w:val="es-ES"/>
-        </w:rPr>
-        <w:t>Avance real vs avance planificado</w:t>
-      </w:r>
-    </w:p>
-    <w:p>
-      <w:pPr>
-        <w:rPr>
-          <w:lang w:val="es-ES"/>
-        </w:rPr>
-      </w:pPr>
-      <w:r>
-        <w:rPr>
-          <w:lang w:val="es-ES"/>
-        </w:rPr>
-        <w:t xml:space="preserve">Durante este sprint se ha conseguido completar la </w:t>
-      </w:r>
-      <w:r>
-        <w:rPr>
-          <w:b/>
-          <w:bCs/>
-          <w:lang w:val="es-ES"/>
-        </w:rPr>
-        <w:t>gran mayoría de las tareas planificadas</w:t>
-      </w:r>
-      <w:r>
-        <w:rPr>
-          <w:lang w:val="es-ES"/>
-        </w:rPr>
-        <w:t>. Las tareas que no se han podido finalizar no han sido debido a una mala gestión del tiempo, sino principalmente a los problemas técnicos surgidos durante el proceso de instalación y configuración del sistema, que han requerido más tiempo del previsto para su resolución.</w:t>
-      </w:r>
-    </w:p>
-    <w:p>
-      <w:pPr>
-        <w:rPr>
-          <w:lang w:val="es-ES"/>
-        </w:rPr>
-      </w:pPr>
-    </w:p>
-    <w:p>
-      <w:pPr>
-        <w:rPr>
-          <w:b/>
-          <w:bCs/>
-          <w:lang w:val="es-ES"/>
-        </w:rPr>
-      </w:pPr>
-      <w:r>
-        <w:rPr>
-          <w:b/>
-          <w:bCs/>
-          <w:lang w:val="es-ES"/>
-        </w:rPr>
-        <w:t>Revisión y retrospectiva</w:t>
-      </w:r>
-    </w:p>
-    <w:p>
-      <w:pPr>
-        <w:rPr>
-          <w:b/>
-          <w:bCs/>
-          <w:lang w:val="es-ES"/>
-        </w:rPr>
-      </w:pPr>
-      <w:r>
-        <w:rPr>
-          <w:b/>
-          <w:bCs/>
-          <w:lang w:val="es-ES"/>
-        </w:rPr>
-        <w:t>Qué se ha conseguido</w:t>
-      </w:r>
-    </w:p>
-    <w:p>
-      <w:pPr>
-        <w:rPr>
-          <w:lang w:val="es-ES"/>
-        </w:rPr>
-      </w:pPr>
-      <w:r>
-        <w:rPr>
-          <w:lang w:val="es-ES"/>
-        </w:rPr>
-        <w:t>A pesar de las dificultades encontradas, durante este sprint se han alcanzado logros importantes para el proyecto:</w:t>
-      </w:r>
-    </w:p>
-    <w:p>
-      <w:pPr>
-        <w:numPr>
-          <w:ilvl w:val="0"/>
-          <w:numId w:val="20"/>
-        </w:numPr>
-        <w:rPr>
-          <w:lang w:val="es-ES"/>
-        </w:rPr>
-      </w:pPr>
-      <w:r>
-        <w:rPr>
-          <w:lang w:val="es-ES"/>
-        </w:rPr>
-        <w:t xml:space="preserve">Se ha conseguido </w:t>
-      </w:r>
-      <w:r>
-        <w:rPr>
-          <w:b/>
-          <w:bCs/>
-          <w:lang w:val="es-ES"/>
-        </w:rPr>
-        <w:t>instalar definitivamente el sistema operativo</w:t>
-      </w:r>
-      <w:r>
-        <w:rPr>
-          <w:lang w:val="es-ES"/>
-        </w:rPr>
-        <w:t xml:space="preserve"> en el servidor tras varios intentos, estableciendo este sistema como la versión final que se utilizará en el proyecto, sin necesidad de futuras reinstalaciones.</w:t>
-      </w:r>
-    </w:p>
-    <w:p>
-      <w:pPr>
-        <w:numPr>
-          <w:ilvl w:val="0"/>
-          <w:numId w:val="20"/>
-        </w:numPr>
-        <w:rPr>
-          <w:lang w:val="es-ES"/>
-        </w:rPr>
-      </w:pPr>
-      <w:r>
-        <w:rPr>
-          <w:lang w:val="es-ES"/>
-        </w:rPr>
-        <w:t xml:space="preserve">Se han realizado todas las </w:t>
-      </w:r>
-      <w:r>
-        <w:rPr>
-          <w:b/>
-          <w:bCs/>
-          <w:lang w:val="es-ES"/>
-        </w:rPr>
-        <w:t>configuraciones iniciales del sistema</w:t>
-      </w:r>
-      <w:r>
-        <w:rPr>
-          <w:lang w:val="es-ES"/>
-        </w:rPr>
-        <w:t>, incluyendo la configuración de red y otros parámetros básicos necesarios para su correcto funcionamiento.</w:t>
-      </w:r>
-    </w:p>
-    <w:p>
-      <w:pPr>
-        <w:numPr>
-          <w:ilvl w:val="0"/>
-          <w:numId w:val="20"/>
-        </w:numPr>
-        <w:rPr>
-          <w:lang w:val="es-ES"/>
-        </w:rPr>
-      </w:pPr>
-      <w:r>
-        <w:rPr>
-          <w:lang w:val="es-ES"/>
-        </w:rPr>
-        <w:t xml:space="preserve">Se ha creado el </w:t>
-      </w:r>
-      <w:r>
-        <w:rPr>
-          <w:b/>
-          <w:bCs/>
-          <w:lang w:val="es-ES"/>
-        </w:rPr>
-        <w:t>repositorio de GitHub</w:t>
-      </w:r>
-      <w:r>
-        <w:rPr>
-          <w:lang w:val="es-ES"/>
-        </w:rPr>
-        <w:t xml:space="preserve"> del proyecto, estableciendo un sistema de control de versiones para el código y la documentación.</w:t>
-      </w:r>
-    </w:p>
-    <w:p>
-      <w:pPr>
-        <w:numPr>
-          <w:ilvl w:val="0"/>
-          <w:numId w:val="20"/>
-        </w:numPr>
-        <w:rPr>
-          <w:lang w:val="es-ES"/>
-        </w:rPr>
-      </w:pPr>
-      <w:r>
-        <w:rPr>
-          <w:lang w:val="es-ES"/>
-        </w:rPr>
-        <w:t xml:space="preserve">Se ha continuado con la </w:t>
-      </w:r>
-      <w:r>
-        <w:rPr>
-          <w:b/>
-          <w:bCs/>
-          <w:lang w:val="es-ES"/>
-        </w:rPr>
-        <w:t>gestión y seguimiento de tareas mediante Trello</w:t>
-      </w:r>
-      <w:r>
-        <w:rPr>
-          <w:lang w:val="es-ES"/>
-        </w:rPr>
-        <w:t>, manteniendo el proyecto organizado.</w:t>
-      </w:r>
-    </w:p>
-    <w:p>
-      <w:pPr>
-        <w:numPr>
-          <w:ilvl w:val="0"/>
-          <w:numId w:val="20"/>
-        </w:numPr>
-        <w:rPr>
-          <w:lang w:val="es-ES"/>
-        </w:rPr>
-      </w:pPr>
-      <w:r>
-        <w:rPr>
-          <w:lang w:val="es-ES"/>
-        </w:rPr>
-        <w:t xml:space="preserve">Se ha logrado </w:t>
-      </w:r>
-      <w:r>
-        <w:rPr>
-          <w:b/>
-          <w:bCs/>
-          <w:lang w:val="es-ES"/>
-        </w:rPr>
-        <w:t>instalar Docker en el servidor</w:t>
-      </w:r>
-      <w:r>
-        <w:rPr>
-          <w:lang w:val="es-ES"/>
-        </w:rPr>
-        <w:t xml:space="preserve">, así como </w:t>
-      </w:r>
-      <w:proofErr w:type="spellStart"/>
-      <w:r>
-        <w:rPr>
-          <w:b/>
-          <w:bCs/>
-          <w:lang w:val="es-ES"/>
-        </w:rPr>
-        <w:t>OpenMediaVault</w:t>
-      </w:r>
-      <w:proofErr w:type="spellEnd"/>
-      <w:r>
-        <w:rPr>
-          <w:b/>
-          <w:bCs/>
-          <w:lang w:val="es-ES"/>
-        </w:rPr>
-        <w:t xml:space="preserve"> Extras</w:t>
-      </w:r>
-      <w:r>
-        <w:rPr>
-          <w:lang w:val="es-ES"/>
-        </w:rPr>
-        <w:t>, un complemento necesario para ampliar las funcionalidades del sistema y permitir el correcto funcionamiento de los servicios.</w:t>
-      </w:r>
-    </w:p>
-    <w:p>
-      <w:pPr>
-        <w:numPr>
-          <w:ilvl w:val="0"/>
-          <w:numId w:val="20"/>
-        </w:numPr>
-        <w:rPr>
-          <w:lang w:val="es-ES"/>
-        </w:rPr>
-      </w:pPr>
-      <w:r>
-        <w:rPr>
-          <w:lang w:val="es-ES"/>
-        </w:rPr>
-        <w:t xml:space="preserve">Aunque no se ha podido instalar </w:t>
-      </w:r>
-      <w:proofErr w:type="spellStart"/>
-      <w:r>
-        <w:rPr>
-          <w:lang w:val="es-ES"/>
-        </w:rPr>
-        <w:t>Portainer</w:t>
-      </w:r>
-      <w:proofErr w:type="spellEnd"/>
-      <w:r>
-        <w:rPr>
-          <w:lang w:val="es-ES"/>
-        </w:rPr>
-        <w:t xml:space="preserve">, se ha elaborado una </w:t>
-      </w:r>
-      <w:r>
-        <w:rPr>
-          <w:b/>
-          <w:bCs/>
-          <w:lang w:val="es-ES"/>
-        </w:rPr>
-        <w:t>documentación completa</w:t>
-      </w:r>
-      <w:r>
-        <w:rPr>
-          <w:lang w:val="es-ES"/>
-        </w:rPr>
-        <w:t xml:space="preserve"> sobre qué es </w:t>
-      </w:r>
-      <w:proofErr w:type="spellStart"/>
-      <w:r>
-        <w:rPr>
-          <w:lang w:val="es-ES"/>
-        </w:rPr>
-        <w:t>Portainer</w:t>
-      </w:r>
-      <w:proofErr w:type="spellEnd"/>
-      <w:r>
-        <w:rPr>
-          <w:lang w:val="es-ES"/>
-        </w:rPr>
-        <w:t xml:space="preserve">, su funcionamiento y una </w:t>
-      </w:r>
-      <w:r>
-        <w:rPr>
-          <w:b/>
-          <w:bCs/>
-          <w:lang w:val="es-ES"/>
-        </w:rPr>
-        <w:t>comparativa entre Docker y otras soluciones</w:t>
-      </w:r>
-      <w:r>
-        <w:rPr>
-          <w:lang w:val="es-ES"/>
-        </w:rPr>
-        <w:t>, lo que facilitará su futura implementación.</w:t>
-      </w:r>
-    </w:p>
-    <w:p>
-      <w:pPr>
-        <w:numPr>
-          <w:ilvl w:val="0"/>
-          <w:numId w:val="20"/>
-        </w:numPr>
-        <w:rPr>
-          <w:lang w:val="es-ES"/>
-        </w:rPr>
-      </w:pPr>
-      <w:r>
-        <w:rPr>
-          <w:lang w:val="es-ES"/>
-        </w:rPr>
-        <w:t xml:space="preserve">Este sprint ha tenido un fuerte enfoque en la </w:t>
-      </w:r>
-      <w:r>
-        <w:rPr>
-          <w:b/>
-          <w:bCs/>
-          <w:lang w:val="es-ES"/>
-        </w:rPr>
-        <w:t>investigación y elaboración de documentación</w:t>
-      </w:r>
-      <w:r>
-        <w:rPr>
-          <w:lang w:val="es-ES"/>
-        </w:rPr>
-        <w:t>, analizando paso a paso cómo realizar cada una de las tareas técnicas.</w:t>
-      </w:r>
-    </w:p>
-    <w:p>
-      <w:pPr>
-        <w:numPr>
-          <w:ilvl w:val="0"/>
-          <w:numId w:val="20"/>
-        </w:numPr>
-        <w:rPr>
-          <w:lang w:val="es-ES"/>
-        </w:rPr>
-      </w:pPr>
-      <w:r>
-        <w:rPr>
-          <w:lang w:val="es-ES"/>
-        </w:rPr>
-        <w:t xml:space="preserve">Se ha desarrollado la </w:t>
-      </w:r>
-      <w:r>
-        <w:rPr>
-          <w:b/>
-          <w:bCs/>
-          <w:lang w:val="es-ES"/>
-        </w:rPr>
-        <w:t>documentación sobre la planificación de la división de los discos duros</w:t>
-      </w:r>
-      <w:r>
-        <w:rPr>
-          <w:lang w:val="es-ES"/>
-        </w:rPr>
-        <w:t>, definiendo cómo se gestionará el almacenamiento y el sistema de copias de seguridad (</w:t>
-      </w:r>
-      <w:proofErr w:type="spellStart"/>
-      <w:r>
-        <w:rPr>
-          <w:lang w:val="es-ES"/>
-        </w:rPr>
-        <w:t>backups</w:t>
-      </w:r>
-      <w:proofErr w:type="spellEnd"/>
-      <w:r>
-        <w:rPr>
-          <w:lang w:val="es-ES"/>
-        </w:rPr>
-        <w:t>).</w:t>
-      </w:r>
-    </w:p>
-    <w:p>
-      <w:pPr>
-        <w:rPr>
-          <w:b/>
-          <w:bCs/>
-          <w:lang w:val="es-ES"/>
-        </w:rPr>
-      </w:pPr>
-      <w:r>
-        <w:rPr>
-          <w:b/>
-          <w:bCs/>
-          <w:lang w:val="es-ES"/>
-        </w:rPr>
-        <w:t>Qué no se ha podido hacer y por qué</w:t>
-      </w:r>
-    </w:p>
-    <w:p>
-      <w:pPr>
-        <w:rPr>
-          <w:lang w:val="es-ES"/>
-        </w:rPr>
-      </w:pPr>
-      <w:r>
-        <w:rPr>
-          <w:lang w:val="es-ES"/>
-        </w:rPr>
-        <w:t>Las tareas que no se han podido completar durante este sprint son:</w:t>
-      </w:r>
-    </w:p>
-    <w:p>
-      <w:pPr>
-        <w:numPr>
-          <w:ilvl w:val="0"/>
-          <w:numId w:val="21"/>
-        </w:numPr>
-        <w:rPr>
-          <w:lang w:val="es-ES"/>
-        </w:rPr>
-      </w:pPr>
-      <w:r>
-        <w:rPr>
-          <w:lang w:val="es-ES"/>
-        </w:rPr>
-        <w:t xml:space="preserve">La </w:t>
-      </w:r>
-      <w:r>
-        <w:rPr>
-          <w:b/>
-          <w:bCs/>
-          <w:lang w:val="es-ES"/>
-        </w:rPr>
-        <w:t xml:space="preserve">instalación de </w:t>
-      </w:r>
-      <w:proofErr w:type="spellStart"/>
-      <w:r>
-        <w:rPr>
-          <w:b/>
-          <w:bCs/>
-          <w:lang w:val="es-ES"/>
-        </w:rPr>
-        <w:t>Portainer</w:t>
-      </w:r>
-      <w:proofErr w:type="spellEnd"/>
-      <w:r>
-        <w:rPr>
-          <w:b/>
-          <w:bCs/>
-          <w:lang w:val="es-ES"/>
-        </w:rPr>
-        <w:t xml:space="preserve"> en el servidor</w:t>
-      </w:r>
-      <w:r>
-        <w:rPr>
-          <w:lang w:val="es-ES"/>
-        </w:rPr>
-        <w:t>.</w:t>
-      </w:r>
-    </w:p>
-    <w:p>
-      <w:pPr>
-        <w:numPr>
-          <w:ilvl w:val="0"/>
-          <w:numId w:val="21"/>
-        </w:numPr>
-        <w:rPr>
-          <w:lang w:val="es-ES"/>
-        </w:rPr>
-      </w:pPr>
-      <w:r>
-        <w:rPr>
-          <w:lang w:val="es-ES"/>
-        </w:rPr>
-        <w:t xml:space="preserve">La </w:t>
-      </w:r>
-      <w:r>
-        <w:rPr>
-          <w:b/>
-          <w:bCs/>
-          <w:lang w:val="es-ES"/>
-        </w:rPr>
-        <w:t>configuración definitiva de los discos duros</w:t>
-      </w:r>
-      <w:r>
-        <w:rPr>
-          <w:lang w:val="es-ES"/>
-        </w:rPr>
-        <w:t xml:space="preserve"> para almacenamiento y </w:t>
-      </w:r>
-      <w:proofErr w:type="spellStart"/>
-      <w:r>
-        <w:rPr>
-          <w:lang w:val="es-ES"/>
-        </w:rPr>
-        <w:t>backups</w:t>
-      </w:r>
-      <w:proofErr w:type="spellEnd"/>
-      <w:r>
-        <w:rPr>
-          <w:lang w:val="es-ES"/>
-        </w:rPr>
-        <w:t>.</w:t>
+        <w:t xml:space="preserve"> para almacenamiento y backups.</w:t>
       </w:r>
     </w:p>
     <w:p>
@@ -6255,63 +5562,7 @@
         <w:rPr>
           <w:color w:val="000000"/>
         </w:rPr>
-        <w:t xml:space="preserve">En este sprint se busca ya tener </w:t>
-      </w:r>
-      <w:proofErr w:type="spellStart"/>
-      <w:r>
-        <w:rPr>
-          <w:color w:val="000000"/>
-        </w:rPr>
-        <w:t>nextcloud</w:t>
-      </w:r>
-      <w:proofErr w:type="spellEnd"/>
-      <w:r>
-        <w:rPr>
-          <w:color w:val="000000"/>
-        </w:rPr>
-        <w:t xml:space="preserve"> desplegado en el server, para ello hay que tener OMV extras, </w:t>
-      </w:r>
-      <w:proofErr w:type="spellStart"/>
-      <w:r>
-        <w:rPr>
-          <w:color w:val="000000"/>
-        </w:rPr>
-        <w:t>portainer</w:t>
-      </w:r>
-      <w:proofErr w:type="spellEnd"/>
-      <w:r>
-        <w:rPr>
-          <w:color w:val="000000"/>
-        </w:rPr>
-        <w:t xml:space="preserve">, y </w:t>
-      </w:r>
-      <w:proofErr w:type="spellStart"/>
-      <w:r>
-        <w:rPr>
-          <w:color w:val="000000"/>
-        </w:rPr>
-        <w:t>doker</w:t>
-      </w:r>
-      <w:proofErr w:type="spellEnd"/>
-      <w:r>
-        <w:rPr>
-          <w:color w:val="000000"/>
-        </w:rPr>
-        <w:t xml:space="preserve"> </w:t>
-      </w:r>
-      <w:proofErr w:type="spellStart"/>
-      <w:r>
-        <w:rPr>
-          <w:color w:val="000000"/>
-        </w:rPr>
-        <w:t>intalados</w:t>
-      </w:r>
-      <w:proofErr w:type="spellEnd"/>
-      <w:r>
-        <w:rPr>
-          <w:color w:val="000000"/>
-        </w:rPr>
-        <w:t xml:space="preserve"> en el server OMV.</w:t>
+        <w:t>En este sprint se busca ya tener nextcloud desplegado en el server, para ello hay que tener OMV extras, portainer, y doker intalados en el server OMV.</w:t>
       </w:r>
     </w:p>
     <w:p>
@@ -6364,6 +5615,7 @@
           <w:b/>
           <w:bCs/>
         </w:rPr>
+        <w:lastRenderedPageBreak/>
         <w:t xml:space="preserve">Tareas planificadas </w:t>
       </w:r>
     </w:p>
@@ -6372,21 +5624,14 @@
         <w:ind w:left="720"/>
       </w:pPr>
       <w:r>
-        <w:t xml:space="preserve">Instalar OMV extras, </w:t>
-      </w:r>
-      <w:proofErr w:type="spellStart"/>
-      <w:r>
-        <w:t>portainer</w:t>
-      </w:r>
-      <w:proofErr w:type="spellEnd"/>
-      <w:r>
-        <w:t xml:space="preserve"> y </w:t>
-      </w:r>
-      <w:proofErr w:type="spellStart"/>
-      <w:r>
-        <w:t>doker</w:t>
-      </w:r>
-      <w:proofErr w:type="spellEnd"/>
+        <w:t>Instalar OMV extras, portainer y do</w:t>
+      </w:r>
+      <w:r>
+        <w:t>c</w:t>
+      </w:r>
+      <w:r>
+        <w:t>ker</w:t>
+      </w:r>
     </w:p>
     <w:p>
       <w:pPr>
@@ -6436,61 +5681,65 @@
         <w:rPr>
           <w:lang w:val="es-ES"/>
         </w:rPr>
-        <w:t xml:space="preserve">Despliegue de </w:t>
-      </w:r>
-      <w:proofErr w:type="spellStart"/>
-      <w:r>
+        <w:t>Despliegue de Nextcloud desde Portainer</w:t>
+      </w:r>
+    </w:p>
+    <w:p>
+      <w:pPr>
+        <w:numPr>
+          <w:ilvl w:val="0"/>
+          <w:numId w:val="27"/>
+        </w:numPr>
         <w:rPr>
           <w:lang w:val="es-ES"/>
         </w:rPr>
-        <w:t>Nextcloud</w:t>
-      </w:r>
-      <w:proofErr w:type="spellEnd"/>
+      </w:pPr>
       <w:r>
         <w:rPr>
           <w:lang w:val="es-ES"/>
         </w:rPr>
-        <w:t xml:space="preserve"> desde </w:t>
-      </w:r>
-      <w:proofErr w:type="spellStart"/>
-      <w:r>
+        <w:t>Acceso web a Nextcloud</w:t>
+      </w:r>
+    </w:p>
+    <w:p>
+      <w:pPr>
+        <w:numPr>
+          <w:ilvl w:val="0"/>
+          <w:numId w:val="28"/>
+        </w:numPr>
         <w:rPr>
           <w:lang w:val="es-ES"/>
         </w:rPr>
-        <w:t>Portainer</w:t>
-      </w:r>
-      <w:proofErr w:type="spellEnd"/>
-    </w:p>
-    <w:p>
-      <w:pPr>
-        <w:numPr>
-          <w:ilvl w:val="0"/>
-          <w:numId w:val="27"/>
-        </w:numPr>
+      </w:pPr>
+      <w:r>
         <w:rPr>
           <w:lang w:val="es-ES"/>
         </w:rPr>
-      </w:pPr>
-      <w:r>
+        <w:t>Ajustes de configuración</w:t>
+      </w:r>
+    </w:p>
+    <w:p>
+      <w:pPr>
+        <w:numPr>
+          <w:ilvl w:val="0"/>
+          <w:numId w:val="28"/>
+        </w:numPr>
         <w:rPr>
           <w:lang w:val="es-ES"/>
         </w:rPr>
-        <w:t xml:space="preserve">Acceso web a </w:t>
-      </w:r>
-      <w:proofErr w:type="spellStart"/>
+      </w:pPr>
       <w:r>
         <w:rPr>
           <w:lang w:val="es-ES"/>
         </w:rPr>
-        <w:t>Nextcloud</w:t>
-      </w:r>
-      <w:proofErr w:type="spellEnd"/>
-    </w:p>
-    <w:p>
-      <w:pPr>
-        <w:numPr>
-          <w:ilvl w:val="0"/>
-          <w:numId w:val="27"/>
+        <w:t xml:space="preserve"> Instalar ZeroTier</w:t>
+      </w:r>
+    </w:p>
+    <w:p>
+      <w:pPr>
+        <w:numPr>
+          <w:ilvl w:val="0"/>
+          <w:numId w:val="28"/>
         </w:numPr>
         <w:rPr>
           <w:lang w:val="es-ES"/>
@@ -6500,24 +5749,7 @@
         <w:rPr>
           <w:lang w:val="es-ES"/>
         </w:rPr>
-        <w:t>Pruebas de subida y descarga</w:t>
-      </w:r>
-    </w:p>
-    <w:p>
-      <w:pPr>
-        <w:numPr>
-          <w:ilvl w:val="0"/>
-          <w:numId w:val="28"/>
-        </w:numPr>
-        <w:rPr>
-          <w:lang w:val="es-ES"/>
-        </w:rPr>
-      </w:pPr>
-      <w:r>
-        <w:rPr>
-          <w:lang w:val="es-ES"/>
-        </w:rPr>
-        <w:t>Ajustes de configuración</w:t>
+        <w:t>Configurar ZeroTier para interferencia Servidor - Cliente</w:t>
       </w:r>
     </w:p>
     <w:p>
@@ -6616,35 +5848,7 @@
           <w:color w:val="000000"/>
         </w:rPr>
         <w:br/>
-        <w:t xml:space="preserve">este sprint tubo muchísimos retrasos sobre todo por problemas con la red y conexiones que no nos dejaban avanzar, ya que al servidor solo se puede configurar accediendo a </w:t>
-      </w:r>
-      <w:proofErr w:type="spellStart"/>
-      <w:r>
-        <w:rPr>
-          <w:color w:val="000000"/>
-        </w:rPr>
-        <w:t>el</w:t>
-      </w:r>
-      <w:proofErr w:type="spellEnd"/>
-      <w:r>
-        <w:rPr>
-          <w:color w:val="000000"/>
-        </w:rPr>
-        <w:t xml:space="preserve"> a través de la web lo que hace que tenga que estar conectado y no podamos </w:t>
-      </w:r>
-      <w:proofErr w:type="spellStart"/>
-      <w:r>
-        <w:rPr>
-          <w:color w:val="000000"/>
-        </w:rPr>
-        <w:t>abanzar</w:t>
-      </w:r>
-      <w:proofErr w:type="spellEnd"/>
-      <w:r>
-        <w:rPr>
-          <w:color w:val="000000"/>
-        </w:rPr>
-        <w:t>.</w:t>
+        <w:t>este sprint tubo muchísimos retrasos sobre todo por problemas con la red y conexiones que no nos dejaban avanzar, ya que al servidor solo se puede configurar accediendo a el a través de la web lo que hace que tenga que estar conectado y no podamos abanzar.</w:t>
       </w:r>
       <w:r>
         <w:rPr>
@@ -6657,77 +5861,7 @@
           <w:color w:val="000000"/>
         </w:rPr>
         <w:br/>
-        <w:t xml:space="preserve">aun así pudimos avanzar los últimos 2 días muy </w:t>
-      </w:r>
-      <w:proofErr w:type="spellStart"/>
-      <w:r>
-        <w:rPr>
-          <w:color w:val="000000"/>
-        </w:rPr>
-        <w:t>rapido</w:t>
-      </w:r>
-      <w:proofErr w:type="spellEnd"/>
-      <w:r>
-        <w:rPr>
-          <w:color w:val="000000"/>
-        </w:rPr>
-        <w:t xml:space="preserve"> ya que </w:t>
-      </w:r>
-      <w:proofErr w:type="spellStart"/>
-      <w:r>
-        <w:rPr>
-          <w:color w:val="000000"/>
-        </w:rPr>
-        <w:t>teniamos</w:t>
-      </w:r>
-      <w:proofErr w:type="spellEnd"/>
-      <w:r>
-        <w:rPr>
-          <w:color w:val="000000"/>
-        </w:rPr>
-        <w:t xml:space="preserve"> toda la </w:t>
-      </w:r>
-      <w:proofErr w:type="spellStart"/>
-      <w:r>
-        <w:rPr>
-          <w:color w:val="000000"/>
-        </w:rPr>
-        <w:t>documentacion</w:t>
-      </w:r>
-      <w:proofErr w:type="spellEnd"/>
-      <w:r>
-        <w:rPr>
-          <w:color w:val="000000"/>
-        </w:rPr>
-        <w:t xml:space="preserve"> y </w:t>
-      </w:r>
-      <w:proofErr w:type="spellStart"/>
-      <w:r>
-        <w:rPr>
-          <w:color w:val="000000"/>
-        </w:rPr>
-        <w:t>guias</w:t>
-      </w:r>
-      <w:proofErr w:type="spellEnd"/>
-      <w:r>
-        <w:rPr>
-          <w:color w:val="000000"/>
-        </w:rPr>
-        <w:t xml:space="preserve"> ya hechas lo que nos </w:t>
-      </w:r>
-      <w:proofErr w:type="spellStart"/>
-      <w:r>
-        <w:rPr>
-          <w:color w:val="000000"/>
-        </w:rPr>
-        <w:t>permitio</w:t>
-      </w:r>
-      <w:proofErr w:type="spellEnd"/>
-      <w:r>
-        <w:rPr>
-          <w:color w:val="000000"/>
-        </w:rPr>
-        <w:t xml:space="preserve"> seguirlas y montar todo bastante rápido.</w:t>
+        <w:t>aun así pudimos avanzar los últimos 2 días muy rapido ya que teniamos toda la documentacion y guias ya hechas lo que nos permitio seguirlas y montar todo bastante rápido.</w:t>
       </w:r>
     </w:p>
     <w:p>
@@ -6775,79 +5909,7 @@
         </w:pBdr>
       </w:pPr>
       <w:r>
-        <w:t xml:space="preserve">Logramos </w:t>
-      </w:r>
-      <w:proofErr w:type="spellStart"/>
-      <w:r>
-        <w:t>intalar</w:t>
-      </w:r>
-      <w:proofErr w:type="spellEnd"/>
-      <w:r>
-        <w:t xml:space="preserve"> muchas cosas como </w:t>
-      </w:r>
-      <w:proofErr w:type="spellStart"/>
-      <w:r>
-        <w:t>doker</w:t>
-      </w:r>
-      <w:proofErr w:type="spellEnd"/>
-      <w:r>
-        <w:t xml:space="preserve">, OVM extra, </w:t>
-      </w:r>
-      <w:proofErr w:type="spellStart"/>
-      <w:r>
-        <w:t>Portainer</w:t>
-      </w:r>
-      <w:proofErr w:type="spellEnd"/>
-      <w:r>
-        <w:t xml:space="preserve"> y casi todas las configuraciones detrás. Ademas </w:t>
-      </w:r>
-      <w:proofErr w:type="spellStart"/>
-      <w:r>
-        <w:t>intalamos</w:t>
-      </w:r>
-      <w:proofErr w:type="spellEnd"/>
-      <w:r>
-        <w:t xml:space="preserve"> una VPN que es un extra que </w:t>
-      </w:r>
-      <w:proofErr w:type="spellStart"/>
-      <w:r>
-        <w:t>nesesitavamos</w:t>
-      </w:r>
-      <w:proofErr w:type="spellEnd"/>
-      <w:r>
-        <w:t xml:space="preserve"> y no estaba planeado, aun </w:t>
-      </w:r>
-      <w:proofErr w:type="spellStart"/>
-      <w:r>
-        <w:t>asi</w:t>
-      </w:r>
-      <w:proofErr w:type="spellEnd"/>
-      <w:r>
-        <w:t xml:space="preserve"> se </w:t>
-      </w:r>
-      <w:proofErr w:type="spellStart"/>
-      <w:r>
-        <w:t>intalo</w:t>
-      </w:r>
-      <w:proofErr w:type="spellEnd"/>
-      <w:r>
-        <w:t xml:space="preserve"> y hacer pruebas muy </w:t>
-      </w:r>
-      <w:proofErr w:type="spellStart"/>
-      <w:r>
-        <w:t>rapido</w:t>
-      </w:r>
-      <w:proofErr w:type="spellEnd"/>
-      <w:r>
-        <w:t xml:space="preserve"> y pudimos utilizarla sin </w:t>
-      </w:r>
-      <w:proofErr w:type="spellStart"/>
-      <w:r>
-        <w:t>problkemas</w:t>
-      </w:r>
-      <w:proofErr w:type="spellEnd"/>
-      <w:r>
-        <w:t>.</w:t>
+        <w:t>Logramos intalar muchas cosas como doker, OVM extra, Portainer y casi todas las configuraciones detrás. Ademas intalamos una VPN que es un extra que nesesitavamos y no estaba planeado, aun asi se intalo y hacer pruebas muy rapido y pudimos utilizarla sin problkemas.</w:t>
       </w:r>
     </w:p>
     <w:p>
@@ -6865,21 +5927,12 @@
       <w:pPr>
         <w:ind w:left="720"/>
       </w:pPr>
-      <w:proofErr w:type="spellStart"/>
-      <w:r>
-        <w:rPr>
-          <w:b/>
-          <w:bCs/>
-        </w:rPr>
-        <w:t>Revisió</w:t>
-      </w:r>
-      <w:proofErr w:type="spellEnd"/>
-      <w:r>
-        <w:rPr>
-          <w:b/>
-          <w:bCs/>
-        </w:rPr>
-        <w:t xml:space="preserve"> i retrospectiva</w:t>
+      <w:r>
+        <w:rPr>
+          <w:b/>
+          <w:bCs/>
+        </w:rPr>
+        <w:t>Revisió i retrospectiva</w:t>
       </w:r>
     </w:p>
     <w:p>
@@ -6901,6 +5954,7 @@
         <w:rPr>
           <w:color w:val="000000"/>
         </w:rPr>
+        <w:lastRenderedPageBreak/>
         <w:t>Qué se ha conseguido.</w:t>
       </w:r>
     </w:p>
@@ -6919,285 +5973,11 @@
           <w:color w:val="000000"/>
         </w:rPr>
       </w:pPr>
-      <w:proofErr w:type="spellStart"/>
-      <w:r>
-        <w:rPr>
-          <w:color w:val="000000"/>
-        </w:rPr>
-        <w:t>Intalar</w:t>
-      </w:r>
-      <w:proofErr w:type="spellEnd"/>
-      <w:r>
-        <w:rPr>
-          <w:color w:val="000000"/>
-        </w:rPr>
-        <w:t xml:space="preserve"> </w:t>
-      </w:r>
-      <w:proofErr w:type="spellStart"/>
-      <w:r>
-        <w:rPr>
-          <w:color w:val="000000"/>
-        </w:rPr>
-        <w:t>ovm</w:t>
-      </w:r>
-      <w:proofErr w:type="spellEnd"/>
-      <w:r>
-        <w:rPr>
-          <w:color w:val="000000"/>
-        </w:rPr>
-        <w:t xml:space="preserve"> extras, configurarlo, crear todas las configuraciones </w:t>
-      </w:r>
-      <w:proofErr w:type="spellStart"/>
-      <w:r>
-        <w:rPr>
-          <w:color w:val="000000"/>
-        </w:rPr>
-        <w:t>nesesarias</w:t>
-      </w:r>
-      <w:proofErr w:type="spellEnd"/>
-      <w:r>
-        <w:rPr>
-          <w:color w:val="000000"/>
-        </w:rPr>
-        <w:t xml:space="preserve"> para </w:t>
-      </w:r>
-      <w:proofErr w:type="spellStart"/>
-      <w:r>
-        <w:rPr>
-          <w:color w:val="000000"/>
-        </w:rPr>
-        <w:t>intalar</w:t>
-      </w:r>
-      <w:proofErr w:type="spellEnd"/>
-      <w:r>
-        <w:rPr>
-          <w:color w:val="000000"/>
-        </w:rPr>
-        <w:t xml:space="preserve"> </w:t>
-      </w:r>
-      <w:proofErr w:type="spellStart"/>
-      <w:r>
-        <w:rPr>
-          <w:color w:val="000000"/>
-        </w:rPr>
-        <w:t>docker</w:t>
-      </w:r>
-      <w:proofErr w:type="spellEnd"/>
-      <w:r>
-        <w:rPr>
-          <w:color w:val="000000"/>
-        </w:rPr>
-        <w:t xml:space="preserve"> </w:t>
-      </w:r>
-      <w:proofErr w:type="spellStart"/>
-      <w:r>
-        <w:rPr>
-          <w:color w:val="000000"/>
-        </w:rPr>
-        <w:t>compose</w:t>
-      </w:r>
-      <w:proofErr w:type="spellEnd"/>
-      <w:r>
-        <w:rPr>
-          <w:color w:val="000000"/>
-        </w:rPr>
-        <w:t xml:space="preserve">, </w:t>
-      </w:r>
-      <w:proofErr w:type="spellStart"/>
-      <w:r>
-        <w:rPr>
-          <w:color w:val="000000"/>
-        </w:rPr>
-        <w:t>intalamos</w:t>
-      </w:r>
-      <w:proofErr w:type="spellEnd"/>
-      <w:r>
-        <w:rPr>
-          <w:color w:val="000000"/>
-        </w:rPr>
-        <w:t xml:space="preserve"> </w:t>
-      </w:r>
-      <w:proofErr w:type="spellStart"/>
-      <w:r>
-        <w:rPr>
-          <w:color w:val="000000"/>
-        </w:rPr>
-        <w:t>dockercopose</w:t>
-      </w:r>
-      <w:proofErr w:type="spellEnd"/>
-      <w:r>
-        <w:rPr>
-          <w:color w:val="000000"/>
-        </w:rPr>
-        <w:t xml:space="preserve">, dentro </w:t>
-      </w:r>
-      <w:proofErr w:type="spellStart"/>
-      <w:r>
-        <w:rPr>
-          <w:color w:val="000000"/>
-        </w:rPr>
-        <w:t>intalamos</w:t>
-      </w:r>
-      <w:proofErr w:type="spellEnd"/>
-      <w:r>
-        <w:rPr>
-          <w:color w:val="000000"/>
-        </w:rPr>
-        <w:t xml:space="preserve"> </w:t>
-      </w:r>
-      <w:proofErr w:type="spellStart"/>
-      <w:r>
-        <w:rPr>
-          <w:color w:val="000000"/>
-        </w:rPr>
-        <w:t>portainer</w:t>
-      </w:r>
-      <w:proofErr w:type="spellEnd"/>
-      <w:r>
-        <w:rPr>
-          <w:color w:val="000000"/>
-        </w:rPr>
-        <w:t xml:space="preserve"> y creamos el puerto para acceder a </w:t>
-      </w:r>
-      <w:proofErr w:type="spellStart"/>
-      <w:r>
-        <w:rPr>
-          <w:color w:val="000000"/>
-        </w:rPr>
-        <w:t>el</w:t>
-      </w:r>
-      <w:proofErr w:type="spellEnd"/>
-      <w:r>
-        <w:rPr>
-          <w:color w:val="000000"/>
-        </w:rPr>
-        <w:t xml:space="preserve">. Investigamos sobre como </w:t>
-      </w:r>
-      <w:proofErr w:type="spellStart"/>
-      <w:r>
-        <w:rPr>
-          <w:color w:val="000000"/>
-        </w:rPr>
-        <w:t>intalar</w:t>
-      </w:r>
-      <w:proofErr w:type="spellEnd"/>
-      <w:r>
-        <w:rPr>
-          <w:color w:val="000000"/>
-        </w:rPr>
-        <w:t xml:space="preserve"> una </w:t>
-      </w:r>
-      <w:proofErr w:type="spellStart"/>
-      <w:r>
-        <w:rPr>
-          <w:color w:val="000000"/>
-        </w:rPr>
-        <w:t>vpn</w:t>
-      </w:r>
-      <w:proofErr w:type="spellEnd"/>
-      <w:r>
-        <w:rPr>
-          <w:color w:val="000000"/>
-        </w:rPr>
-        <w:t xml:space="preserve">, </w:t>
-      </w:r>
-      <w:proofErr w:type="spellStart"/>
-      <w:r>
-        <w:rPr>
-          <w:color w:val="000000"/>
-        </w:rPr>
-        <w:t>intalamos</w:t>
-      </w:r>
-      <w:proofErr w:type="spellEnd"/>
-      <w:r>
-        <w:rPr>
-          <w:color w:val="000000"/>
-        </w:rPr>
-        <w:t xml:space="preserve"> la </w:t>
-      </w:r>
-      <w:proofErr w:type="spellStart"/>
-      <w:r>
-        <w:rPr>
-          <w:color w:val="000000"/>
-        </w:rPr>
-        <w:t>vpn</w:t>
-      </w:r>
-      <w:proofErr w:type="spellEnd"/>
-      <w:r>
-        <w:rPr>
-          <w:color w:val="000000"/>
-        </w:rPr>
-        <w:t xml:space="preserve">, hicimos todas las pruebas </w:t>
-      </w:r>
-      <w:proofErr w:type="spellStart"/>
-      <w:r>
-        <w:rPr>
-          <w:color w:val="000000"/>
-        </w:rPr>
-        <w:t>nesesarias</w:t>
-      </w:r>
-      <w:proofErr w:type="spellEnd"/>
-      <w:r>
-        <w:rPr>
-          <w:color w:val="000000"/>
-        </w:rPr>
-        <w:t xml:space="preserve"> para la </w:t>
-      </w:r>
-      <w:proofErr w:type="spellStart"/>
-      <w:r>
-        <w:rPr>
-          <w:color w:val="000000"/>
-        </w:rPr>
-        <w:t>vpn</w:t>
-      </w:r>
-      <w:proofErr w:type="spellEnd"/>
-      <w:r>
-        <w:rPr>
-          <w:color w:val="000000"/>
-        </w:rPr>
-        <w:t xml:space="preserve">. </w:t>
-      </w:r>
-      <w:proofErr w:type="spellStart"/>
-      <w:r>
-        <w:rPr>
-          <w:color w:val="000000"/>
-        </w:rPr>
-        <w:t>Intalamos</w:t>
-      </w:r>
-      <w:proofErr w:type="spellEnd"/>
-      <w:r>
-        <w:rPr>
-          <w:color w:val="000000"/>
-        </w:rPr>
-        <w:t xml:space="preserve"> varios </w:t>
-      </w:r>
-      <w:proofErr w:type="spellStart"/>
-      <w:r>
-        <w:rPr>
-          <w:color w:val="000000"/>
-        </w:rPr>
-        <w:t>plugins</w:t>
-      </w:r>
-      <w:proofErr w:type="spellEnd"/>
-      <w:r>
-        <w:rPr>
-          <w:color w:val="000000"/>
-        </w:rPr>
-        <w:t xml:space="preserve"> en el server, configuramos varas cosas de red para que </w:t>
-      </w:r>
-      <w:proofErr w:type="gramStart"/>
-      <w:r>
-        <w:rPr>
-          <w:color w:val="000000"/>
-        </w:rPr>
-        <w:t>funciona</w:t>
-      </w:r>
-      <w:proofErr w:type="gramEnd"/>
-      <w:r>
-        <w:rPr>
-          <w:color w:val="000000"/>
-        </w:rPr>
-        <w:t xml:space="preserve"> con los cambios constantes</w:t>
+      <w:r>
+        <w:rPr>
+          <w:color w:val="000000"/>
+        </w:rPr>
+        <w:t>Intalar ovm extras, configurarlo, crear todas las configuraciones nesesarias para intalar docker compose, intalamos dockercopose, dentro intalamos portainer y creamos el puerto para acceder a el. Investigamos sobre como intalar una vpn, intalamos la vpn, hicimos todas las pruebas nesesarias para la vpn. Intalamos varios plugins en el server, configuramos varas cosas de red para que funciona con los cambios constantes</w:t>
       </w:r>
     </w:p>
     <w:p>
@@ -7254,21 +6034,7 @@
         <w:rPr>
           <w:color w:val="000000"/>
         </w:rPr>
-        <w:t xml:space="preserve">Desplegar </w:t>
-      </w:r>
-      <w:proofErr w:type="spellStart"/>
-      <w:r>
-        <w:rPr>
-          <w:color w:val="000000"/>
-        </w:rPr>
-        <w:t>Nextcloud</w:t>
-      </w:r>
-      <w:proofErr w:type="spellEnd"/>
-      <w:r>
-        <w:rPr>
-          <w:color w:val="000000"/>
-        </w:rPr>
-        <w:t xml:space="preserve"> en el server, no pudimos por falta de tiempo por los problemas constantes con la red</w:t>
+        <w:t>Desplegar Nextcloud en el server, no pudimos por falta de tiempo por los problemas constantes con la red</w:t>
       </w:r>
     </w:p>
     <w:p>
@@ -7478,13 +6244,8 @@
         <w:ind w:left="720"/>
       </w:pPr>
       <w:r>
-        <w:t xml:space="preserve">Lista de tareas a </w:t>
-      </w:r>
-      <w:proofErr w:type="gramStart"/>
-      <w:r>
-        <w:t>realizar :</w:t>
-      </w:r>
-      <w:proofErr w:type="gramEnd"/>
+        <w:t>Lista de tareas a realizar :</w:t>
+      </w:r>
     </w:p>
     <w:p>
       <w:pPr>
@@ -7654,6 +6415,7 @@
         <w:rPr>
           <w:color w:val="000000"/>
         </w:rPr>
+        <w:lastRenderedPageBreak/>
         <w:t>Estado inicial (pendiente, en curso, hecho).</w:t>
       </w:r>
     </w:p>
@@ -7809,21 +6571,12 @@
       <w:pPr>
         <w:ind w:left="720"/>
       </w:pPr>
-      <w:proofErr w:type="spellStart"/>
-      <w:r>
-        <w:rPr>
-          <w:b/>
-          <w:bCs/>
-        </w:rPr>
-        <w:t>Revisió</w:t>
-      </w:r>
-      <w:proofErr w:type="spellEnd"/>
-      <w:r>
-        <w:rPr>
-          <w:b/>
-          <w:bCs/>
-        </w:rPr>
-        <w:t xml:space="preserve"> i retrospectiva</w:t>
+      <w:r>
+        <w:rPr>
+          <w:b/>
+          <w:bCs/>
+        </w:rPr>
+        <w:t>Revisió i retrospectiva</w:t>
       </w:r>
     </w:p>
     <w:p>
@@ -12492,7 +11245,7 @@
       <w:tblStyleColBandSize w:val="1"/>
     </w:tblPr>
   </w:style>
-  <w:style w:type="character" w:styleId="Fuerte">
+  <w:style w:type="character" w:styleId="Textoennegrita">
     <w:name w:val="Strong"/>
     <w:basedOn w:val="Fuentedeprrafopredeter"/>
     <w:uiPriority w:val="22"/>

</xml_diff>